<commit_message>
fix:adicionando o main.c e versionando
</commit_message>
<xml_diff>
--- a/Docs/Documentacao-Isabella-Batista.docx
+++ b/Docs/Documentacao-Isabella-Batista.docx
@@ -56,7 +56,26 @@
           <w:szCs w:val="28"/>
         </w:rPr>
         <w:br/>
-        <w:t>José Mateus Ramiris</w:t>
+      </w:r>
+      <w:r>
+        <w:rPr>
+          <w:rFonts w:cs="Arial"/>
+          <w:b/>
+          <w:bCs/>
+          <w:sz w:val="28"/>
+          <w:szCs w:val="28"/>
+        </w:rPr>
+        <w:t>Isabella Sousa Batista</w:t>
+      </w:r>
+      <w:r>
+        <w:rPr>
+          <w:rFonts w:cs="Arial"/>
+          <w:b/>
+          <w:bCs/>
+          <w:sz w:val="28"/>
+          <w:szCs w:val="28"/>
+        </w:rPr>
+        <w:t xml:space="preserve"> </w:t>
       </w:r>
     </w:p>
     <w:p>
@@ -239,22 +258,17 @@
           <w:sz w:val="28"/>
           <w:szCs w:val="28"/>
         </w:rPr>
-        <w:t>Nome do seu projeto</w:t>
+        <w:t>S</w:t>
       </w:r>
       <w:r>
         <w:rPr>
           <w:rFonts w:cs="Arial"/>
-          <w:b/>
-          <w:bCs/>
           <w:sz w:val="28"/>
           <w:szCs w:val="28"/>
         </w:rPr>
-        <w:br/>
-      </w:r>
-    </w:p>
-    <w:p>
-      <w:pPr>
-        <w:jc w:val="center"/>
+        <w:t>martFlow</w:t>
+      </w:r>
+      <w:r>
         <w:rPr>
           <w:rFonts w:cs="Arial"/>
           <w:b/>
@@ -262,11 +276,9 @@
           <w:sz w:val="28"/>
           <w:szCs w:val="28"/>
         </w:rPr>
-      </w:pPr>
-    </w:p>
-    <w:p>
-      <w:pPr>
-        <w:jc w:val="center"/>
+        <w:t xml:space="preserve"> </w:t>
+      </w:r>
+      <w:r>
         <w:rPr>
           <w:rFonts w:cs="Arial"/>
           <w:b/>
@@ -274,7 +286,8 @@
           <w:sz w:val="28"/>
           <w:szCs w:val="28"/>
         </w:rPr>
-      </w:pPr>
+        <w:br/>
+      </w:r>
     </w:p>
     <w:p>
       <w:pPr>
@@ -374,14 +387,7 @@
     </w:p>
     <w:p>
       <w:pPr>
-        <w:ind w:firstLine="0"/>
         <w:jc w:val="center"/>
-        <w:rPr>
-          <w:b/>
-          <w:bCs/>
-        </w:rPr>
-      </w:pPr>
-      <w:r>
         <w:rPr>
           <w:rFonts w:cs="Arial"/>
           <w:b/>
@@ -389,9 +395,11 @@
           <w:sz w:val="28"/>
           <w:szCs w:val="28"/>
         </w:rPr>
-        <w:t>Sertãozinho</w:t>
-      </w:r>
-      <w:r>
+      </w:pPr>
+    </w:p>
+    <w:p>
+      <w:pPr>
+        <w:jc w:val="center"/>
         <w:rPr>
           <w:rFonts w:cs="Arial"/>
           <w:b/>
@@ -399,6 +407,35 @@
           <w:sz w:val="28"/>
           <w:szCs w:val="28"/>
         </w:rPr>
+      </w:pPr>
+    </w:p>
+    <w:p>
+      <w:pPr>
+        <w:ind w:firstLine="0"/>
+        <w:jc w:val="center"/>
+        <w:rPr>
+          <w:b/>
+          <w:bCs/>
+        </w:rPr>
+      </w:pPr>
+      <w:r>
+        <w:rPr>
+          <w:rFonts w:cs="Arial"/>
+          <w:b/>
+          <w:bCs/>
+          <w:sz w:val="28"/>
+          <w:szCs w:val="28"/>
+        </w:rPr>
+        <w:t>Sertãozinho</w:t>
+      </w:r>
+      <w:r>
+        <w:rPr>
+          <w:rFonts w:cs="Arial"/>
+          <w:b/>
+          <w:bCs/>
+          <w:sz w:val="28"/>
+          <w:szCs w:val="28"/>
+        </w:rPr>
         <w:br/>
       </w:r>
       <w:r>
@@ -1392,22 +1429,48 @@
         <w:jc w:val="both"/>
       </w:pPr>
       <w:r>
-        <w:t>Descreva o problema....</w:t>
+        <w:t>Atualmente o desenvolvimento das grandes cidades brasileiras, especialmente São Paulo, Recife, e Rio de Janeiro resultou</w:t>
       </w:r>
       <w:r>
         <w:t xml:space="preserve"> </w:t>
       </w:r>
       <w:r>
-        <w:t>(lembre-se que o exemplo do notion pode estar superficial, a ideia é ajudar vocês a desenvolver a documentação, para finalizar, todo o texto é de forma discursiva e com suas palavras).</w:t>
-      </w:r>
-    </w:p>
-    <w:p>
-      <w:pPr>
-        <w:jc w:val="both"/>
-      </w:pPr>
-    </w:p>
-    <w:p>
-      <w:pPr>
+        <w:t xml:space="preserve">em </w:t>
+      </w:r>
+      <w:r>
+        <w:t>vários problemas de tráfego</w:t>
+      </w:r>
+      <w:r>
+        <w:t xml:space="preserve"> no trânsito</w:t>
+      </w:r>
+      <w:r>
+        <w:t>. Tais como, congestionamentos causados por semáforos que não se adaptam à demanda real, falta de organização sobre o fluxo de automóveis, falhas mecânicas e lâmpadas queimadas que aumentam os riscos de acidentes e comprometem a sinalização. Nesse contexto, a ausência</w:t>
+      </w:r>
+      <w:r>
+        <w:t xml:space="preserve"> </w:t>
+      </w:r>
+      <w:r>
+        <w:t>da</w:t>
+      </w:r>
+      <w:r>
+        <w:t xml:space="preserve"> implementação de tecnologias</w:t>
+      </w:r>
+      <w:r>
+        <w:t xml:space="preserve"> que se adaptem à realidade</w:t>
+      </w:r>
+      <w:r>
+        <w:t>, resulta em atrasos, engarrafamentos, aumento nos riscos de acidente e estresse nos condutores</w:t>
+      </w:r>
+      <w:r>
+        <w:t xml:space="preserve">. </w:t>
+      </w:r>
+      <w:r>
+        <w:t>Dessa forma, é necessário o desenvolvimento de soluções de reais que gerem resultados positivos no tráfego urbano.</w:t>
+      </w:r>
+    </w:p>
+    <w:p>
+      <w:pPr>
+        <w:ind w:firstLine="0"/>
         <w:jc w:val="both"/>
       </w:pPr>
     </w:p>
@@ -1437,22 +1500,27 @@
         <w:jc w:val="both"/>
       </w:pPr>
       <w:r>
-        <w:t>Descreve o objetivo do projeto, lembre de utilizar o nome criado por você...</w:t>
-      </w:r>
-      <w:r>
-        <w:t xml:space="preserve"> </w:t>
-      </w:r>
-      <w:r>
-        <w:t>(lembre-se que o exemplo do notion pode estar superficial, a ideia é ajudar vocês a desenvolver a documentação, para finalizar, todo o texto é de forma discursiva e com suas palavras).</w:t>
-      </w:r>
-    </w:p>
-    <w:p>
-      <w:pPr>
-        <w:jc w:val="both"/>
-      </w:pPr>
-    </w:p>
-    <w:p>
-      <w:pPr>
+        <w:t>Pensando nisso, foi denominado o projeto Smart Flow</w:t>
+      </w:r>
+      <w:r>
+        <w:t>, um t</w:t>
+      </w:r>
+      <w:r>
+        <w:t xml:space="preserve">ráfego inteligente que tem como objetivo desenvolver um protótipo de </w:t>
+      </w:r>
+      <w:r>
+        <w:t xml:space="preserve">um </w:t>
+      </w:r>
+      <w:r>
+        <w:t xml:space="preserve">semáforo </w:t>
+      </w:r>
+      <w:r>
+        <w:t>inteligente usando a linguagem de programação C. O sistema visa gerenciar o fluxo de veículos de forma eficiente, em uma “rua” principal que recebe maior quantidade de automóveis e em uma “rua” secundária que recebe menor quantidade. Isso acontecerá por meio da sinalização com cores em intervalos de tempo, que garantirão a organização e eficiência no tráfego dos veículos.</w:t>
+      </w:r>
+    </w:p>
+    <w:p>
+      <w:pPr>
+        <w:ind w:firstLine="0"/>
         <w:jc w:val="both"/>
       </w:pPr>
     </w:p>
@@ -1482,13 +1550,17 @@
         <w:jc w:val="both"/>
       </w:pPr>
       <w:r>
-        <w:t>Descreva a solução proposta (lembre-se que o exemplo do notion pode estar superficial, a ideia é ajudar vocês a desenvolver a documentação, para finalizar, todo o texto é de forma discursiva e com suas palavras).</w:t>
-      </w:r>
-    </w:p>
-    <w:p>
-      <w:pPr>
-        <w:jc w:val="both"/>
-      </w:pPr>
+        <w:t>A solução proposta consiste em um conjunto de semáforos interligados, que se adapt</w:t>
+      </w:r>
+      <w:r>
+        <w:t>a</w:t>
+      </w:r>
+      <w:r>
+        <w:t>m a realidade do</w:t>
+      </w:r>
+      <w:r>
+        <w:t xml:space="preserve"> fluxo das “ruas”. Diferente de um semáforo comum, o Smart Flow gere o tempo considerando o fluxo individual de cada rua, assim ruas com demandas maiores contarão com espaços de tempo no sinal verde maior evitando o engarrafamento. Enquanto ruas com fluxos menores terão intervalos de tempo no sinal verde menores, garantindo a circulação de veículos em prejudicar a rua principal. Por fim, o sistema é planejado para um semáforo depender do outro, e assegurar que não haverá dois sinais verdes simultâneos.</w:t>
+      </w:r>
     </w:p>
     <w:p>
       <w:pPr>
@@ -1516,20 +1588,507 @@
         <w:jc w:val="both"/>
       </w:pPr>
       <w:r>
-        <w:t xml:space="preserve">Descreva o funcionamento (discursiva), na sequencia pode usar a sequência mínima esperada (opcional), o uso da tabela é </w:t>
-      </w:r>
-      <w:r>
-        <w:t xml:space="preserve">obrigatório. </w:t>
-      </w:r>
-      <w:r>
-        <w:t>(lembre-se que o exemplo do notion pode estar superficial, a ideia é ajudar vocês a desenvolver a documentação, para finalizar, todo o texto é de forma discursiva e com suas palavras).</w:t>
-      </w:r>
-    </w:p>
-    <w:p>
-      <w:pPr>
+        <w:t xml:space="preserve">Referente ao funcionamento do Smart Flow, inicialmente ao mesmo tempo que a via principal é liberada e apresenta a cor verde, a via secundária é retida e mostra cor vermelho. Após o tempo estipulado, ocorre a transição de cor para amarelo na via principal, enquanto a via secundária permanece mostrando vermelho, ambos em um </w:t>
+      </w:r>
+      <w:r>
+        <w:lastRenderedPageBreak/>
+        <w:t xml:space="preserve">pequeno espaço de tempo, pois essa transição representa apenas um intervalo de segurança para garantir que não haverá dois sinais verdes </w:t>
+      </w:r>
+      <w:r>
+        <w:t>ao mesmo tempo</w:t>
+      </w:r>
+      <w:r>
+        <w:t>. Em seguida, a via secundária é liberada e</w:t>
+      </w:r>
+      <w:r>
+        <w:t xml:space="preserve"> simultaneamente </w:t>
+      </w:r>
+      <w:r>
+        <w:t>a</w:t>
+      </w:r>
+      <w:r>
+        <w:t xml:space="preserve"> via</w:t>
+      </w:r>
+      <w:r>
+        <w:t xml:space="preserve"> principal alterna para a cor vermelha </w:t>
+      </w:r>
+      <w:r>
+        <w:t>em um intervalo de tempo menor do que a primeira liberação, pois a demanda no fluxo da segunda via é menor que o da primeira. Esse processo irá se repetir sempre, garantindo que haja controle no cruzamento.</w:t>
+      </w:r>
+    </w:p>
+    <w:p>
+      <w:pPr>
+        <w:ind w:firstLine="0"/>
         <w:jc w:val="both"/>
       </w:pPr>
     </w:p>
+    <w:tbl>
+      <w:tblPr>
+        <w:tblStyle w:val="Tabelacomgrade"/>
+        <w:tblW w:w="0" w:type="auto"/>
+        <w:tblLook w:val="04A0" w:firstRow="1" w:lastRow="0" w:firstColumn="1" w:lastColumn="0" w:noHBand="0" w:noVBand="1"/>
+      </w:tblPr>
+      <w:tblGrid>
+        <w:gridCol w:w="2265"/>
+        <w:gridCol w:w="2265"/>
+        <w:gridCol w:w="2265"/>
+        <w:gridCol w:w="2266"/>
+      </w:tblGrid>
+      <w:tr>
+        <w:tc>
+          <w:tcPr>
+            <w:tcW w:w="2265" w:type="dxa"/>
+          </w:tcPr>
+          <w:p>
+            <w:pPr>
+              <w:spacing w:line="240" w:lineRule="auto"/>
+              <w:ind w:firstLine="0"/>
+              <w:jc w:val="both"/>
+              <w:rPr>
+                <w:rFonts w:cs="Arial"/>
+                <w:b/>
+                <w:bCs/>
+              </w:rPr>
+            </w:pPr>
+            <w:r>
+              <w:rPr>
+                <w:rStyle w:val="Forte"/>
+                <w:rFonts w:cs="Arial"/>
+              </w:rPr>
+              <w:t>Etapa</w:t>
+            </w:r>
+          </w:p>
+        </w:tc>
+        <w:tc>
+          <w:tcPr>
+            <w:tcW w:w="2265" w:type="dxa"/>
+          </w:tcPr>
+          <w:p>
+            <w:pPr>
+              <w:ind w:firstLine="0"/>
+              <w:jc w:val="both"/>
+              <w:rPr>
+                <w:b/>
+                <w:bCs/>
+              </w:rPr>
+            </w:pPr>
+            <w:r>
+              <w:rPr>
+                <w:b/>
+                <w:bCs/>
+              </w:rPr>
+              <w:t>Via Principal</w:t>
+            </w:r>
+          </w:p>
+        </w:tc>
+        <w:tc>
+          <w:tcPr>
+            <w:tcW w:w="2265" w:type="dxa"/>
+          </w:tcPr>
+          <w:p>
+            <w:pPr>
+              <w:ind w:firstLine="0"/>
+              <w:jc w:val="both"/>
+              <w:rPr>
+                <w:b/>
+                <w:bCs/>
+              </w:rPr>
+            </w:pPr>
+            <w:r>
+              <w:rPr>
+                <w:b/>
+                <w:bCs/>
+              </w:rPr>
+              <w:t>Via Secundária</w:t>
+            </w:r>
+          </w:p>
+        </w:tc>
+        <w:tc>
+          <w:tcPr>
+            <w:tcW w:w="2266" w:type="dxa"/>
+          </w:tcPr>
+          <w:p>
+            <w:pPr>
+              <w:ind w:firstLine="0"/>
+              <w:jc w:val="both"/>
+              <w:rPr>
+                <w:b/>
+                <w:bCs/>
+              </w:rPr>
+            </w:pPr>
+            <w:r>
+              <w:rPr>
+                <w:b/>
+                <w:bCs/>
+              </w:rPr>
+              <w:t>Descrição Técnica</w:t>
+            </w:r>
+          </w:p>
+        </w:tc>
+      </w:tr>
+      <w:tr>
+        <w:tc>
+          <w:tcPr>
+            <w:tcW w:w="2265" w:type="dxa"/>
+          </w:tcPr>
+          <w:p>
+            <w:pPr>
+              <w:ind w:firstLine="0"/>
+              <w:jc w:val="both"/>
+            </w:pPr>
+            <w:r>
+              <w:t>1</w:t>
+            </w:r>
+          </w:p>
+        </w:tc>
+        <w:tc>
+          <w:tcPr>
+            <w:tcW w:w="2265" w:type="dxa"/>
+          </w:tcPr>
+          <w:p>
+            <w:pPr>
+              <w:ind w:firstLine="0"/>
+              <w:jc w:val="both"/>
+            </w:pPr>
+            <w:r>
+              <w:t>Verde</w:t>
+            </w:r>
+          </w:p>
+        </w:tc>
+        <w:tc>
+          <w:tcPr>
+            <w:tcW w:w="2265" w:type="dxa"/>
+          </w:tcPr>
+          <w:p>
+            <w:pPr>
+              <w:ind w:firstLine="0"/>
+              <w:jc w:val="both"/>
+            </w:pPr>
+            <w:r>
+              <w:t>Vermelho</w:t>
+            </w:r>
+          </w:p>
+        </w:tc>
+        <w:tc>
+          <w:tcPr>
+            <w:tcW w:w="2266" w:type="dxa"/>
+          </w:tcPr>
+          <w:p>
+            <w:pPr>
+              <w:ind w:firstLine="0"/>
+              <w:jc w:val="both"/>
+            </w:pPr>
+            <w:r>
+              <w:t>Fluxo liberado na via de maior tráfego.</w:t>
+            </w:r>
+          </w:p>
+        </w:tc>
+      </w:tr>
+      <w:tr>
+        <w:tc>
+          <w:tcPr>
+            <w:tcW w:w="2265" w:type="dxa"/>
+          </w:tcPr>
+          <w:p>
+            <w:pPr>
+              <w:ind w:firstLine="0"/>
+              <w:jc w:val="both"/>
+            </w:pPr>
+            <w:r>
+              <w:t>2</w:t>
+            </w:r>
+          </w:p>
+        </w:tc>
+        <w:tc>
+          <w:tcPr>
+            <w:tcW w:w="2265" w:type="dxa"/>
+          </w:tcPr>
+          <w:p>
+            <w:pPr>
+              <w:ind w:firstLine="0"/>
+              <w:jc w:val="both"/>
+            </w:pPr>
+            <w:r>
+              <w:t>Amarelo</w:t>
+            </w:r>
+          </w:p>
+        </w:tc>
+        <w:tc>
+          <w:tcPr>
+            <w:tcW w:w="2265" w:type="dxa"/>
+          </w:tcPr>
+          <w:p>
+            <w:pPr>
+              <w:ind w:firstLine="0"/>
+              <w:jc w:val="both"/>
+            </w:pPr>
+            <w:r>
+              <w:t>Vermelho</w:t>
+            </w:r>
+          </w:p>
+        </w:tc>
+        <w:tc>
+          <w:tcPr>
+            <w:tcW w:w="2266" w:type="dxa"/>
+          </w:tcPr>
+          <w:p>
+            <w:pPr>
+              <w:ind w:firstLine="0"/>
+              <w:jc w:val="center"/>
+            </w:pPr>
+            <w:r>
+              <w:t>Transição e alerta para parada na via principal.</w:t>
+            </w:r>
+          </w:p>
+        </w:tc>
+      </w:tr>
+      <w:tr>
+        <w:tc>
+          <w:tcPr>
+            <w:tcW w:w="2265" w:type="dxa"/>
+          </w:tcPr>
+          <w:p>
+            <w:pPr>
+              <w:ind w:firstLine="0"/>
+              <w:jc w:val="both"/>
+            </w:pPr>
+            <w:r>
+              <w:t>3</w:t>
+            </w:r>
+          </w:p>
+        </w:tc>
+        <w:tc>
+          <w:tcPr>
+            <w:tcW w:w="2265" w:type="dxa"/>
+          </w:tcPr>
+          <w:p>
+            <w:pPr>
+              <w:ind w:firstLine="0"/>
+              <w:jc w:val="both"/>
+            </w:pPr>
+            <w:r>
+              <w:t>Vermelho</w:t>
+            </w:r>
+          </w:p>
+        </w:tc>
+        <w:tc>
+          <w:tcPr>
+            <w:tcW w:w="2265" w:type="dxa"/>
+          </w:tcPr>
+          <w:p>
+            <w:pPr>
+              <w:ind w:firstLine="0"/>
+              <w:jc w:val="both"/>
+            </w:pPr>
+            <w:r>
+              <w:t>Vermelho</w:t>
+            </w:r>
+          </w:p>
+        </w:tc>
+        <w:tc>
+          <w:tcPr>
+            <w:tcW w:w="2266" w:type="dxa"/>
+          </w:tcPr>
+          <w:p>
+            <w:pPr>
+              <w:ind w:firstLine="0"/>
+              <w:jc w:val="both"/>
+            </w:pPr>
+            <w:r>
+              <w:t>Intervalo de segurança</w:t>
+            </w:r>
+            <w:r>
+              <w:t>.</w:t>
+            </w:r>
+          </w:p>
+        </w:tc>
+      </w:tr>
+      <w:tr>
+        <w:tc>
+          <w:tcPr>
+            <w:tcW w:w="2265" w:type="dxa"/>
+          </w:tcPr>
+          <w:p>
+            <w:pPr>
+              <w:ind w:firstLine="0"/>
+              <w:jc w:val="both"/>
+            </w:pPr>
+            <w:r>
+              <w:t>4</w:t>
+            </w:r>
+          </w:p>
+        </w:tc>
+        <w:tc>
+          <w:tcPr>
+            <w:tcW w:w="2265" w:type="dxa"/>
+          </w:tcPr>
+          <w:p>
+            <w:pPr>
+              <w:ind w:firstLine="0"/>
+              <w:jc w:val="both"/>
+            </w:pPr>
+            <w:r>
+              <w:t>Vermelho</w:t>
+            </w:r>
+          </w:p>
+        </w:tc>
+        <w:tc>
+          <w:tcPr>
+            <w:tcW w:w="2265" w:type="dxa"/>
+          </w:tcPr>
+          <w:p>
+            <w:pPr>
+              <w:ind w:firstLine="0"/>
+              <w:jc w:val="both"/>
+            </w:pPr>
+            <w:r>
+              <w:t>Verde</w:t>
+            </w:r>
+          </w:p>
+        </w:tc>
+        <w:tc>
+          <w:tcPr>
+            <w:tcW w:w="2266" w:type="dxa"/>
+          </w:tcPr>
+          <w:p>
+            <w:pPr>
+              <w:ind w:firstLine="0"/>
+              <w:jc w:val="center"/>
+            </w:pPr>
+            <w:r>
+              <w:t>Fluxo liberado na</w:t>
+            </w:r>
+            <w:r>
+              <w:t xml:space="preserve"> </w:t>
+            </w:r>
+            <w:r>
+              <w:t>via secundária.</w:t>
+            </w:r>
+          </w:p>
+        </w:tc>
+      </w:tr>
+      <w:tr>
+        <w:tc>
+          <w:tcPr>
+            <w:tcW w:w="2265" w:type="dxa"/>
+          </w:tcPr>
+          <w:p>
+            <w:pPr>
+              <w:ind w:firstLine="0"/>
+              <w:jc w:val="both"/>
+            </w:pPr>
+            <w:r>
+              <w:t>5</w:t>
+            </w:r>
+          </w:p>
+        </w:tc>
+        <w:tc>
+          <w:tcPr>
+            <w:tcW w:w="2265" w:type="dxa"/>
+          </w:tcPr>
+          <w:p>
+            <w:pPr>
+              <w:ind w:firstLine="0"/>
+              <w:jc w:val="both"/>
+            </w:pPr>
+            <w:r>
+              <w:t>Vermelho</w:t>
+            </w:r>
+          </w:p>
+        </w:tc>
+        <w:tc>
+          <w:tcPr>
+            <w:tcW w:w="2265" w:type="dxa"/>
+          </w:tcPr>
+          <w:p>
+            <w:pPr>
+              <w:ind w:firstLine="0"/>
+              <w:jc w:val="both"/>
+            </w:pPr>
+            <w:r>
+              <w:t>Amarelo</w:t>
+            </w:r>
+          </w:p>
+          <w:p>
+            <w:pPr>
+              <w:jc w:val="center"/>
+            </w:pPr>
+          </w:p>
+        </w:tc>
+        <w:tc>
+          <w:tcPr>
+            <w:tcW w:w="2266" w:type="dxa"/>
+          </w:tcPr>
+          <w:p>
+            <w:pPr>
+              <w:ind w:firstLine="0"/>
+              <w:jc w:val="both"/>
+            </w:pPr>
+            <w:r>
+              <w:t>Transição e alerta para parada na via secundária.</w:t>
+            </w:r>
+          </w:p>
+        </w:tc>
+      </w:tr>
+      <w:tr>
+        <w:tc>
+          <w:tcPr>
+            <w:tcW w:w="2265" w:type="dxa"/>
+          </w:tcPr>
+          <w:p>
+            <w:pPr>
+              <w:ind w:firstLine="0"/>
+              <w:jc w:val="both"/>
+            </w:pPr>
+            <w:r>
+              <w:t>6</w:t>
+            </w:r>
+          </w:p>
+        </w:tc>
+        <w:tc>
+          <w:tcPr>
+            <w:tcW w:w="2265" w:type="dxa"/>
+          </w:tcPr>
+          <w:p>
+            <w:pPr>
+              <w:ind w:firstLine="0"/>
+              <w:jc w:val="both"/>
+            </w:pPr>
+            <w:r>
+              <w:t>Vermelho</w:t>
+            </w:r>
+          </w:p>
+        </w:tc>
+        <w:tc>
+          <w:tcPr>
+            <w:tcW w:w="2265" w:type="dxa"/>
+          </w:tcPr>
+          <w:p>
+            <w:pPr>
+              <w:ind w:firstLine="0"/>
+              <w:jc w:val="both"/>
+            </w:pPr>
+            <w:r>
+              <w:t>Vermelho</w:t>
+            </w:r>
+          </w:p>
+        </w:tc>
+        <w:tc>
+          <w:tcPr>
+            <w:tcW w:w="2266" w:type="dxa"/>
+          </w:tcPr>
+          <w:p>
+            <w:pPr>
+              <w:ind w:firstLine="0"/>
+              <w:jc w:val="both"/>
+            </w:pPr>
+            <w:r>
+              <w:t>Intervalo de segurança para reinício do ciclo.</w:t>
+            </w:r>
+          </w:p>
+        </w:tc>
+      </w:tr>
+    </w:tbl>
     <w:p>
       <w:pPr>
         <w:ind w:firstLine="0"/>
@@ -1540,6 +2099,12 @@
       <w:pPr>
         <w:ind w:firstLine="0"/>
         <w:jc w:val="both"/>
+      </w:pPr>
+    </w:p>
+    <w:p>
+      <w:pPr>
+        <w:ind w:firstLine="0"/>
+        <w:jc w:val="both"/>
         <w:rPr>
           <w:b/>
           <w:bCs/>
@@ -1565,19 +2130,14 @@
         <w:jc w:val="both"/>
       </w:pPr>
       <w:r>
-        <w:t>Descreva o que é requisito do sistema e dê exemplos sem identificar requisitos funcionais e não funcionais.</w:t>
-      </w:r>
-      <w:r>
-        <w:t xml:space="preserve"> </w:t>
-      </w:r>
-      <w:r>
-        <w:t>(lembre-se que o exemplo do notion pode estar superficial, a ideia é ajudar vocês a desenvolver a documentação, para finalizar, todo o texto é de forma discursiva e com suas palavras).</w:t>
-      </w:r>
-    </w:p>
-    <w:p>
-      <w:pPr>
-        <w:jc w:val="both"/>
-      </w:pPr>
+        <w:t xml:space="preserve">Os requisitos do sistema </w:t>
+      </w:r>
+      <w:r>
+        <w:t>ou de software são as especificações das funções e características que precisam ser atendidas em um sistema para que ele atenda às necessidades e expectativas do projeto. Eles são</w:t>
+      </w:r>
+      <w:r>
+        <w:t xml:space="preserve"> as funcionalidades ou restrições que o projeto deverá atender para que ele seja bem-sucedido.</w:t>
+      </w:r>
     </w:p>
     <w:p>
       <w:pPr>
@@ -1619,24 +2179,237 @@
         <w:jc w:val="both"/>
       </w:pPr>
       <w:r>
-        <w:t xml:space="preserve">Descreva o que é requisitos funcionais (discursiva) de um sistema e utilize a tabela do notion (obrigatório), </w:t>
-      </w:r>
-      <w:r>
-        <w:t>faça as alterações que julgar necessário</w:t>
-      </w:r>
-      <w:r>
-        <w:t xml:space="preserve">. </w:t>
-      </w:r>
-      <w:r>
-        <w:t xml:space="preserve">(lembre-se </w:t>
-      </w:r>
-      <w:r>
         <w:lastRenderedPageBreak/>
-        <w:t>que o exemplo do notion pode estar superficial, a ideia é ajudar vocês a desenvolver a documentação, para finalizar, todo o texto é de forma discursiva e com suas palavras).</w:t>
-      </w:r>
-    </w:p>
-    <w:p>
-      <w:pPr>
+        <w:t>Os requisitos funcionais são definidos pelas ações que o sistema deve executar e que estão relacionadas diretamente ao funcionamento do projeto, e ao seu comportamento.</w:t>
+      </w:r>
+    </w:p>
+    <w:tbl>
+      <w:tblPr>
+        <w:tblStyle w:val="Tabelacomgrade"/>
+        <w:tblW w:w="0" w:type="auto"/>
+        <w:tblLook w:val="04A0" w:firstRow="1" w:lastRow="0" w:firstColumn="1" w:lastColumn="0" w:noHBand="0" w:noVBand="1"/>
+      </w:tblPr>
+      <w:tblGrid>
+        <w:gridCol w:w="4530"/>
+        <w:gridCol w:w="4531"/>
+      </w:tblGrid>
+      <w:tr>
+        <w:tc>
+          <w:tcPr>
+            <w:tcW w:w="4530" w:type="dxa"/>
+          </w:tcPr>
+          <w:p>
+            <w:pPr>
+              <w:ind w:firstLine="0"/>
+              <w:jc w:val="both"/>
+            </w:pPr>
+            <w:r>
+              <w:t>Numeração dos r</w:t>
+            </w:r>
+            <w:r>
+              <w:t>equisitos funcionais</w:t>
+            </w:r>
+          </w:p>
+        </w:tc>
+        <w:tc>
+          <w:tcPr>
+            <w:tcW w:w="4531" w:type="dxa"/>
+          </w:tcPr>
+          <w:p>
+            <w:pPr>
+              <w:ind w:firstLine="0"/>
+              <w:jc w:val="both"/>
+            </w:pPr>
+            <w:r>
+              <w:t>Descrição</w:t>
+            </w:r>
+          </w:p>
+        </w:tc>
+      </w:tr>
+      <w:tr>
+        <w:tc>
+          <w:tcPr>
+            <w:tcW w:w="4530" w:type="dxa"/>
+          </w:tcPr>
+          <w:p>
+            <w:pPr>
+              <w:ind w:firstLine="0"/>
+              <w:jc w:val="both"/>
+            </w:pPr>
+            <w:r>
+              <w:t>RF001</w:t>
+            </w:r>
+          </w:p>
+        </w:tc>
+        <w:tc>
+          <w:tcPr>
+            <w:tcW w:w="4531" w:type="dxa"/>
+          </w:tcPr>
+          <w:p>
+            <w:pPr>
+              <w:ind w:firstLine="0"/>
+              <w:jc w:val="both"/>
+            </w:pPr>
+            <w:r>
+              <w:t>O sistema da via principal deve levar um tempo maior para alternar o sinal verde do que na segunda via.</w:t>
+            </w:r>
+          </w:p>
+        </w:tc>
+      </w:tr>
+      <w:tr>
+        <w:tc>
+          <w:tcPr>
+            <w:tcW w:w="4530" w:type="dxa"/>
+          </w:tcPr>
+          <w:p>
+            <w:pPr>
+              <w:ind w:firstLine="0"/>
+              <w:jc w:val="both"/>
+            </w:pPr>
+            <w:r>
+              <w:t>RF002</w:t>
+            </w:r>
+          </w:p>
+        </w:tc>
+        <w:tc>
+          <w:tcPr>
+            <w:tcW w:w="4531" w:type="dxa"/>
+          </w:tcPr>
+          <w:p>
+            <w:pPr>
+              <w:ind w:firstLine="0"/>
+              <w:jc w:val="both"/>
+            </w:pPr>
+            <w:r>
+              <w:t>O sistema deve mostrar o sinal amarelo para indicar a transição entre vermelho e verde.</w:t>
+            </w:r>
+          </w:p>
+        </w:tc>
+      </w:tr>
+      <w:tr>
+        <w:tc>
+          <w:tcPr>
+            <w:tcW w:w="4530" w:type="dxa"/>
+          </w:tcPr>
+          <w:p>
+            <w:pPr>
+              <w:ind w:firstLine="0"/>
+              <w:jc w:val="both"/>
+            </w:pPr>
+            <w:r>
+              <w:t>RF003</w:t>
+            </w:r>
+          </w:p>
+        </w:tc>
+        <w:tc>
+          <w:tcPr>
+            <w:tcW w:w="4531" w:type="dxa"/>
+          </w:tcPr>
+          <w:p>
+            <w:pPr>
+              <w:ind w:firstLine="0"/>
+              <w:jc w:val="both"/>
+            </w:pPr>
+            <w:r>
+              <w:t>O funcionamento do sistema deve ser contínuo e automático.</w:t>
+            </w:r>
+          </w:p>
+        </w:tc>
+      </w:tr>
+      <w:tr>
+        <w:tc>
+          <w:tcPr>
+            <w:tcW w:w="4530" w:type="dxa"/>
+          </w:tcPr>
+          <w:p>
+            <w:pPr>
+              <w:ind w:firstLine="0"/>
+              <w:jc w:val="both"/>
+            </w:pPr>
+            <w:r>
+              <w:t>RF004</w:t>
+            </w:r>
+          </w:p>
+        </w:tc>
+        <w:tc>
+          <w:tcPr>
+            <w:tcW w:w="4531" w:type="dxa"/>
+          </w:tcPr>
+          <w:p>
+            <w:pPr>
+              <w:ind w:firstLine="0"/>
+              <w:jc w:val="both"/>
+            </w:pPr>
+            <w:r>
+              <w:t>O sistema deve exibir visualmente o estado de cada semáforo visualmente através de cores no “terminal de saída”.</w:t>
+            </w:r>
+          </w:p>
+        </w:tc>
+      </w:tr>
+      <w:tr>
+        <w:tc>
+          <w:tcPr>
+            <w:tcW w:w="4530" w:type="dxa"/>
+          </w:tcPr>
+          <w:p>
+            <w:pPr>
+              <w:ind w:firstLine="0"/>
+              <w:jc w:val="both"/>
+            </w:pPr>
+            <w:r>
+              <w:t>RF005</w:t>
+            </w:r>
+          </w:p>
+        </w:tc>
+        <w:tc>
+          <w:tcPr>
+            <w:tcW w:w="4531" w:type="dxa"/>
+          </w:tcPr>
+          <w:p>
+            <w:pPr>
+              <w:ind w:firstLine="0"/>
+              <w:jc w:val="both"/>
+            </w:pPr>
+            <w:r>
+              <w:t>O sistema deve possuir uma lógica que impeça a sinalização de dois sinais verdes ao mesmo tempo.</w:t>
+            </w:r>
+          </w:p>
+        </w:tc>
+      </w:tr>
+      <w:tr>
+        <w:tc>
+          <w:tcPr>
+            <w:tcW w:w="4530" w:type="dxa"/>
+          </w:tcPr>
+          <w:p>
+            <w:pPr>
+              <w:ind w:firstLine="0"/>
+              <w:jc w:val="both"/>
+            </w:pPr>
+            <w:r>
+              <w:t>RF006</w:t>
+            </w:r>
+          </w:p>
+        </w:tc>
+        <w:tc>
+          <w:tcPr>
+            <w:tcW w:w="4531" w:type="dxa"/>
+          </w:tcPr>
+          <w:p>
+            <w:pPr>
+              <w:ind w:firstLine="0"/>
+              <w:jc w:val="both"/>
+            </w:pPr>
+            <w:r>
+              <w:t>O sistema deve garantir que em ambas as vias o sinal vermelho seja acionado depois do sinal amarelo.</w:t>
+            </w:r>
+          </w:p>
+        </w:tc>
+      </w:tr>
+    </w:tbl>
+    <w:p>
+      <w:pPr>
+        <w:ind w:firstLine="0"/>
         <w:jc w:val="both"/>
       </w:pPr>
     </w:p>
@@ -1673,27 +2446,240 @@
         <w:jc w:val="both"/>
       </w:pPr>
       <w:r>
-        <w:t xml:space="preserve">Descreva o que é </w:t>
-      </w:r>
-      <w:r>
-        <w:t>requisito não</w:t>
-      </w:r>
-      <w:r>
-        <w:t xml:space="preserve"> funcionais</w:t>
-      </w:r>
-      <w:r>
-        <w:t xml:space="preserve"> (discursiva)</w:t>
-      </w:r>
-      <w:r>
-        <w:t xml:space="preserve"> de um sistema e utilize a tabela do notion (obrigatório)</w:t>
-      </w:r>
-      <w:r>
-        <w:t xml:space="preserve">, </w:t>
-      </w:r>
-      <w:r>
-        <w:t>faça as alterações que julgar necessário. (lembre-se que o exemplo do notion pode estar superficial, a ideia é ajudar vocês a desenvolver a documentação, para finalizar, todo o texto é de forma discursiva e com suas palavras).</w:t>
-      </w:r>
-    </w:p>
+        <w:t xml:space="preserve">Os requisitos não funcionais </w:t>
+      </w:r>
+      <w:r>
+        <w:t>são caracterizados por descrever as qualidades que o sistema deve ter, também está relacionado ao desempenho, linguagem utilizada, design entre outros. Diferente dos requisitos funcionais, os requisitos não funcionais não estão relacionados a ações essenciais que o sistema deve apresentar para funcionar.</w:t>
+      </w:r>
+    </w:p>
+    <w:tbl>
+      <w:tblPr>
+        <w:tblStyle w:val="Tabelacomgrade"/>
+        <w:tblW w:w="0" w:type="auto"/>
+        <w:tblLook w:val="04A0" w:firstRow="1" w:lastRow="0" w:firstColumn="1" w:lastColumn="0" w:noHBand="0" w:noVBand="1"/>
+      </w:tblPr>
+      <w:tblGrid>
+        <w:gridCol w:w="4530"/>
+        <w:gridCol w:w="4531"/>
+      </w:tblGrid>
+      <w:tr>
+        <w:tc>
+          <w:tcPr>
+            <w:tcW w:w="4530" w:type="dxa"/>
+          </w:tcPr>
+          <w:p>
+            <w:pPr>
+              <w:ind w:firstLine="0"/>
+              <w:jc w:val="both"/>
+            </w:pPr>
+            <w:r>
+              <w:t>Numeração dos requisitos não funcionais</w:t>
+            </w:r>
+          </w:p>
+        </w:tc>
+        <w:tc>
+          <w:tcPr>
+            <w:tcW w:w="4531" w:type="dxa"/>
+          </w:tcPr>
+          <w:p>
+            <w:pPr>
+              <w:ind w:firstLine="0"/>
+              <w:jc w:val="both"/>
+            </w:pPr>
+            <w:r>
+              <w:t>Descrição</w:t>
+            </w:r>
+          </w:p>
+        </w:tc>
+      </w:tr>
+      <w:tr>
+        <w:tc>
+          <w:tcPr>
+            <w:tcW w:w="4530" w:type="dxa"/>
+          </w:tcPr>
+          <w:p>
+            <w:pPr>
+              <w:ind w:firstLine="0"/>
+              <w:jc w:val="both"/>
+            </w:pPr>
+            <w:r>
+              <w:t>RNF001</w:t>
+            </w:r>
+          </w:p>
+        </w:tc>
+        <w:tc>
+          <w:tcPr>
+            <w:tcW w:w="4531" w:type="dxa"/>
+          </w:tcPr>
+          <w:p>
+            <w:pPr>
+              <w:ind w:firstLine="0"/>
+              <w:jc w:val="both"/>
+            </w:pPr>
+            <w:r>
+              <w:t>O software deve ser desenvolvido na linguagem C.</w:t>
+            </w:r>
+          </w:p>
+        </w:tc>
+      </w:tr>
+      <w:tr>
+        <w:tc>
+          <w:tcPr>
+            <w:tcW w:w="4530" w:type="dxa"/>
+          </w:tcPr>
+          <w:p>
+            <w:pPr>
+              <w:ind w:firstLine="0"/>
+              <w:jc w:val="both"/>
+            </w:pPr>
+            <w:r>
+              <w:lastRenderedPageBreak/>
+              <w:t>RNF002</w:t>
+            </w:r>
+          </w:p>
+        </w:tc>
+        <w:tc>
+          <w:tcPr>
+            <w:tcW w:w="4531" w:type="dxa"/>
+          </w:tcPr>
+          <w:p>
+            <w:pPr>
+              <w:ind w:firstLine="0"/>
+              <w:jc w:val="both"/>
+            </w:pPr>
+            <w:r>
+              <w:t xml:space="preserve">O tempo de resposta entre as trocas de cores deve ser menor que </w:t>
+            </w:r>
+            <w:r>
+              <w:t>1</w:t>
+            </w:r>
+            <w:r>
+              <w:t xml:space="preserve"> segundo.</w:t>
+            </w:r>
+          </w:p>
+        </w:tc>
+      </w:tr>
+      <w:tr>
+        <w:tc>
+          <w:tcPr>
+            <w:tcW w:w="4530" w:type="dxa"/>
+          </w:tcPr>
+          <w:p>
+            <w:pPr>
+              <w:ind w:firstLine="0"/>
+              <w:jc w:val="both"/>
+            </w:pPr>
+            <w:r>
+              <w:t>RNF003</w:t>
+            </w:r>
+          </w:p>
+        </w:tc>
+        <w:tc>
+          <w:tcPr>
+            <w:tcW w:w="4531" w:type="dxa"/>
+          </w:tcPr>
+          <w:p>
+            <w:pPr>
+              <w:ind w:firstLine="0"/>
+              <w:jc w:val="both"/>
+            </w:pPr>
+            <w:r>
+              <w:t>O código deve estar bem dividido, organizado e fácil de ler.</w:t>
+            </w:r>
+          </w:p>
+        </w:tc>
+      </w:tr>
+      <w:tr>
+        <w:tc>
+          <w:tcPr>
+            <w:tcW w:w="4530" w:type="dxa"/>
+          </w:tcPr>
+          <w:p>
+            <w:pPr>
+              <w:ind w:firstLine="0"/>
+              <w:jc w:val="both"/>
+            </w:pPr>
+            <w:r>
+              <w:t>RNF004</w:t>
+            </w:r>
+          </w:p>
+        </w:tc>
+        <w:tc>
+          <w:tcPr>
+            <w:tcW w:w="4531" w:type="dxa"/>
+          </w:tcPr>
+          <w:p>
+            <w:pPr>
+              <w:ind w:firstLine="0"/>
+              <w:jc w:val="both"/>
+            </w:pPr>
+            <w:r>
+              <w:t>As variáveis no código devem possuir nomes autoexplicativos. Exemplo, “tempoVerde”.</w:t>
+            </w:r>
+          </w:p>
+        </w:tc>
+      </w:tr>
+      <w:tr>
+        <w:tc>
+          <w:tcPr>
+            <w:tcW w:w="4530" w:type="dxa"/>
+          </w:tcPr>
+          <w:p>
+            <w:pPr>
+              <w:ind w:firstLine="0"/>
+              <w:jc w:val="both"/>
+            </w:pPr>
+            <w:r>
+              <w:t>RNF005</w:t>
+            </w:r>
+          </w:p>
+        </w:tc>
+        <w:tc>
+          <w:tcPr>
+            <w:tcW w:w="4531" w:type="dxa"/>
+          </w:tcPr>
+          <w:p>
+            <w:pPr>
+              <w:ind w:firstLine="0"/>
+              <w:jc w:val="both"/>
+            </w:pPr>
+            <w:r>
+              <w:t>O programa não poderá “travar” ou fechar sozinho durante a execução.</w:t>
+            </w:r>
+          </w:p>
+        </w:tc>
+      </w:tr>
+      <w:tr>
+        <w:tc>
+          <w:tcPr>
+            <w:tcW w:w="4530" w:type="dxa"/>
+          </w:tcPr>
+          <w:p>
+            <w:pPr>
+              <w:ind w:firstLine="0"/>
+              <w:jc w:val="both"/>
+            </w:pPr>
+            <w:r>
+              <w:t>RNF006</w:t>
+            </w:r>
+          </w:p>
+        </w:tc>
+        <w:tc>
+          <w:tcPr>
+            <w:tcW w:w="4531" w:type="dxa"/>
+          </w:tcPr>
+          <w:p>
+            <w:pPr>
+              <w:ind w:firstLine="0"/>
+              <w:jc w:val="both"/>
+            </w:pPr>
+            <w:r>
+              <w:t>As cores que representam os estados do semáforo devem seguir o padrão universal sendo vermelho, amarelo e verde.</w:t>
+            </w:r>
+          </w:p>
+        </w:tc>
+      </w:tr>
+    </w:tbl>
     <w:p>
       <w:pPr>
         <w:ind w:firstLine="0"/>
@@ -1704,198 +2690,1223 @@
       <w:pPr>
         <w:ind w:firstLine="0"/>
         <w:jc w:val="both"/>
-      </w:pPr>
-    </w:p>
-    <w:p>
-      <w:pPr>
-        <w:ind w:firstLine="0"/>
+        <w:rPr>
+          <w:b/>
+          <w:bCs/>
+        </w:rPr>
+      </w:pPr>
+      <w:r>
+        <w:rPr>
+          <w:b/>
+          <w:bCs/>
+        </w:rPr>
+        <w:t>3.LISTA DE MAT</w:t>
+      </w:r>
+      <w:r>
+        <w:rPr>
+          <w:b/>
+          <w:bCs/>
+        </w:rPr>
+        <w:t>E</w:t>
+      </w:r>
+      <w:r>
+        <w:rPr>
+          <w:b/>
+          <w:bCs/>
+        </w:rPr>
+        <w:t>RIAIS E EQUIPAMENTOS</w:t>
+      </w:r>
+    </w:p>
+    <w:p>
+      <w:pPr>
         <w:jc w:val="both"/>
-        <w:rPr>
-          <w:b/>
-          <w:bCs/>
-        </w:rPr>
-      </w:pPr>
-      <w:r>
-        <w:rPr>
-          <w:b/>
-          <w:bCs/>
-        </w:rPr>
-        <w:t>3.LISTA DE MATÉRIAIS E EQUIPAMENTOS</w:t>
-      </w:r>
-    </w:p>
-    <w:p>
-      <w:pPr>
+      </w:pPr>
+      <w:r>
+        <w:t>Para realizar este projeto, a seguir foram selecionados alguns materiais para o desenvolvimento do software, que são essenciais, e outros opcionais para o desenvolvimento do protótipo físico (hardware).</w:t>
+      </w:r>
+    </w:p>
+    <w:tbl>
+      <w:tblPr>
+        <w:tblStyle w:val="Tabelacomgrade"/>
+        <w:tblW w:w="0" w:type="auto"/>
+        <w:tblLook w:val="04A0" w:firstRow="1" w:lastRow="0" w:firstColumn="1" w:lastColumn="0" w:noHBand="0" w:noVBand="1"/>
+      </w:tblPr>
+      <w:tblGrid>
+        <w:gridCol w:w="4530"/>
+        <w:gridCol w:w="4531"/>
+      </w:tblGrid>
+      <w:tr>
+        <w:tc>
+          <w:tcPr>
+            <w:tcW w:w="4530" w:type="dxa"/>
+          </w:tcPr>
+          <w:p>
+            <w:pPr>
+              <w:ind w:firstLine="0"/>
+              <w:jc w:val="both"/>
+            </w:pPr>
+            <w:r>
+              <w:t>Item</w:t>
+            </w:r>
+          </w:p>
+        </w:tc>
+        <w:tc>
+          <w:tcPr>
+            <w:tcW w:w="4531" w:type="dxa"/>
+          </w:tcPr>
+          <w:p>
+            <w:pPr>
+              <w:ind w:firstLine="0"/>
+              <w:jc w:val="both"/>
+            </w:pPr>
+            <w:r>
+              <w:t>Finalidade</w:t>
+            </w:r>
+          </w:p>
+        </w:tc>
+      </w:tr>
+      <w:tr>
+        <w:tc>
+          <w:tcPr>
+            <w:tcW w:w="4530" w:type="dxa"/>
+          </w:tcPr>
+          <w:p>
+            <w:pPr>
+              <w:ind w:firstLine="0"/>
+              <w:jc w:val="both"/>
+            </w:pPr>
+            <w:r>
+              <w:t>Computador ou notebook</w:t>
+            </w:r>
+          </w:p>
+        </w:tc>
+        <w:tc>
+          <w:tcPr>
+            <w:tcW w:w="4531" w:type="dxa"/>
+          </w:tcPr>
+          <w:p>
+            <w:pPr>
+              <w:ind w:firstLine="0"/>
+              <w:jc w:val="both"/>
+            </w:pPr>
+            <w:r>
+              <w:t xml:space="preserve">Equipamento </w:t>
+            </w:r>
+            <w:r>
+              <w:t>usado para escrever o programa e testar se ele funciona</w:t>
+            </w:r>
+            <w:r>
+              <w:t>.</w:t>
+            </w:r>
+          </w:p>
+        </w:tc>
+      </w:tr>
+      <w:tr>
+        <w:tc>
+          <w:tcPr>
+            <w:tcW w:w="4530" w:type="dxa"/>
+          </w:tcPr>
+          <w:p>
+            <w:pPr>
+              <w:ind w:firstLine="0"/>
+              <w:jc w:val="both"/>
+            </w:pPr>
+            <w:r>
+              <w:t>V</w:t>
+            </w:r>
+            <w:r>
+              <w:t>S</w:t>
+            </w:r>
+            <w:r>
+              <w:t xml:space="preserve"> Code</w:t>
+            </w:r>
+          </w:p>
+        </w:tc>
+        <w:tc>
+          <w:tcPr>
+            <w:tcW w:w="4531" w:type="dxa"/>
+          </w:tcPr>
+          <w:p>
+            <w:pPr>
+              <w:ind w:firstLine="0"/>
+              <w:jc w:val="both"/>
+            </w:pPr>
+            <w:r>
+              <w:t>Programa usado para digitar o código</w:t>
+            </w:r>
+            <w:r>
+              <w:t>.</w:t>
+            </w:r>
+          </w:p>
+        </w:tc>
+      </w:tr>
+      <w:tr>
+        <w:trPr>
+          <w:trHeight w:val="70"/>
+        </w:trPr>
+        <w:tc>
+          <w:tcPr>
+            <w:tcW w:w="4530" w:type="dxa"/>
+          </w:tcPr>
+          <w:p>
+            <w:pPr>
+              <w:ind w:firstLine="0"/>
+              <w:jc w:val="both"/>
+            </w:pPr>
+            <w:proofErr w:type="spellStart"/>
+            <w:r>
+              <w:t>Git</w:t>
+            </w:r>
+            <w:proofErr w:type="spellEnd"/>
+          </w:p>
+        </w:tc>
+        <w:tc>
+          <w:tcPr>
+            <w:tcW w:w="4531" w:type="dxa"/>
+          </w:tcPr>
+          <w:p>
+            <w:pPr>
+              <w:ind w:firstLine="0"/>
+              <w:jc w:val="both"/>
+            </w:pPr>
+            <w:r>
+              <w:t>Controle das versões do projeto.</w:t>
+            </w:r>
+          </w:p>
+        </w:tc>
+      </w:tr>
+      <w:tr>
+        <w:tc>
+          <w:tcPr>
+            <w:tcW w:w="4530" w:type="dxa"/>
+          </w:tcPr>
+          <w:p>
+            <w:pPr>
+              <w:ind w:firstLine="0"/>
+              <w:jc w:val="both"/>
+            </w:pPr>
+            <w:r>
+              <w:t>GitHub</w:t>
+            </w:r>
+          </w:p>
+        </w:tc>
+        <w:tc>
+          <w:tcPr>
+            <w:tcW w:w="4531" w:type="dxa"/>
+          </w:tcPr>
+          <w:p>
+            <w:pPr>
+              <w:ind w:firstLine="0"/>
+              <w:jc w:val="both"/>
+            </w:pPr>
+            <w:r>
+              <w:t>Armazenamento remoto em repositórios.</w:t>
+            </w:r>
+          </w:p>
+        </w:tc>
+      </w:tr>
+      <w:tr>
+        <w:tc>
+          <w:tcPr>
+            <w:tcW w:w="4530" w:type="dxa"/>
+          </w:tcPr>
+          <w:p>
+            <w:pPr>
+              <w:ind w:firstLine="0"/>
+              <w:jc w:val="both"/>
+            </w:pPr>
+            <w:r>
+              <w:t>Sistema operacional Windows ou Linux</w:t>
+            </w:r>
+          </w:p>
+        </w:tc>
+        <w:tc>
+          <w:tcPr>
+            <w:tcW w:w="4531" w:type="dxa"/>
+          </w:tcPr>
+          <w:p>
+            <w:pPr>
+              <w:spacing w:line="240" w:lineRule="auto"/>
+              <w:ind w:firstLine="0"/>
+              <w:jc w:val="both"/>
+              <w:rPr>
+                <w:rFonts w:ascii="Times New Roman" w:hAnsi="Times New Roman"/>
+              </w:rPr>
+            </w:pPr>
+            <w:r>
+              <w:t>Parte essencial para o funcionamento do computador que permite abrir os programas.</w:t>
+            </w:r>
+          </w:p>
+        </w:tc>
+      </w:tr>
+      <w:tr>
+        <w:tc>
+          <w:tcPr>
+            <w:tcW w:w="4530" w:type="dxa"/>
+          </w:tcPr>
+          <w:p>
+            <w:pPr>
+              <w:ind w:firstLine="0"/>
+              <w:jc w:val="both"/>
+            </w:pPr>
+            <w:r>
+              <w:t>Tinkercad</w:t>
+            </w:r>
+          </w:p>
+        </w:tc>
+        <w:tc>
+          <w:tcPr>
+            <w:tcW w:w="4531" w:type="dxa"/>
+          </w:tcPr>
+          <w:p>
+            <w:pPr>
+              <w:spacing w:line="240" w:lineRule="auto"/>
+              <w:ind w:firstLine="0"/>
+              <w:jc w:val="both"/>
+            </w:pPr>
+            <w:r>
+              <w:t>Opcional</w:t>
+            </w:r>
+            <w:r>
+              <w:t xml:space="preserve"> para s</w:t>
+            </w:r>
+            <w:r>
+              <w:t>imula</w:t>
+            </w:r>
+            <w:r>
+              <w:t>r</w:t>
+            </w:r>
+            <w:r>
+              <w:t>/testar</w:t>
+            </w:r>
+            <w:r>
+              <w:t xml:space="preserve"> os </w:t>
+            </w:r>
+            <w:r>
+              <w:t>circuitos com LEDs e resistores.</w:t>
+            </w:r>
+          </w:p>
+        </w:tc>
+      </w:tr>
+      <w:tr>
+        <w:tc>
+          <w:tcPr>
+            <w:tcW w:w="4530" w:type="dxa"/>
+          </w:tcPr>
+          <w:p>
+            <w:pPr>
+              <w:ind w:firstLine="0"/>
+              <w:jc w:val="both"/>
+            </w:pPr>
+            <w:r>
+              <w:t>Arduino ou ESP32</w:t>
+            </w:r>
+          </w:p>
+        </w:tc>
+        <w:tc>
+          <w:tcPr>
+            <w:tcW w:w="4531" w:type="dxa"/>
+          </w:tcPr>
+          <w:p>
+            <w:pPr>
+              <w:spacing w:line="240" w:lineRule="auto"/>
+              <w:ind w:firstLine="0"/>
+              <w:jc w:val="both"/>
+              <w:rPr>
+                <w:rFonts w:ascii="Times New Roman" w:hAnsi="Times New Roman"/>
+              </w:rPr>
+            </w:pPr>
+            <w:r>
+              <w:t>Opcional para protótipo físico</w:t>
+            </w:r>
+            <w:r>
+              <w:t>, será o controlador do circuito.</w:t>
+            </w:r>
+          </w:p>
+        </w:tc>
+      </w:tr>
+      <w:tr>
+        <w:tc>
+          <w:tcPr>
+            <w:tcW w:w="4530" w:type="dxa"/>
+          </w:tcPr>
+          <w:p>
+            <w:pPr>
+              <w:ind w:firstLine="0"/>
+              <w:jc w:val="both"/>
+            </w:pPr>
+            <w:r>
+              <w:t>LEDs</w:t>
+            </w:r>
+          </w:p>
+        </w:tc>
+        <w:tc>
+          <w:tcPr>
+            <w:tcW w:w="4531" w:type="dxa"/>
+          </w:tcPr>
+          <w:p>
+            <w:pPr>
+              <w:spacing w:line="240" w:lineRule="auto"/>
+              <w:ind w:firstLine="0"/>
+              <w:jc w:val="both"/>
+              <w:rPr>
+                <w:rFonts w:ascii="Times New Roman" w:hAnsi="Times New Roman"/>
+              </w:rPr>
+            </w:pPr>
+            <w:r>
+              <w:t>Opcional</w:t>
+            </w:r>
+            <w:r>
+              <w:t>, representa os estados do semáforo.</w:t>
+            </w:r>
+          </w:p>
+        </w:tc>
+      </w:tr>
+      <w:tr>
+        <w:tc>
+          <w:tcPr>
+            <w:tcW w:w="4530" w:type="dxa"/>
+          </w:tcPr>
+          <w:p>
+            <w:pPr>
+              <w:ind w:firstLine="0"/>
+              <w:jc w:val="both"/>
+            </w:pPr>
+            <w:r>
+              <w:t>Resistores</w:t>
+            </w:r>
+          </w:p>
+        </w:tc>
+        <w:tc>
+          <w:tcPr>
+            <w:tcW w:w="4531" w:type="dxa"/>
+          </w:tcPr>
+          <w:p>
+            <w:pPr>
+              <w:spacing w:line="240" w:lineRule="auto"/>
+              <w:ind w:firstLine="0"/>
+              <w:jc w:val="both"/>
+              <w:rPr>
+                <w:rFonts w:ascii="Times New Roman" w:hAnsi="Times New Roman"/>
+              </w:rPr>
+            </w:pPr>
+            <w:r>
+              <w:t>Opcional</w:t>
+            </w:r>
+            <w:r>
+              <w:t>,</w:t>
+            </w:r>
+            <w:r>
+              <w:t xml:space="preserve"> para proteger os LEDs</w:t>
+            </w:r>
+            <w:r>
+              <w:t xml:space="preserve"> e impedir que eles sejam queimados.</w:t>
+            </w:r>
+          </w:p>
+        </w:tc>
+      </w:tr>
+      <w:tr>
+        <w:tc>
+          <w:tcPr>
+            <w:tcW w:w="4530" w:type="dxa"/>
+          </w:tcPr>
+          <w:p>
+            <w:pPr>
+              <w:ind w:firstLine="0"/>
+              <w:jc w:val="both"/>
+            </w:pPr>
+            <w:r>
+              <w:t>Protoboard e jumpers</w:t>
+            </w:r>
+          </w:p>
+        </w:tc>
+        <w:tc>
+          <w:tcPr>
+            <w:tcW w:w="4531" w:type="dxa"/>
+          </w:tcPr>
+          <w:p>
+            <w:pPr>
+              <w:spacing w:line="240" w:lineRule="auto"/>
+              <w:ind w:firstLine="0"/>
+              <w:jc w:val="both"/>
+              <w:rPr>
+                <w:rFonts w:ascii="Times New Roman" w:hAnsi="Times New Roman"/>
+              </w:rPr>
+            </w:pPr>
+            <w:r>
+              <w:t>Opcional</w:t>
+            </w:r>
+            <w:r>
+              <w:t>, placa e fios usados para conectar os componentes uns nos outros.</w:t>
+            </w:r>
+          </w:p>
+        </w:tc>
+      </w:tr>
+    </w:tbl>
+    <w:p>
+      <w:pPr>
+        <w:ind w:firstLine="0"/>
         <w:jc w:val="both"/>
       </w:pPr>
-      <w:r>
-        <w:t xml:space="preserve">Faça um paragrafo para descrever a lista de matérias, uso da tabela no notion obrigatório, faça as alterações que julgar necessário, </w:t>
-      </w:r>
-      <w:r>
-        <w:t>(lembre-se que o exemplo do notion pode estar superficial, a ideia é ajudar vocês a desenvolver a documentação, para finalizar, todo o texto é de forma discursiva e com suas palavras).</w:t>
-      </w:r>
     </w:p>
     <w:p>
       <w:pPr>
         <w:ind w:firstLine="0"/>
         <w:jc w:val="both"/>
-      </w:pPr>
-    </w:p>
-    <w:p>
-      <w:pPr>
-        <w:ind w:firstLine="0"/>
+        <w:rPr>
+          <w:b/>
+          <w:bCs/>
+        </w:rPr>
+      </w:pPr>
+      <w:r>
+        <w:rPr>
+          <w:b/>
+          <w:bCs/>
+        </w:rPr>
+        <w:t>4.LINGUAGEM DE PROGRAMAÇÃO</w:t>
+      </w:r>
+    </w:p>
+    <w:p>
+      <w:pPr>
         <w:jc w:val="both"/>
-        <w:rPr>
-          <w:b/>
-          <w:bCs/>
-        </w:rPr>
-      </w:pPr>
-      <w:r>
-        <w:rPr>
-          <w:b/>
-          <w:bCs/>
-        </w:rPr>
-        <w:t>4.LINGUAGEM DE PROGRAMAÇÃO</w:t>
+      </w:pPr>
+      <w:r>
+        <w:t xml:space="preserve">A linguagem de programação escolhida para o projeto SmartFlow foi a linguagem C, pois ela </w:t>
+      </w:r>
+      <w:r>
+        <w:t xml:space="preserve">é fundamental para quem </w:t>
+      </w:r>
+      <w:r>
+        <w:t>está aprendendo lógica de programação. Com ela</w:t>
+      </w:r>
+      <w:r>
+        <w:t>,</w:t>
+      </w:r>
+      <w:r>
+        <w:t xml:space="preserve"> é possível aplicar conceitos importantes como </w:t>
+      </w:r>
+      <w:r>
+        <w:t>variáveis, estruturas de repetição para o ciclo do sem</w:t>
+      </w:r>
+      <w:r>
+        <w:t xml:space="preserve">áforo ela se adapta corretamente. Além disso, por meio de pesquisas </w:t>
+      </w:r>
+      <w:r>
+        <w:t>sobre as tecnologias atuais, pude perceber que a linguagem C é a mais usada em sistemas de automaç</w:t>
+      </w:r>
+      <w:r>
+        <w:t xml:space="preserve">ão e dispositivos de IoT, porque ela </w:t>
+      </w:r>
+      <w:r>
+        <w:t>é muito “leve” e rápida</w:t>
+      </w:r>
+      <w:r>
+        <w:t xml:space="preserve"> já que consegue conversar diretamente com o hardware (</w:t>
+      </w:r>
+      <w:r>
+        <w:t xml:space="preserve">como o </w:t>
+      </w:r>
+      <w:r>
+        <w:t>Arduino)</w:t>
+      </w:r>
+      <w:r>
+        <w:t xml:space="preserve">. Por fim, o uso da linguagem C é uma excelente opção pois ela garante que o semáforo funcione </w:t>
+      </w:r>
+      <w:r>
+        <w:t>sem delay</w:t>
+      </w:r>
+      <w:r>
+        <w:t>s</w:t>
+      </w:r>
+      <w:r>
+        <w:t>, o que é fundamental para a segurança no tráfego.</w:t>
       </w:r>
     </w:p>
     <w:p>
       <w:pPr>
         <w:jc w:val="both"/>
       </w:pPr>
-      <w:r>
-        <w:t xml:space="preserve">Justifique o uso da linguagem de programação utilizada no projeto, pode se pesquisar na web seguindo o padrão de usar algum artigo e </w:t>
-      </w:r>
-      <w:r>
-        <w:t>IA, comparar</w:t>
-      </w:r>
-      <w:r>
-        <w:t xml:space="preserve"> e fazer com suas palavras. </w:t>
-      </w:r>
-      <w:r>
-        <w:t>(lembre-se que o exemplo do notion pode estar superficial, a ideia é ajudar vocês a desenvolver a documentação, para finalizar, todo o texto é de forma discursiva e com suas palavras).</w:t>
-      </w:r>
     </w:p>
     <w:p>
       <w:pPr>
         <w:ind w:firstLine="0"/>
         <w:jc w:val="both"/>
-      </w:pPr>
-    </w:p>
-    <w:p>
-      <w:pPr>
-        <w:ind w:firstLine="0"/>
+        <w:rPr>
+          <w:b/>
+          <w:bCs/>
+        </w:rPr>
+      </w:pPr>
+      <w:r>
+        <w:rPr>
+          <w:b/>
+          <w:bCs/>
+        </w:rPr>
+        <w:t>5.SISTEMA OPERACIONAL</w:t>
+      </w:r>
+    </w:p>
+    <w:p>
+      <w:pPr>
         <w:jc w:val="both"/>
-        <w:rPr>
-          <w:b/>
-          <w:bCs/>
-        </w:rPr>
-      </w:pPr>
-      <w:r>
-        <w:rPr>
-          <w:b/>
-          <w:bCs/>
-        </w:rPr>
-        <w:t>5.SISTEMA OPERACIONAL</w:t>
-      </w:r>
-    </w:p>
-    <w:p>
-      <w:pPr>
+      </w:pPr>
+      <w:r>
+        <w:t>O sistema opera</w:t>
+      </w:r>
+      <w:r>
+        <w:t xml:space="preserve">cional escolhido para o desenvolvimento do projeto SmartFlow </w:t>
+      </w:r>
+      <w:r>
+        <w:t>é o Windows 11. A escolha foi baseada em critérios técnicos de compatibilidade e estabilidade</w:t>
+      </w:r>
+      <w:r>
+        <w:t xml:space="preserve">. O Windows 11 funciona muito bem com todos os programas que eu vou usar para desenvolver o projeto, </w:t>
+      </w:r>
+      <w:r>
+        <w:t>como o VS Code e o compilador C, e não precisará de instalações muito complicadas.</w:t>
+      </w:r>
+      <w:r>
+        <w:t xml:space="preserve"> Além de ser um sistema operacional </w:t>
+      </w:r>
+      <w:r>
+        <w:t>com o qual</w:t>
+      </w:r>
+      <w:r>
+        <w:t xml:space="preserve"> já estou familiarizada e fácil de mexer</w:t>
+      </w:r>
+      <w:r>
+        <w:t xml:space="preserve">, o Windows 11 é estável </w:t>
+      </w:r>
+      <w:r>
+        <w:t xml:space="preserve">e </w:t>
+      </w:r>
+      <w:r>
+        <w:t>por isso, há</w:t>
+      </w:r>
+      <w:r>
+        <w:t xml:space="preserve"> pequenas chances de que devido a ele</w:t>
+      </w:r>
+      <w:r>
+        <w:t xml:space="preserve"> a programação seja afetada ou o computador trave.</w:t>
+      </w:r>
+      <w:r>
+        <w:t xml:space="preserve"> Ele também já está instalado nos computadores que usamos em aula</w:t>
+      </w:r>
+      <w:r>
+        <w:t xml:space="preserve"> no SENAI, </w:t>
+      </w:r>
+      <w:r>
+        <w:t xml:space="preserve">facilitando o uso pois não precisarei fazer outras instalações. Por fim, é importante considerar que ele é um sistema operacional moderno, e possibilita várias atualizações </w:t>
+      </w:r>
+      <w:r>
+        <w:t>que contribuem para a segurança e eficiência no trabalho.</w:t>
+      </w:r>
+    </w:p>
+    <w:p>
+      <w:pPr>
+        <w:ind w:firstLine="0"/>
         <w:jc w:val="both"/>
       </w:pPr>
-      <w:r>
-        <w:t xml:space="preserve">Justifique o uso </w:t>
-      </w:r>
-      <w:r>
-        <w:t>do sistema operacional</w:t>
-      </w:r>
-      <w:r>
-        <w:t xml:space="preserve"> utilizad</w:t>
-      </w:r>
-      <w:r>
-        <w:t>o</w:t>
-      </w:r>
-      <w:r>
-        <w:t xml:space="preserve"> no projeto</w:t>
-      </w:r>
-      <w:r>
-        <w:t xml:space="preserve"> (pode pesquisar o fato dele ser mais utilizado no mundo e usar isso como argumento)</w:t>
-      </w:r>
-      <w:r>
-        <w:t>, pode se pesquisar na web seguindo o padrão de usar algum artigo e IA, comparar e fazer com suas palavras. (lembre-se que o exemplo do notion pode estar superficial, a ideia é ajudar vocês a desenvolver a documentação, para finalizar, todo o texto é de forma discursiva e com suas palavras).</w:t>
-      </w:r>
     </w:p>
     <w:p>
       <w:pPr>
         <w:ind w:firstLine="0"/>
         <w:jc w:val="both"/>
-      </w:pPr>
-    </w:p>
-    <w:p>
-      <w:pPr>
-        <w:ind w:firstLine="0"/>
+        <w:rPr>
+          <w:b/>
+          <w:bCs/>
+        </w:rPr>
+      </w:pPr>
+      <w:r>
+        <w:rPr>
+          <w:b/>
+          <w:bCs/>
+        </w:rPr>
+        <w:t>6.CRONOGRAMA DO PROJETO</w:t>
+      </w:r>
+    </w:p>
+    <w:p>
+      <w:pPr>
         <w:jc w:val="both"/>
       </w:pPr>
+      <w:r>
+        <w:t xml:space="preserve">O cronograma a seguir foi inspirado na divisão por semanas </w:t>
+      </w:r>
+      <w:r>
+        <w:t xml:space="preserve">mencionadas no </w:t>
+      </w:r>
+      <w:proofErr w:type="spellStart"/>
+      <w:r>
+        <w:t>Notion</w:t>
+      </w:r>
+      <w:proofErr w:type="spellEnd"/>
+      <w:r>
+        <w:t>.</w:t>
+      </w:r>
+      <w:r>
+        <w:t xml:space="preserve"> </w:t>
+      </w:r>
+      <w:r>
+        <w:t>P</w:t>
+      </w:r>
+      <w:r>
+        <w:t>or meio de</w:t>
+      </w:r>
+      <w:r>
+        <w:t>ssa divisão</w:t>
+      </w:r>
+      <w:r>
+        <w:t>,</w:t>
+      </w:r>
+      <w:r>
+        <w:t xml:space="preserve"> </w:t>
+      </w:r>
+      <w:r>
+        <w:t xml:space="preserve">podemos organizar as etapas do projeto e garantir que tudo seja entregue no prazo. </w:t>
+      </w:r>
+      <w:r>
+        <w:t>O objetivo de utilizá-lo no projeto SmartFlow é divi</w:t>
+      </w:r>
+      <w:r>
+        <w:t>di</w:t>
+      </w:r>
+      <w:r>
+        <w:t xml:space="preserve">r o trabalho </w:t>
+      </w:r>
+      <w:r>
+        <w:t xml:space="preserve">desde o </w:t>
+      </w:r>
+      <w:r>
+        <w:t xml:space="preserve">estudo do problema até a entrega do </w:t>
+      </w:r>
+      <w:proofErr w:type="gramStart"/>
+      <w:r>
+        <w:t>produto final</w:t>
+      </w:r>
+      <w:proofErr w:type="gramEnd"/>
+      <w:r>
+        <w:t>, isso ajuda a evitar atrasos e permite que o processo de criação seja mais organizado e</w:t>
+      </w:r>
+      <w:r>
+        <w:t>,</w:t>
+      </w:r>
+      <w:r>
+        <w:t xml:space="preserve"> consequentemente</w:t>
+      </w:r>
+      <w:r>
+        <w:t>,</w:t>
+      </w:r>
+      <w:r>
+        <w:t xml:space="preserve"> </w:t>
+      </w:r>
+      <w:r>
+        <w:t xml:space="preserve">otimizado, pois assim dificilmente partes importantes </w:t>
+      </w:r>
+      <w:r>
+        <w:t xml:space="preserve">serão </w:t>
+      </w:r>
+      <w:r>
+        <w:lastRenderedPageBreak/>
+        <w:t>esquecidas.</w:t>
+      </w:r>
+      <w:r>
+        <w:t xml:space="preserve"> Além da divisão das etapas </w:t>
+      </w:r>
+      <w:r>
+        <w:t>para o desenvolvimento do software foram sugeridas etapas opcionais que p</w:t>
+      </w:r>
+      <w:r>
+        <w:t>ara a criação do protótipo físico.</w:t>
+      </w:r>
     </w:p>
     <w:p>
       <w:pPr>
         <w:ind w:firstLine="0"/>
         <w:jc w:val="both"/>
-        <w:rPr>
-          <w:b/>
-          <w:bCs/>
-        </w:rPr>
-      </w:pPr>
-      <w:r>
-        <w:rPr>
-          <w:b/>
-          <w:bCs/>
-        </w:rPr>
+      </w:pPr>
+    </w:p>
+    <w:tbl>
+      <w:tblPr>
+        <w:tblStyle w:val="Tabelacomgrade"/>
+        <w:tblW w:w="0" w:type="auto"/>
+        <w:tblLook w:val="04A0" w:firstRow="1" w:lastRow="0" w:firstColumn="1" w:lastColumn="0" w:noHBand="0" w:noVBand="1"/>
+      </w:tblPr>
+      <w:tblGrid>
+        <w:gridCol w:w="4530"/>
+        <w:gridCol w:w="4531"/>
+      </w:tblGrid>
+      <w:tr>
+        <w:tc>
+          <w:tcPr>
+            <w:tcW w:w="4530" w:type="dxa"/>
+          </w:tcPr>
+          <w:p>
+            <w:pPr>
+              <w:ind w:firstLine="0"/>
+              <w:jc w:val="both"/>
+            </w:pPr>
+            <w:r>
+              <w:t>Semana</w:t>
+            </w:r>
+          </w:p>
+        </w:tc>
+        <w:tc>
+          <w:tcPr>
+            <w:tcW w:w="4531" w:type="dxa"/>
+          </w:tcPr>
+          <w:p>
+            <w:pPr>
+              <w:ind w:firstLine="0"/>
+              <w:jc w:val="both"/>
+            </w:pPr>
+            <w:r>
+              <w:t>Atividade Prevista</w:t>
+            </w:r>
+          </w:p>
+        </w:tc>
+      </w:tr>
+      <w:tr>
+        <w:tc>
+          <w:tcPr>
+            <w:tcW w:w="4530" w:type="dxa"/>
+          </w:tcPr>
+          <w:p>
+            <w:pPr>
+              <w:ind w:firstLine="0"/>
+              <w:jc w:val="both"/>
+            </w:pPr>
+            <w:r>
+              <w:t>Semana 1</w:t>
+            </w:r>
+          </w:p>
+        </w:tc>
+        <w:tc>
+          <w:tcPr>
+            <w:tcW w:w="4531" w:type="dxa"/>
+          </w:tcPr>
+          <w:p>
+            <w:pPr>
+              <w:ind w:firstLine="0"/>
+              <w:jc w:val="both"/>
+            </w:pPr>
+            <w:r>
+              <w:t>Estudo do problema e planejamento inicial</w:t>
+            </w:r>
+            <w:r>
+              <w:t>.</w:t>
+            </w:r>
+          </w:p>
+        </w:tc>
+      </w:tr>
+      <w:tr>
+        <w:tc>
+          <w:tcPr>
+            <w:tcW w:w="4530" w:type="dxa"/>
+          </w:tcPr>
+          <w:p>
+            <w:pPr>
+              <w:ind w:firstLine="0"/>
+              <w:jc w:val="both"/>
+            </w:pPr>
+            <w:r>
+              <w:t>Semana 2</w:t>
+            </w:r>
+          </w:p>
+        </w:tc>
+        <w:tc>
+          <w:tcPr>
+            <w:tcW w:w="4531" w:type="dxa"/>
+          </w:tcPr>
+          <w:p>
+            <w:pPr>
+              <w:ind w:firstLine="0"/>
+              <w:jc w:val="both"/>
+            </w:pPr>
+            <w:r>
+              <w:t>Escrita da documentação e definição dos requisi</w:t>
+            </w:r>
+            <w:r>
+              <w:t>tos</w:t>
+            </w:r>
+            <w:r>
+              <w:t>.</w:t>
+            </w:r>
+          </w:p>
+        </w:tc>
+      </w:tr>
+      <w:tr>
+        <w:tc>
+          <w:tcPr>
+            <w:tcW w:w="4530" w:type="dxa"/>
+          </w:tcPr>
+          <w:p>
+            <w:pPr>
+              <w:ind w:firstLine="0"/>
+              <w:jc w:val="both"/>
+            </w:pPr>
+            <w:r>
+              <w:t>Semana 3</w:t>
+            </w:r>
+          </w:p>
+        </w:tc>
+        <w:tc>
+          <w:tcPr>
+            <w:tcW w:w="4531" w:type="dxa"/>
+          </w:tcPr>
+          <w:p>
+            <w:pPr>
+              <w:ind w:firstLine="0"/>
+              <w:jc w:val="both"/>
+            </w:pPr>
+            <w:r>
+              <w:t>Escolha dos materiais</w:t>
+            </w:r>
+            <w:r>
+              <w:t xml:space="preserve">, </w:t>
+            </w:r>
+            <w:r>
+              <w:t>da linguagem de programação</w:t>
+            </w:r>
+            <w:r>
+              <w:t xml:space="preserve"> e definição do sistema operacional.</w:t>
+            </w:r>
+          </w:p>
+        </w:tc>
+      </w:tr>
+      <w:tr>
+        <w:tc>
+          <w:tcPr>
+            <w:tcW w:w="4530" w:type="dxa"/>
+          </w:tcPr>
+          <w:p>
+            <w:pPr>
+              <w:ind w:firstLine="0"/>
+              <w:jc w:val="both"/>
+            </w:pPr>
+            <w:r>
+              <w:t>Semana 4</w:t>
+            </w:r>
+          </w:p>
+        </w:tc>
+        <w:tc>
+          <w:tcPr>
+            <w:tcW w:w="4531" w:type="dxa"/>
+          </w:tcPr>
+          <w:p>
+            <w:pPr>
+              <w:ind w:firstLine="0"/>
+              <w:jc w:val="both"/>
+            </w:pPr>
+            <w:r>
+              <w:t xml:space="preserve">Criação </w:t>
+            </w:r>
+            <w:r>
+              <w:t>do repositório no GitHub e organização da estrutura em p</w:t>
+            </w:r>
+            <w:r>
+              <w:t>astas.</w:t>
+            </w:r>
+          </w:p>
+        </w:tc>
+      </w:tr>
+      <w:tr>
+        <w:tc>
+          <w:tcPr>
+            <w:tcW w:w="4530" w:type="dxa"/>
+          </w:tcPr>
+          <w:p>
+            <w:pPr>
+              <w:ind w:firstLine="0"/>
+              <w:jc w:val="both"/>
+            </w:pPr>
+            <w:r>
+              <w:t>Semana 5</w:t>
+            </w:r>
+          </w:p>
+        </w:tc>
+        <w:tc>
+          <w:tcPr>
+            <w:tcW w:w="4531" w:type="dxa"/>
+          </w:tcPr>
+          <w:p>
+            <w:pPr>
+              <w:ind w:firstLine="0"/>
+              <w:jc w:val="both"/>
+            </w:pPr>
+            <w:r>
+              <w:t xml:space="preserve">Desenvolvimento da lógica </w:t>
+            </w:r>
+            <w:r>
+              <w:t>de como o sistema funcionará</w:t>
+            </w:r>
+            <w:r>
+              <w:t xml:space="preserve"> em fluxogramas.</w:t>
+            </w:r>
+            <w:r>
+              <w:t xml:space="preserve"> E simulação do circuito no Tinkercad (opcional).</w:t>
+            </w:r>
+          </w:p>
+        </w:tc>
+      </w:tr>
+      <w:tr>
+        <w:tc>
+          <w:tcPr>
+            <w:tcW w:w="4530" w:type="dxa"/>
+          </w:tcPr>
+          <w:p>
+            <w:pPr>
+              <w:ind w:firstLine="0"/>
+              <w:jc w:val="both"/>
+            </w:pPr>
+            <w:r>
+              <w:t>Semana 6</w:t>
+            </w:r>
+          </w:p>
+        </w:tc>
+        <w:tc>
+          <w:tcPr>
+            <w:tcW w:w="4531" w:type="dxa"/>
+          </w:tcPr>
+          <w:p>
+            <w:pPr>
+              <w:ind w:firstLine="0"/>
+              <w:jc w:val="both"/>
+            </w:pPr>
+            <w:r>
+              <w:t xml:space="preserve">Escrita do código-fonte </w:t>
+            </w:r>
+            <w:r>
+              <w:t>na</w:t>
+            </w:r>
+            <w:r>
+              <w:t xml:space="preserve"> linguagem </w:t>
+            </w:r>
+            <w:r>
+              <w:t>de programação escolhida</w:t>
+            </w:r>
+            <w:r>
+              <w:t xml:space="preserve"> no VS Code.</w:t>
+            </w:r>
+            <w:r>
+              <w:t xml:space="preserve"> E montagem do protótipo físico </w:t>
+            </w:r>
+            <w:r>
+              <w:t>com Arduino (opcional).</w:t>
+            </w:r>
+          </w:p>
+        </w:tc>
+      </w:tr>
+      <w:tr>
+        <w:tc>
+          <w:tcPr>
+            <w:tcW w:w="4530" w:type="dxa"/>
+          </w:tcPr>
+          <w:p>
+            <w:pPr>
+              <w:ind w:firstLine="0"/>
+              <w:jc w:val="both"/>
+            </w:pPr>
+            <w:r>
+              <w:t>Semana 7</w:t>
+            </w:r>
+          </w:p>
+        </w:tc>
+        <w:tc>
+          <w:tcPr>
+            <w:tcW w:w="4531" w:type="dxa"/>
+          </w:tcPr>
+          <w:p>
+            <w:pPr>
+              <w:ind w:firstLine="0"/>
+              <w:jc w:val="both"/>
+            </w:pPr>
+            <w:r>
+              <w:t xml:space="preserve">Testes </w:t>
+            </w:r>
+            <w:r>
+              <w:t xml:space="preserve">no computador e protótipo físico (opcional) para verificar o </w:t>
+            </w:r>
+            <w:r>
+              <w:t>funcionamento.</w:t>
+            </w:r>
+          </w:p>
+        </w:tc>
+      </w:tr>
+      <w:tr>
+        <w:tc>
+          <w:tcPr>
+            <w:tcW w:w="4530" w:type="dxa"/>
+          </w:tcPr>
+          <w:p>
+            <w:pPr>
+              <w:ind w:firstLine="0"/>
+              <w:jc w:val="both"/>
+            </w:pPr>
+            <w:r>
+              <w:t>Semana 8</w:t>
+            </w:r>
+          </w:p>
+        </w:tc>
+        <w:tc>
+          <w:tcPr>
+            <w:tcW w:w="4531" w:type="dxa"/>
+          </w:tcPr>
+          <w:p>
+            <w:pPr>
+              <w:ind w:firstLine="0"/>
+              <w:jc w:val="both"/>
+            </w:pPr>
+            <w:r>
+              <w:t>Correção de erros, revisão final e entrega do projeto.</w:t>
+            </w:r>
+          </w:p>
+        </w:tc>
+      </w:tr>
+    </w:tbl>
+    <w:p>
+      <w:pPr>
+        <w:ind w:firstLine="0"/>
+        <w:jc w:val="both"/>
+      </w:pPr>
+    </w:p>
+    <w:p>
+      <w:pPr>
+        <w:ind w:firstLine="0"/>
+        <w:jc w:val="both"/>
+        <w:rPr>
+          <w:b/>
+          <w:bCs/>
+        </w:rPr>
+      </w:pPr>
+      <w:r>
+        <w:rPr>
+          <w:b/>
+          <w:bCs/>
+        </w:rPr>
+        <w:t>7.REPOSITÓRIO GITHUB</w:t>
+      </w:r>
+    </w:p>
+    <w:p>
+      <w:pPr>
+        <w:jc w:val="both"/>
+      </w:pPr>
+      <w:r>
+        <w:t xml:space="preserve">O </w:t>
+      </w:r>
+      <w:proofErr w:type="spellStart"/>
+      <w:r>
+        <w:t>Git</w:t>
+      </w:r>
+      <w:proofErr w:type="spellEnd"/>
+      <w:r>
+        <w:t xml:space="preserve"> é uma ferramenta utilizada para o controle de versão</w:t>
+      </w:r>
+      <w:r>
+        <w:t>, ele permite salvar cada alteração feita na programação do semáforo.</w:t>
+      </w:r>
+      <w:r>
+        <w:t xml:space="preserve"> Já o GitHub é uma plataforma </w:t>
+      </w:r>
+      <w:r>
+        <w:t>que permite que esses arquivos sejam salvos na nuvem com segurança</w:t>
+      </w:r>
+      <w:r>
+        <w:t xml:space="preserve">. </w:t>
+      </w:r>
+      <w:r>
+        <w:t xml:space="preserve">Seu uso </w:t>
+      </w:r>
+      <w:r>
+        <w:t>no projeto SmartFlow é importante pois</w:t>
+      </w:r>
+      <w:r>
+        <w:t xml:space="preserve"> mantém as informações centralizadas em um único lugar, além permit</w:t>
+      </w:r>
+      <w:r>
+        <w:t>ir</w:t>
+      </w:r>
+      <w:r>
+        <w:t xml:space="preserve"> que várias pessoas possam trabalhar </w:t>
+      </w:r>
+      <w:r>
+        <w:t>no mesmo código d</w:t>
+      </w:r>
+      <w:r>
+        <w:t xml:space="preserve">e </w:t>
+      </w:r>
+      <w:r>
         <w:lastRenderedPageBreak/>
-        <w:t>6.CRONOGRAMA DO PROJETO</w:t>
-      </w:r>
-    </w:p>
-    <w:p>
-      <w:pPr>
+        <w:t xml:space="preserve">forma eficiente. </w:t>
+      </w:r>
+      <w:r>
+        <w:t>O</w:t>
+      </w:r>
+      <w:r>
+        <w:t xml:space="preserve"> </w:t>
+      </w:r>
+      <w:r>
+        <w:t xml:space="preserve">controle de versão evita que os integrantes da equipe façam a mesma parte do projeto de formas diferentes ou que um </w:t>
+      </w:r>
+      <w:r>
+        <w:t xml:space="preserve">arquivo seja apagado </w:t>
+      </w:r>
+      <w:r>
+        <w:t xml:space="preserve">acidentalmente </w:t>
+      </w:r>
+      <w:r>
+        <w:t xml:space="preserve">por outras pessoas. Assim, todos conseguirão </w:t>
+      </w:r>
+      <w:r>
+        <w:t>acompanhar</w:t>
+      </w:r>
+      <w:r>
+        <w:t xml:space="preserve"> o que está sendo desenvolvido, por meio da atualização </w:t>
+      </w:r>
+      <w:r>
+        <w:t xml:space="preserve">constante </w:t>
+      </w:r>
+      <w:r>
+        <w:t>do código na nuvem.</w:t>
+      </w:r>
+      <w:r>
+        <w:t xml:space="preserve"> </w:t>
+      </w:r>
+      <w:r>
+        <w:t>A</w:t>
+      </w:r>
+      <w:r>
+        <w:t xml:space="preserve"> estrutura sugerida pode ser analisada a seguir:</w:t>
+      </w:r>
+    </w:p>
+    <w:p>
+      <w:pPr>
+        <w:ind w:firstLine="0"/>
         <w:jc w:val="both"/>
       </w:pPr>
-      <w:r>
-        <w:t xml:space="preserve">Descreva o objetivo de um cronograma no projeto e justifique seu uso, utilizar a tabela do notion. </w:t>
-      </w:r>
-      <w:r>
-        <w:t>(lembre-se que o exemplo do notion pode estar superficial, a ideia é ajudar vocês a desenvolver a documentação, para finalizar, todo o texto é de forma discursiva e com suas palavras).</w:t>
-      </w:r>
     </w:p>
     <w:p>
       <w:pPr>
         <w:ind w:firstLine="0"/>
         <w:jc w:val="both"/>
       </w:pPr>
+      <w:r>
+        <w:t>semaforo-inteligente/</w:t>
+      </w:r>
     </w:p>
     <w:p>
       <w:pPr>
         <w:ind w:firstLine="0"/>
         <w:jc w:val="both"/>
-        <w:rPr>
-          <w:b/>
-          <w:bCs/>
-        </w:rPr>
-      </w:pPr>
-      <w:r>
-        <w:rPr>
-          <w:b/>
-          <w:bCs/>
-        </w:rPr>
-        <w:t>7.REPOSITÓRIO GITHUB</w:t>
-      </w:r>
-    </w:p>
-    <w:p>
-      <w:pPr>
+      </w:pPr>
+      <w:r>
+        <w:t>│</w:t>
+      </w:r>
+    </w:p>
+    <w:p>
+      <w:pPr>
+        <w:ind w:firstLine="0"/>
         <w:jc w:val="both"/>
       </w:pPr>
       <w:r>
-        <w:t>Descreva o que é o git e  github, sua importância para o projeto (uma delas é o arquivo do código fonte centralizado e sempre com a versão atual), encontre uma forma de reproduzir a estrutura do projeto (imagem?) e coloque a estrutura do README.md (imagem ou tópicos)</w:t>
-      </w:r>
-      <w:r>
-        <w:t>.</w:t>
+        <w:t>├── README.md</w:t>
       </w:r>
     </w:p>
     <w:p>
@@ -1903,11 +3914,121 @@
         <w:ind w:firstLine="0"/>
         <w:jc w:val="both"/>
       </w:pPr>
+      <w:r>
+        <w:t>├── main.c</w:t>
+      </w:r>
     </w:p>
     <w:p>
       <w:pPr>
         <w:ind w:firstLine="0"/>
         <w:jc w:val="both"/>
+      </w:pPr>
+      <w:r>
+        <w:t>└── Docs/</w:t>
+      </w:r>
+    </w:p>
+    <w:p>
+      <w:pPr>
+        <w:ind w:firstLine="0"/>
+        <w:jc w:val="both"/>
+      </w:pPr>
+      <w:r>
+        <w:t xml:space="preserve">    └── Documentacao-Isabella-Batista.docx</w:t>
+      </w:r>
+    </w:p>
+    <w:p>
+      <w:pPr>
+        <w:ind w:firstLine="0"/>
+        <w:jc w:val="both"/>
+      </w:pPr>
+    </w:p>
+    <w:p>
+      <w:pPr>
+        <w:keepNext/>
+        <w:ind w:firstLine="0"/>
+        <w:jc w:val="center"/>
+      </w:pPr>
+      <w:r>
+        <w:rPr>
+          <w:noProof/>
+        </w:rPr>
+        <w:drawing>
+          <wp:inline distT="0" distB="0" distL="0" distR="0" wp14:anchorId="2BB634D4" wp14:editId="08157A77">
+            <wp:extent cx="3296110" cy="2029108"/>
+            <wp:effectExtent l="0" t="0" r="0" b="9525"/>
+            <wp:docPr id="1618782551" name="Imagem 1"/>
+            <wp:cNvGraphicFramePr>
+              <a:graphicFrameLocks xmlns:a="http://schemas.openxmlformats.org/drawingml/2006/main" noChangeAspect="1"/>
+            </wp:cNvGraphicFramePr>
+            <a:graphic xmlns:a="http://schemas.openxmlformats.org/drawingml/2006/main">
+              <a:graphicData uri="http://schemas.openxmlformats.org/drawingml/2006/picture">
+                <pic:pic xmlns:pic="http://schemas.openxmlformats.org/drawingml/2006/picture">
+                  <pic:nvPicPr>
+                    <pic:cNvPr id="1618782551" name=""/>
+                    <pic:cNvPicPr/>
+                  </pic:nvPicPr>
+                  <pic:blipFill>
+                    <a:blip r:embed="rId5"/>
+                    <a:stretch>
+                      <a:fillRect/>
+                    </a:stretch>
+                  </pic:blipFill>
+                  <pic:spPr>
+                    <a:xfrm>
+                      <a:off x="0" y="0"/>
+                      <a:ext cx="3296110" cy="2029108"/>
+                    </a:xfrm>
+                    <a:prstGeom prst="rect">
+                      <a:avLst/>
+                    </a:prstGeom>
+                  </pic:spPr>
+                </pic:pic>
+              </a:graphicData>
+            </a:graphic>
+          </wp:inline>
+        </w:drawing>
+      </w:r>
+    </w:p>
+    <w:p>
+      <w:pPr>
+        <w:pStyle w:val="Legenda"/>
+        <w:ind w:firstLine="0"/>
+        <w:jc w:val="center"/>
+      </w:pPr>
+      <w:r>
+        <w:t xml:space="preserve">Figura </w:t>
+      </w:r>
+      <w:r>
+        <w:fldChar w:fldCharType="begin"/>
+      </w:r>
+      <w:r>
+        <w:instrText xml:space="preserve"> SEQ Figura \* ARABIC </w:instrText>
+      </w:r>
+      <w:r>
+        <w:fldChar w:fldCharType="separate"/>
+      </w:r>
+      <w:r>
+        <w:rPr>
+          <w:noProof/>
+        </w:rPr>
+        <w:t>1</w:t>
+      </w:r>
+      <w:r>
+        <w:fldChar w:fldCharType="end"/>
+      </w:r>
+      <w:r>
+        <w:t>- Print que evidencia a estrutura no VS Code</w:t>
+      </w:r>
+    </w:p>
+    <w:p>
+      <w:pPr>
+        <w:ind w:firstLine="0"/>
+      </w:pPr>
+    </w:p>
+    <w:p>
+      <w:pPr>
+        <w:ind w:firstLine="0"/>
+        <w:jc w:val="both"/>
         <w:rPr>
           <w:b/>
           <w:bCs/>
@@ -1925,49 +4046,155 @@
       <w:pPr>
         <w:ind w:firstLine="0"/>
         <w:jc w:val="both"/>
-      </w:pPr>
-      <w:r>
-        <w:t xml:space="preserve">(apague o que está entre parênteses quando colocar no github, todo livro ou link utilizado colocar nas referências, é em ordem alfabética, os dois itens abaixo são documentos apresentados a vocês, plano de ensino do semestre e o guia) </w:t>
-      </w:r>
+        <w:rPr>
+          <w:b/>
+          <w:bCs/>
+        </w:rPr>
+      </w:pPr>
     </w:p>
     <w:p>
       <w:pPr>
         <w:ind w:firstLine="0"/>
         <w:jc w:val="both"/>
       </w:pPr>
+      <w:r>
+        <w:t xml:space="preserve">ATLASSIAN. </w:t>
+      </w:r>
+      <w:r>
+        <w:rPr>
+          <w:b/>
+          <w:bCs/>
+        </w:rPr>
+        <w:t>Como criar cronogramas de projetos</w:t>
+      </w:r>
+      <w:r>
+        <w:t>: etapas e técnicas. Disponível em:</w:t>
+      </w:r>
+      <w:hyperlink r:id="rId6" w:history="1">
+        <w:r>
+          <w:rPr>
+            <w:rStyle w:val="Hyperlink"/>
+          </w:rPr>
+          <w:t>https://www.atlassian.com/br/agile/project-management/project-schedule</w:t>
+        </w:r>
+      </w:hyperlink>
+      <w:r>
+        <w:t>. Acesso em: 12 mai. 2026.</w:t>
+      </w:r>
     </w:p>
     <w:p>
       <w:pPr>
         <w:ind w:firstLine="0"/>
         <w:jc w:val="both"/>
       </w:pPr>
-      <w:r>
-        <w:t>SERVIÇO NACIONAL DE APRENDIZAGEM INDUSTRIAL.</w:t>
+    </w:p>
+    <w:p>
+      <w:pPr>
+        <w:ind w:firstLine="0"/>
+        <w:jc w:val="both"/>
+      </w:pPr>
+      <w:r>
+        <w:t xml:space="preserve">DIO. </w:t>
+      </w:r>
+      <w:r>
+        <w:rPr>
+          <w:b/>
+          <w:bCs/>
+        </w:rPr>
+        <w:t>Melhores linguagens para IoT e suas vantagens e desvantagens</w:t>
+      </w:r>
+      <w:r>
+        <w:t>. Disponível em</w:t>
+      </w:r>
+      <w:r>
+        <w:t>:</w:t>
+      </w:r>
+      <w:hyperlink r:id="rId7" w:history="1">
+        <w:r>
+          <w:rPr>
+            <w:rStyle w:val="Hyperlink"/>
+          </w:rPr>
+          <w:t>https://www.dio.me/articles/melhores-linguagens-para-iot-e-suas-vantagens-e-desvantagens</w:t>
+        </w:r>
+      </w:hyperlink>
+      <w:r>
+        <w:t>. Acesso em: 12 mai. 2026.</w:t>
+      </w:r>
+    </w:p>
+    <w:p>
+      <w:pPr>
+        <w:ind w:firstLine="0"/>
+        <w:jc w:val="both"/>
+      </w:pPr>
+    </w:p>
+    <w:p>
+      <w:pPr>
+        <w:ind w:firstLine="0"/>
+        <w:jc w:val="both"/>
+      </w:pPr>
+      <w:r>
+        <w:lastRenderedPageBreak/>
+        <w:t xml:space="preserve">DOUGLAS FERNANDES. </w:t>
+      </w:r>
+      <w:r>
+        <w:rPr>
+          <w:b/>
+          <w:bCs/>
+        </w:rPr>
+        <w:t>Instalações e configurações para programar em C usando o VS Code</w:t>
+      </w:r>
+      <w:r>
+        <w:t>. Disponível em:</w:t>
+      </w:r>
+      <w:hyperlink r:id="rId8" w:history="1">
+        <w:r>
+          <w:rPr>
+            <w:rStyle w:val="Hyperlink"/>
+          </w:rPr>
+          <w:t>https://www.doug.dev.br/2022/Instalacoes-e-configuracoes-para-programar-em-C-usando-o-VS-Code/</w:t>
+        </w:r>
+      </w:hyperlink>
+      <w:r>
+        <w:t>. Acesso em: 12 mai. 2026.</w:t>
+      </w:r>
+    </w:p>
+    <w:p>
+      <w:pPr>
+        <w:ind w:firstLine="0"/>
+        <w:jc w:val="both"/>
+      </w:pPr>
+    </w:p>
+    <w:p>
+      <w:pPr>
+        <w:ind w:firstLine="0"/>
+        <w:jc w:val="both"/>
+      </w:pPr>
+      <w:r>
+        <w:t xml:space="preserve">EUAX. </w:t>
+      </w:r>
+      <w:r>
+        <w:rPr>
+          <w:b/>
+          <w:bCs/>
+        </w:rPr>
+        <w:t>Gerenciamento de Cronograma</w:t>
+      </w:r>
+      <w:r>
+        <w:t>: o que é, importância e como fazer. Disponível em:</w:t>
       </w:r>
       <w:r>
         <w:t xml:space="preserve"> </w:t>
       </w:r>
-      <w:r>
-        <w:rPr>
-          <w:b/>
-          <w:bCs/>
-        </w:rPr>
-        <w:t>Plano de Ensino — Módulo Básico: Técnico em Desenvolvimento de Sistemas</w:t>
-      </w:r>
-      <w:r>
-        <w:t xml:space="preserve">. </w:t>
-      </w:r>
-      <w:r>
-        <w:t>Sertãozinho</w:t>
-      </w:r>
-      <w:r>
-        <w:t>: SENAI-SP, 202</w:t>
-      </w:r>
-      <w:r>
-        <w:t>6</w:t>
-      </w:r>
-      <w:r>
-        <w:t>.</w:t>
+      <w:hyperlink r:id="rId9" w:history="1">
+        <w:r>
+          <w:rPr>
+            <w:rStyle w:val="Hyperlink"/>
+          </w:rPr>
+          <w:t>https://euax.com.br/2019/02/gerenciamento-de-cronograma/</w:t>
+        </w:r>
+      </w:hyperlink>
+      <w:r>
+        <w:t>. Acesso em: 12 mai. 2026.</w:t>
       </w:r>
     </w:p>
     <w:p>
@@ -1982,6 +4209,81 @@
         <w:jc w:val="both"/>
       </w:pPr>
       <w:r>
+        <w:t xml:space="preserve">FM2S. </w:t>
+      </w:r>
+      <w:r>
+        <w:rPr>
+          <w:b/>
+          <w:bCs/>
+        </w:rPr>
+        <w:t>O que é GitHub?</w:t>
+      </w:r>
+      <w:r>
+        <w:t xml:space="preserve"> Funcionalidades, benefícios e como usar. Disponível em:</w:t>
+      </w:r>
+      <w:r>
+        <w:t xml:space="preserve"> </w:t>
+      </w:r>
+      <w:hyperlink r:id="rId10" w:history="1">
+        <w:r>
+          <w:rPr>
+            <w:rStyle w:val="Hyperlink"/>
+          </w:rPr>
+          <w:t>https://www.fm2s.com.br/blog/o-que-e-github</w:t>
+        </w:r>
+      </w:hyperlink>
+      <w:r>
+        <w:t>. Acesso em: 12 mai. 2026.</w:t>
+      </w:r>
+    </w:p>
+    <w:p>
+      <w:pPr>
+        <w:ind w:firstLine="0"/>
+        <w:jc w:val="both"/>
+      </w:pPr>
+    </w:p>
+    <w:p>
+      <w:pPr>
+        <w:ind w:firstLine="0"/>
+        <w:jc w:val="both"/>
+      </w:pPr>
+      <w:r>
+        <w:t xml:space="preserve">GOOGLE. </w:t>
+      </w:r>
+      <w:r>
+        <w:rPr>
+          <w:b/>
+          <w:bCs/>
+        </w:rPr>
+        <w:t>Gemini</w:t>
+      </w:r>
+      <w:r>
+        <w:t xml:space="preserve">: inteligência artificial conversacional. Disponível em: </w:t>
+      </w:r>
+      <w:hyperlink r:id="rId11" w:tgtFrame="_blank" w:history="1">
+        <w:r>
+          <w:rPr>
+            <w:rStyle w:val="Hyperlink"/>
+          </w:rPr>
+          <w:t>https://gemini.google.com/</w:t>
+        </w:r>
+      </w:hyperlink>
+      <w:r>
+        <w:t>. Acesso em: 12 mai. 2026.</w:t>
+      </w:r>
+    </w:p>
+    <w:p>
+      <w:pPr>
+        <w:ind w:firstLine="0"/>
+        <w:jc w:val="both"/>
+      </w:pPr>
+    </w:p>
+    <w:p>
+      <w:pPr>
+        <w:ind w:firstLine="0"/>
+        <w:jc w:val="both"/>
+      </w:pPr>
+      <w:r>
         <w:t xml:space="preserve">SERVIÇO NACIONAL DE APRENDIZAGEM INDUSTRIAL. </w:t>
       </w:r>
       <w:r>
@@ -1989,10 +4291,10 @@
           <w:b/>
           <w:bCs/>
         </w:rPr>
-        <w:t>Trabalho de conclusão de curso: Guia rápido para apresentação.</w:t>
-      </w:r>
-      <w:r>
-        <w:t xml:space="preserve"> Sertãozinho: SENAI-SP, 2026.</w:t>
+        <w:t>Plano de Ensino — Módulo Básico</w:t>
+      </w:r>
+      <w:r>
+        <w:t>: Técnico em Desenvolvimento de Sistemas. Sertãozinho: SENAI-SP, 2026.</w:t>
       </w:r>
     </w:p>
     <w:p>
@@ -2006,35 +4308,23 @@
         <w:ind w:firstLine="0"/>
         <w:jc w:val="both"/>
       </w:pPr>
-    </w:p>
-    <w:p>
-      <w:pPr>
-        <w:jc w:val="both"/>
-      </w:pPr>
-    </w:p>
-    <w:p>
-      <w:pPr>
-        <w:ind w:firstLine="0"/>
-        <w:jc w:val="both"/>
-      </w:pPr>
-    </w:p>
-    <w:p>
-      <w:pPr>
-        <w:jc w:val="both"/>
-      </w:pPr>
-    </w:p>
-    <w:p>
-      <w:pPr>
-        <w:jc w:val="both"/>
-      </w:pPr>
-    </w:p>
-    <w:p>
-      <w:pPr>
-        <w:jc w:val="both"/>
-      </w:pPr>
-    </w:p>
-    <w:p>
-      <w:pPr>
+      <w:r>
+        <w:t xml:space="preserve">SERVIÇO NACIONAL DE APRENDIZAGEM INDUSTRIAL. </w:t>
+      </w:r>
+      <w:r>
+        <w:rPr>
+          <w:b/>
+          <w:bCs/>
+        </w:rPr>
+        <w:t>Trabalho de conclusão de curso</w:t>
+      </w:r>
+      <w:r>
+        <w:t>: Guia rápido para apresentação. Sertãozinho: SENAI-SP, 2026.</w:t>
+      </w:r>
+    </w:p>
+    <w:p>
+      <w:pPr>
+        <w:ind w:firstLine="0"/>
         <w:jc w:val="both"/>
       </w:pPr>
     </w:p>
@@ -3483,6 +5773,78 @@
       <w:contextualSpacing/>
     </w:pPr>
   </w:style>
+  <w:style w:type="table" w:styleId="Tabelacomgrade">
+    <w:name w:val="Table Grid"/>
+    <w:basedOn w:val="Tabelanormal"/>
+    <w:uiPriority w:val="39"/>
+    <w:rsid w:val="006602B9"/>
+    <w:pPr>
+      <w:spacing w:after="0" w:line="240" w:lineRule="auto"/>
+    </w:pPr>
+    <w:tblPr>
+      <w:tblBorders>
+        <w:top w:val="single" w:sz="4" w:space="0" w:color="auto"/>
+        <w:left w:val="single" w:sz="4" w:space="0" w:color="auto"/>
+        <w:bottom w:val="single" w:sz="4" w:space="0" w:color="auto"/>
+        <w:right w:val="single" w:sz="4" w:space="0" w:color="auto"/>
+        <w:insideH w:val="single" w:sz="4" w:space="0" w:color="auto"/>
+        <w:insideV w:val="single" w:sz="4" w:space="0" w:color="auto"/>
+      </w:tblBorders>
+    </w:tblPr>
+  </w:style>
+  <w:style w:type="character" w:styleId="Forte">
+    <w:name w:val="Strong"/>
+    <w:basedOn w:val="Fontepargpadro"/>
+    <w:uiPriority w:val="22"/>
+    <w:qFormat/>
+    <w:rsid w:val="006602B9"/>
+    <w:rPr>
+      <w:b/>
+      <w:bCs/>
+    </w:rPr>
+  </w:style>
+  <w:style w:type="paragraph" w:styleId="Legenda">
+    <w:name w:val="caption"/>
+    <w:basedOn w:val="Normal"/>
+    <w:next w:val="Normal"/>
+    <w:uiPriority w:val="35"/>
+    <w:unhideWhenUsed/>
+    <w:qFormat/>
+    <w:rsid w:val="00D830A9"/>
+    <w:pPr>
+      <w:spacing w:after="200" w:line="240" w:lineRule="auto"/>
+    </w:pPr>
+    <w:rPr>
+      <w:i/>
+      <w:iCs/>
+      <w:color w:val="44546A" w:themeColor="text2"/>
+      <w:sz w:val="18"/>
+      <w:szCs w:val="18"/>
+    </w:rPr>
+  </w:style>
+  <w:style w:type="character" w:styleId="Hyperlink">
+    <w:name w:val="Hyperlink"/>
+    <w:basedOn w:val="Fontepargpadro"/>
+    <w:uiPriority w:val="99"/>
+    <w:unhideWhenUsed/>
+    <w:rsid w:val="001877E7"/>
+    <w:rPr>
+      <w:color w:val="0563C1" w:themeColor="hyperlink"/>
+      <w:u w:val="single"/>
+    </w:rPr>
+  </w:style>
+  <w:style w:type="character" w:styleId="MenoPendente">
+    <w:name w:val="Unresolved Mention"/>
+    <w:basedOn w:val="Fontepargpadro"/>
+    <w:uiPriority w:val="99"/>
+    <w:semiHidden/>
+    <w:unhideWhenUsed/>
+    <w:rsid w:val="001877E7"/>
+    <w:rPr>
+      <w:color w:val="605E5C"/>
+      <w:shd w:val="clear" w:color="auto" w:fill="E1DFDD"/>
+    </w:rPr>
+  </w:style>
 </w:styles>
 </file>
 

</xml_diff>

<commit_message>
Versão final Sprints 1, 2, 3 e 4
</commit_message>
<xml_diff>
--- a/Docs/Documentacao-Isabella-Batista.docx
+++ b/Docs/Documentacao-Isabella-Batista.docx
@@ -1564,6 +1564,11 @@
     </w:p>
     <w:p>
       <w:pPr>
+        <w:jc w:val="both"/>
+      </w:pPr>
+    </w:p>
+    <w:p>
+      <w:pPr>
         <w:pStyle w:val="PargrafodaLista"/>
         <w:numPr>
           <w:ilvl w:val="1"/>
@@ -1588,11 +1593,11 @@
         <w:jc w:val="both"/>
       </w:pPr>
       <w:r>
-        <w:t xml:space="preserve">Referente ao funcionamento do Smart Flow, inicialmente ao mesmo tempo que a via principal é liberada e apresenta a cor verde, a via secundária é retida e mostra cor vermelho. Após o tempo estipulado, ocorre a transição de cor para amarelo na via principal, enquanto a via secundária permanece mostrando vermelho, ambos em um </w:t>
+        <w:t xml:space="preserve">Referente ao funcionamento do Smart Flow, inicialmente ao mesmo tempo que a via principal é liberada e apresenta a cor verde, a via secundária é retida e mostra cor vermelho. Após o tempo estipulado, ocorre a transição de cor para amarelo na via </w:t>
       </w:r>
       <w:r>
         <w:lastRenderedPageBreak/>
-        <w:t xml:space="preserve">pequeno espaço de tempo, pois essa transição representa apenas um intervalo de segurança para garantir que não haverá dois sinais verdes </w:t>
+        <w:t xml:space="preserve">principal, enquanto a via secundária permanece mostrando vermelho, ambos em um pequeno espaço de tempo, pois essa transição representa apenas um intervalo de segurança para garantir que não haverá dois sinais verdes </w:t>
       </w:r>
       <w:r>
         <w:t>ao mesmo tempo</w:t>
@@ -2093,58 +2098,91 @@
       <w:pPr>
         <w:ind w:firstLine="0"/>
         <w:jc w:val="both"/>
-      </w:pPr>
-    </w:p>
-    <w:p>
-      <w:pPr>
-        <w:ind w:firstLine="0"/>
-        <w:jc w:val="both"/>
-      </w:pPr>
-    </w:p>
-    <w:p>
-      <w:pPr>
-        <w:ind w:firstLine="0"/>
-        <w:jc w:val="both"/>
-        <w:rPr>
-          <w:b/>
-          <w:bCs/>
-        </w:rPr>
-      </w:pPr>
-      <w:r>
-        <w:rPr>
-          <w:b/>
-          <w:bCs/>
-        </w:rPr>
-        <w:t>2.</w:t>
-      </w:r>
-      <w:r>
-        <w:rPr>
-          <w:b/>
-          <w:bCs/>
-        </w:rPr>
-        <w:t>REQUISITOS DO SISTEMA</w:t>
-      </w:r>
-    </w:p>
-    <w:p>
-      <w:pPr>
-        <w:jc w:val="both"/>
-      </w:pPr>
-      <w:r>
-        <w:t xml:space="preserve">Os requisitos do sistema </w:t>
-      </w:r>
-      <w:r>
-        <w:t>ou de software são as especificações das funções e características que precisam ser atendidas em um sistema para que ele atenda às necessidades e expectativas do projeto. Eles são</w:t>
-      </w:r>
-      <w:r>
-        <w:t xml:space="preserve"> as funcionalidades ou restrições que o projeto deverá atender para que ele seja bem-sucedido.</w:t>
-      </w:r>
+        <w:rPr>
+          <w:b/>
+          <w:bCs/>
+        </w:rPr>
+      </w:pPr>
+    </w:p>
+    <w:p>
+      <w:pPr>
+        <w:ind w:firstLine="0"/>
+        <w:jc w:val="both"/>
+        <w:rPr>
+          <w:b/>
+          <w:bCs/>
+        </w:rPr>
+      </w:pPr>
+      <w:r>
+        <w:rPr>
+          <w:b/>
+          <w:bCs/>
+        </w:rPr>
+        <w:t>1.3.1 Sequência mínima esperada</w:t>
+      </w:r>
+    </w:p>
+    <w:p>
+      <w:pPr>
+        <w:ind w:firstLine="0"/>
+        <w:jc w:val="both"/>
+        <w:rPr>
+          <w:b/>
+          <w:bCs/>
+        </w:rPr>
+      </w:pPr>
+      <w:r>
+        <w:rPr>
+          <w:b/>
+          <w:bCs/>
+        </w:rPr>
+        <w:t xml:space="preserve">    1.3.2 Tabela de funcionamento</w:t>
+      </w:r>
+    </w:p>
+    <w:p>
+      <w:pPr>
+        <w:ind w:firstLine="0"/>
+        <w:jc w:val="both"/>
+        <w:rPr>
+          <w:b/>
+          <w:bCs/>
+        </w:rPr>
+      </w:pPr>
+      <w:r>
+        <w:rPr>
+          <w:b/>
+          <w:bCs/>
+        </w:rPr>
+        <w:t>1.4 Linguagem de programação</w:t>
+      </w:r>
+    </w:p>
+    <w:p>
+      <w:pPr>
+        <w:jc w:val="both"/>
+      </w:pPr>
+      <w:r>
+        <w:t xml:space="preserve">A linguagem de programação escolhida para o projeto SmartFlow foi a linguagem C, pois ela é fundamental para quem está aprendendo lógica de programação. Com ela, é possível aplicar conceitos importantes como variáveis, </w:t>
+      </w:r>
+      <w:r>
+        <w:lastRenderedPageBreak/>
+        <w:t>estruturas de repetição para o ciclo do semáforo ela se adapta corretamente. Além disso, por meio de pesquisas sobre as tecnologias atuais, pude perceber que a linguagem C é a mais usada em sistemas de automação e dispositivos de IoT, porque ela é muito “leve” e rápida já que consegue conversar diretamente com o hardware (como o Arduino). Por fim, o uso da linguagem C é uma excelente opção pois ela garante que o semáforo funcione sem delays, o que é fundamental para a segurança no tráfego.</w:t>
+      </w:r>
+    </w:p>
+    <w:p>
+      <w:pPr>
+        <w:ind w:firstLine="0"/>
+        <w:jc w:val="both"/>
+        <w:rPr>
+          <w:b/>
+          <w:bCs/>
+        </w:rPr>
+      </w:pPr>
     </w:p>
     <w:p>
       <w:pPr>
         <w:pStyle w:val="PargrafodaLista"/>
         <w:numPr>
           <w:ilvl w:val="1"/>
-          <w:numId w:val="9"/>
+          <w:numId w:val="7"/>
         </w:numPr>
         <w:jc w:val="both"/>
         <w:rPr>
@@ -2157,31 +2195,47 @@
           <w:b/>
           <w:bCs/>
         </w:rPr>
-        <w:t xml:space="preserve">Requisitos </w:t>
-      </w:r>
-      <w:r>
-        <w:rPr>
-          <w:b/>
-          <w:bCs/>
-        </w:rPr>
-        <w:t>f</w:t>
-      </w:r>
-      <w:r>
-        <w:rPr>
-          <w:b/>
-          <w:bCs/>
-        </w:rPr>
-        <w:t>uncionais</w:t>
-      </w:r>
-    </w:p>
-    <w:p>
-      <w:pPr>
-        <w:jc w:val="both"/>
-      </w:pPr>
-      <w:r>
-        <w:lastRenderedPageBreak/>
-        <w:t>Os requisitos funcionais são definidos pelas ações que o sistema deve executar e que estão relacionadas diretamente ao funcionamento do projeto, e ao seu comportamento.</w:t>
-      </w:r>
+        <w:t>Sistema operacional</w:t>
+      </w:r>
+    </w:p>
+    <w:p>
+      <w:pPr>
+        <w:jc w:val="both"/>
+      </w:pPr>
+      <w:r>
+        <w:t>O sistema operacional escolhido para o desenvolvimento do projeto SmartFlow é o Windows 11. A escolha foi baseada em critérios técnicos de compatibilidade e estabilidade. O Windows 11 funciona muito bem com todos os programas que eu vou usar para desenvolver o projeto, como o VS Code e o compilador C, e não precisará de instalações muito complicadas. Além de ser um sistema operacional com o qual já estou familiarizada e fácil de mexer, o Windows 11 é estável e por isso, há pequenas chances de que devido a ele a programação seja afetada ou o computador trave. Ele também já está instalado nos computadores que usamos em aula no SENAI, facilitando o uso pois não precisarei fazer outras instalações. Por fim, é importante considerar que ele é um sistema operacional moderno, e possibilita várias atualizações que contribuem para a segurança e eficiência no trabalho.</w:t>
+      </w:r>
+    </w:p>
+    <w:p>
+      <w:pPr>
+        <w:ind w:firstLine="0"/>
+        <w:jc w:val="both"/>
+        <w:rPr>
+          <w:b/>
+          <w:bCs/>
+        </w:rPr>
+      </w:pPr>
+      <w:r>
+        <w:rPr>
+          <w:b/>
+          <w:bCs/>
+        </w:rPr>
+        <w:t xml:space="preserve">  1.6 Cronograma </w:t>
+      </w:r>
+    </w:p>
+    <w:p>
+      <w:pPr>
+        <w:jc w:val="both"/>
+      </w:pPr>
+      <w:r>
+        <w:t>O cronograma a seguir foi inspirado na divisão por semanas mencionadas no Notion. Por meio dessa divisão, podemos organizar as etapas do projeto e garantir que tudo seja entregue no prazo. O objetivo de utilizá-lo no projeto SmartFlow é dividir o trabalho desde o estudo do problema até a entrega do produto final, isso ajuda a evitar atrasos e permite que o processo de criação seja mais organizado e, consequentemente, otimizado, pois assim dificilmente partes importantes serão esquecidas. Além da divisão das etapas para o desenvolvimento do software foram sugeridas etapas opcionais que para a criação do protótipo físico.</w:t>
+      </w:r>
+    </w:p>
+    <w:p>
+      <w:pPr>
+        <w:ind w:firstLine="0"/>
+        <w:jc w:val="both"/>
+      </w:pPr>
     </w:p>
     <w:tbl>
       <w:tblPr>
@@ -2204,10 +2258,7 @@
               <w:jc w:val="both"/>
             </w:pPr>
             <w:r>
-              <w:t>Numeração dos r</w:t>
-            </w:r>
-            <w:r>
-              <w:t>equisitos funcionais</w:t>
+              <w:t>Semana</w:t>
             </w:r>
           </w:p>
         </w:tc>
@@ -2221,7 +2272,7 @@
               <w:jc w:val="both"/>
             </w:pPr>
             <w:r>
-              <w:t>Descrição</w:t>
+              <w:t>Atividade Prevista</w:t>
             </w:r>
           </w:p>
         </w:tc>
@@ -2237,7 +2288,7 @@
               <w:jc w:val="both"/>
             </w:pPr>
             <w:r>
-              <w:t>RF001</w:t>
+              <w:t>Semana 1</w:t>
             </w:r>
           </w:p>
         </w:tc>
@@ -2251,7 +2302,7 @@
               <w:jc w:val="both"/>
             </w:pPr>
             <w:r>
-              <w:t>O sistema da via principal deve levar um tempo maior para alternar o sinal verde do que na segunda via.</w:t>
+              <w:t>Estudo do problema e planejamento inicial.</w:t>
             </w:r>
           </w:p>
         </w:tc>
@@ -2267,7 +2318,8 @@
               <w:jc w:val="both"/>
             </w:pPr>
             <w:r>
-              <w:t>RF002</w:t>
+              <w:lastRenderedPageBreak/>
+              <w:t>Semana 2</w:t>
             </w:r>
           </w:p>
         </w:tc>
@@ -2281,7 +2333,7 @@
               <w:jc w:val="both"/>
             </w:pPr>
             <w:r>
-              <w:t>O sistema deve mostrar o sinal amarelo para indicar a transição entre vermelho e verde.</w:t>
+              <w:t>Escrita da documentação e definição dos requisitos.</w:t>
             </w:r>
           </w:p>
         </w:tc>
@@ -2297,7 +2349,7 @@
               <w:jc w:val="both"/>
             </w:pPr>
             <w:r>
-              <w:t>RF003</w:t>
+              <w:t>Semana 3</w:t>
             </w:r>
           </w:p>
         </w:tc>
@@ -2311,7 +2363,7 @@
               <w:jc w:val="both"/>
             </w:pPr>
             <w:r>
-              <w:t>O funcionamento do sistema deve ser contínuo e automático.</w:t>
+              <w:t>Escolha dos materiais, da linguagem de programação e definição do sistema operacional.</w:t>
             </w:r>
           </w:p>
         </w:tc>
@@ -2327,7 +2379,7 @@
               <w:jc w:val="both"/>
             </w:pPr>
             <w:r>
-              <w:t>RF004</w:t>
+              <w:t>Semana 4</w:t>
             </w:r>
           </w:p>
         </w:tc>
@@ -2341,7 +2393,7 @@
               <w:jc w:val="both"/>
             </w:pPr>
             <w:r>
-              <w:t>O sistema deve exibir visualmente o estado de cada semáforo visualmente através de cores no “terminal de saída”.</w:t>
+              <w:t>Criação do repositório no GitHub e organização da estrutura em pastas.</w:t>
             </w:r>
           </w:p>
         </w:tc>
@@ -2357,7 +2409,7 @@
               <w:jc w:val="both"/>
             </w:pPr>
             <w:r>
-              <w:t>RF005</w:t>
+              <w:t>Semana 5</w:t>
             </w:r>
           </w:p>
         </w:tc>
@@ -2371,7 +2423,7 @@
               <w:jc w:val="both"/>
             </w:pPr>
             <w:r>
-              <w:t>O sistema deve possuir uma lógica que impeça a sinalização de dois sinais verdes ao mesmo tempo.</w:t>
+              <w:t>Desenvolvimento da lógica de como o sistema funcionará em fluxogramas. E simulação do circuito no Tinkercad (opcional).</w:t>
             </w:r>
           </w:p>
         </w:tc>
@@ -2387,7 +2439,7 @@
               <w:jc w:val="both"/>
             </w:pPr>
             <w:r>
-              <w:t>RF006</w:t>
+              <w:t>Semana 6</w:t>
             </w:r>
           </w:p>
         </w:tc>
@@ -2401,7 +2453,67 @@
               <w:jc w:val="both"/>
             </w:pPr>
             <w:r>
-              <w:t>O sistema deve garantir que em ambas as vias o sinal vermelho seja acionado depois do sinal amarelo.</w:t>
+              <w:t>Escrita do código-fonte na linguagem de programação escolhida no VS Code. E montagem do protótipo físico com Arduino (opcional).</w:t>
+            </w:r>
+          </w:p>
+        </w:tc>
+      </w:tr>
+      <w:tr>
+        <w:tc>
+          <w:tcPr>
+            <w:tcW w:w="4530" w:type="dxa"/>
+          </w:tcPr>
+          <w:p>
+            <w:pPr>
+              <w:ind w:firstLine="0"/>
+              <w:jc w:val="both"/>
+            </w:pPr>
+            <w:r>
+              <w:t>Semana 7</w:t>
+            </w:r>
+          </w:p>
+        </w:tc>
+        <w:tc>
+          <w:tcPr>
+            <w:tcW w:w="4531" w:type="dxa"/>
+          </w:tcPr>
+          <w:p>
+            <w:pPr>
+              <w:ind w:firstLine="0"/>
+              <w:jc w:val="both"/>
+            </w:pPr>
+            <w:r>
+              <w:t>Testes no computador e protótipo físico (opcional) para verificar o funcionamento.</w:t>
+            </w:r>
+          </w:p>
+        </w:tc>
+      </w:tr>
+      <w:tr>
+        <w:tc>
+          <w:tcPr>
+            <w:tcW w:w="4530" w:type="dxa"/>
+          </w:tcPr>
+          <w:p>
+            <w:pPr>
+              <w:ind w:firstLine="0"/>
+              <w:jc w:val="both"/>
+            </w:pPr>
+            <w:r>
+              <w:t>Semana 8</w:t>
+            </w:r>
+          </w:p>
+        </w:tc>
+        <w:tc>
+          <w:tcPr>
+            <w:tcW w:w="4531" w:type="dxa"/>
+          </w:tcPr>
+          <w:p>
+            <w:pPr>
+              <w:ind w:firstLine="0"/>
+              <w:jc w:val="both"/>
+            </w:pPr>
+            <w:r>
+              <w:t>Correção de erros, revisão final e entrega do projeto.</w:t>
             </w:r>
           </w:p>
         </w:tc>
@@ -2412,6 +2524,44 @@
         <w:ind w:firstLine="0"/>
         <w:jc w:val="both"/>
       </w:pPr>
+    </w:p>
+    <w:p>
+      <w:pPr>
+        <w:ind w:firstLine="0"/>
+        <w:jc w:val="both"/>
+        <w:rPr>
+          <w:b/>
+          <w:bCs/>
+        </w:rPr>
+      </w:pPr>
+      <w:r>
+        <w:rPr>
+          <w:b/>
+          <w:bCs/>
+        </w:rPr>
+        <w:t>2.</w:t>
+      </w:r>
+      <w:r>
+        <w:rPr>
+          <w:b/>
+          <w:bCs/>
+        </w:rPr>
+        <w:t>REQUISITOS DO SISTEMA</w:t>
+      </w:r>
+    </w:p>
+    <w:p>
+      <w:pPr>
+        <w:jc w:val="both"/>
+      </w:pPr>
+      <w:r>
+        <w:t xml:space="preserve">Os requisitos do sistema </w:t>
+      </w:r>
+      <w:r>
+        <w:t>ou de software são as especificações das funções e características que precisam ser atendidas em um sistema para que ele atenda às necessidades e expectativas do projeto. Eles são</w:t>
+      </w:r>
+      <w:r>
+        <w:t xml:space="preserve"> as funcionalidades ou restrições que o projeto deverá atender para que ele seja bem-sucedido.</w:t>
+      </w:r>
     </w:p>
     <w:p>
       <w:pPr>
@@ -2438,18 +2588,22 @@
           <w:b/>
           <w:bCs/>
         </w:rPr>
-        <w:t>não funcionais</w:t>
-      </w:r>
-    </w:p>
-    <w:p>
-      <w:pPr>
-        <w:jc w:val="both"/>
-      </w:pPr>
-      <w:r>
-        <w:t xml:space="preserve">Os requisitos não funcionais </w:t>
-      </w:r>
-      <w:r>
-        <w:t>são caracterizados por descrever as qualidades que o sistema deve ter, também está relacionado ao desempenho, linguagem utilizada, design entre outros. Diferente dos requisitos funcionais, os requisitos não funcionais não estão relacionados a ações essenciais que o sistema deve apresentar para funcionar.</w:t>
+        <w:t>f</w:t>
+      </w:r>
+      <w:r>
+        <w:rPr>
+          <w:b/>
+          <w:bCs/>
+        </w:rPr>
+        <w:t>uncionais</w:t>
+      </w:r>
+    </w:p>
+    <w:p>
+      <w:pPr>
+        <w:jc w:val="both"/>
+      </w:pPr>
+      <w:r>
+        <w:t>Os requisitos funcionais são definidos pelas ações que o sistema deve executar e que estão relacionadas diretamente ao funcionamento do projeto, e ao seu comportamento.</w:t>
       </w:r>
     </w:p>
     <w:tbl>
@@ -2473,7 +2627,10 @@
               <w:jc w:val="both"/>
             </w:pPr>
             <w:r>
-              <w:t>Numeração dos requisitos não funcionais</w:t>
+              <w:t>Numeração dos r</w:t>
+            </w:r>
+            <w:r>
+              <w:t>equisitos funcionais</w:t>
             </w:r>
           </w:p>
         </w:tc>
@@ -2503,7 +2660,8 @@
               <w:jc w:val="both"/>
             </w:pPr>
             <w:r>
-              <w:t>RNF001</w:t>
+              <w:lastRenderedPageBreak/>
+              <w:t>RF001</w:t>
             </w:r>
           </w:p>
         </w:tc>
@@ -2517,7 +2675,7 @@
               <w:jc w:val="both"/>
             </w:pPr>
             <w:r>
-              <w:t>O software deve ser desenvolvido na linguagem C.</w:t>
+              <w:t>O sistema da via principal deve levar um tempo maior para alternar o sinal verde do que na segunda via.</w:t>
             </w:r>
           </w:p>
         </w:tc>
@@ -2533,8 +2691,7 @@
               <w:jc w:val="both"/>
             </w:pPr>
             <w:r>
-              <w:lastRenderedPageBreak/>
-              <w:t>RNF002</w:t>
+              <w:t>RF002</w:t>
             </w:r>
           </w:p>
         </w:tc>
@@ -2548,13 +2705,7 @@
               <w:jc w:val="both"/>
             </w:pPr>
             <w:r>
-              <w:t xml:space="preserve">O tempo de resposta entre as trocas de cores deve ser menor que </w:t>
-            </w:r>
-            <w:r>
-              <w:t>1</w:t>
-            </w:r>
-            <w:r>
-              <w:t xml:space="preserve"> segundo.</w:t>
+              <w:t>O sistema deve mostrar o sinal amarelo para indicar a transição entre vermelho e verde.</w:t>
             </w:r>
           </w:p>
         </w:tc>
@@ -2570,7 +2721,7 @@
               <w:jc w:val="both"/>
             </w:pPr>
             <w:r>
-              <w:t>RNF003</w:t>
+              <w:t>RF003</w:t>
             </w:r>
           </w:p>
         </w:tc>
@@ -2584,7 +2735,7 @@
               <w:jc w:val="both"/>
             </w:pPr>
             <w:r>
-              <w:t>O código deve estar bem dividido, organizado e fácil de ler.</w:t>
+              <w:t>O funcionamento do sistema deve ser contínuo e automático.</w:t>
             </w:r>
           </w:p>
         </w:tc>
@@ -2600,7 +2751,7 @@
               <w:jc w:val="both"/>
             </w:pPr>
             <w:r>
-              <w:t>RNF004</w:t>
+              <w:t>RF004</w:t>
             </w:r>
           </w:p>
         </w:tc>
@@ -2614,7 +2765,7 @@
               <w:jc w:val="both"/>
             </w:pPr>
             <w:r>
-              <w:t>As variáveis no código devem possuir nomes autoexplicativos. Exemplo, “tempoVerde”.</w:t>
+              <w:t>O sistema deve exibir visualmente o estado de cada semáforo visualmente através de cores no “terminal de saída”.</w:t>
             </w:r>
           </w:p>
         </w:tc>
@@ -2630,7 +2781,7 @@
               <w:jc w:val="both"/>
             </w:pPr>
             <w:r>
-              <w:t>RNF005</w:t>
+              <w:t>RF005</w:t>
             </w:r>
           </w:p>
         </w:tc>
@@ -2644,7 +2795,7 @@
               <w:jc w:val="both"/>
             </w:pPr>
             <w:r>
-              <w:t>O programa não poderá “travar” ou fechar sozinho durante a execução.</w:t>
+              <w:t>O sistema deve possuir uma lógica que impeça a sinalização de dois sinais verdes ao mesmo tempo.</w:t>
             </w:r>
           </w:p>
         </w:tc>
@@ -2660,7 +2811,7 @@
               <w:jc w:val="both"/>
             </w:pPr>
             <w:r>
-              <w:t>RNF006</w:t>
+              <w:t>RF006</w:t>
             </w:r>
           </w:p>
         </w:tc>
@@ -2674,7 +2825,7 @@
               <w:jc w:val="both"/>
             </w:pPr>
             <w:r>
-              <w:t>As cores que representam os estados do semáforo devem seguir o padrão universal sendo vermelho, amarelo e verde.</w:t>
+              <w:t>O sistema deve garantir que em ambas as vias o sinal vermelho seja acionado depois do sinal amarelo.</w:t>
             </w:r>
           </w:p>
         </w:tc>
@@ -2688,41 +2839,41 @@
     </w:p>
     <w:p>
       <w:pPr>
-        <w:ind w:firstLine="0"/>
-        <w:jc w:val="both"/>
-        <w:rPr>
-          <w:b/>
-          <w:bCs/>
-        </w:rPr>
-      </w:pPr>
-      <w:r>
-        <w:rPr>
-          <w:b/>
-          <w:bCs/>
-        </w:rPr>
-        <w:t>3.LISTA DE MAT</w:t>
-      </w:r>
-      <w:r>
-        <w:rPr>
-          <w:b/>
-          <w:bCs/>
-        </w:rPr>
-        <w:t>E</w:t>
-      </w:r>
-      <w:r>
-        <w:rPr>
-          <w:b/>
-          <w:bCs/>
-        </w:rPr>
-        <w:t>RIAIS E EQUIPAMENTOS</w:t>
-      </w:r>
-    </w:p>
-    <w:p>
-      <w:pPr>
-        <w:jc w:val="both"/>
-      </w:pPr>
-      <w:r>
-        <w:t>Para realizar este projeto, a seguir foram selecionados alguns materiais para o desenvolvimento do software, que são essenciais, e outros opcionais para o desenvolvimento do protótipo físico (hardware).</w:t>
+        <w:pStyle w:val="PargrafodaLista"/>
+        <w:numPr>
+          <w:ilvl w:val="1"/>
+          <w:numId w:val="9"/>
+        </w:numPr>
+        <w:jc w:val="both"/>
+        <w:rPr>
+          <w:b/>
+          <w:bCs/>
+        </w:rPr>
+      </w:pPr>
+      <w:r>
+        <w:rPr>
+          <w:b/>
+          <w:bCs/>
+        </w:rPr>
+        <w:t xml:space="preserve">Requisitos </w:t>
+      </w:r>
+      <w:r>
+        <w:rPr>
+          <w:b/>
+          <w:bCs/>
+        </w:rPr>
+        <w:t>não funcionais</w:t>
+      </w:r>
+    </w:p>
+    <w:p>
+      <w:pPr>
+        <w:jc w:val="both"/>
+      </w:pPr>
+      <w:r>
+        <w:t xml:space="preserve">Os requisitos não funcionais </w:t>
+      </w:r>
+      <w:r>
+        <w:t>são caracterizados por descrever as qualidades que o sistema deve ter, também está relacionado ao desempenho, linguagem utilizada, design entre outros. Diferente dos requisitos funcionais, os requisitos não funcionais não estão relacionados a ações essenciais que o sistema deve apresentar para funcionar.</w:t>
       </w:r>
     </w:p>
     <w:tbl>
@@ -2746,7 +2897,7 @@
               <w:jc w:val="both"/>
             </w:pPr>
             <w:r>
-              <w:t>Item</w:t>
+              <w:t>Numeração dos requisitos não funcionais</w:t>
             </w:r>
           </w:p>
         </w:tc>
@@ -2760,7 +2911,7 @@
               <w:jc w:val="both"/>
             </w:pPr>
             <w:r>
-              <w:t>Finalidade</w:t>
+              <w:t>Descrição</w:t>
             </w:r>
           </w:p>
         </w:tc>
@@ -2776,7 +2927,7 @@
               <w:jc w:val="both"/>
             </w:pPr>
             <w:r>
-              <w:t>Computador ou notebook</w:t>
+              <w:t>RNF001</w:t>
             </w:r>
           </w:p>
         </w:tc>
@@ -2790,13 +2941,7 @@
               <w:jc w:val="both"/>
             </w:pPr>
             <w:r>
-              <w:t xml:space="preserve">Equipamento </w:t>
-            </w:r>
-            <w:r>
-              <w:t>usado para escrever o programa e testar se ele funciona</w:t>
-            </w:r>
-            <w:r>
-              <w:t>.</w:t>
+              <w:t>O software deve ser desenvolvido na linguagem C.</w:t>
             </w:r>
           </w:p>
         </w:tc>
@@ -2812,13 +2957,7 @@
               <w:jc w:val="both"/>
             </w:pPr>
             <w:r>
-              <w:t>V</w:t>
-            </w:r>
-            <w:r>
-              <w:t>S</w:t>
-            </w:r>
-            <w:r>
-              <w:t xml:space="preserve"> Code</w:t>
+              <w:t>RNF002</w:t>
             </w:r>
           </w:p>
         </w:tc>
@@ -2832,18 +2971,18 @@
               <w:jc w:val="both"/>
             </w:pPr>
             <w:r>
-              <w:t>Programa usado para digitar o código</w:t>
-            </w:r>
-            <w:r>
-              <w:t>.</w:t>
+              <w:t xml:space="preserve">O tempo de resposta entre as trocas de cores deve ser menor que </w:t>
+            </w:r>
+            <w:r>
+              <w:t>1</w:t>
+            </w:r>
+            <w:r>
+              <w:t xml:space="preserve"> segundo.</w:t>
             </w:r>
           </w:p>
         </w:tc>
       </w:tr>
       <w:tr>
-        <w:trPr>
-          <w:trHeight w:val="70"/>
-        </w:trPr>
         <w:tc>
           <w:tcPr>
             <w:tcW w:w="4530" w:type="dxa"/>
@@ -2853,11 +2992,9 @@
               <w:ind w:firstLine="0"/>
               <w:jc w:val="both"/>
             </w:pPr>
-            <w:proofErr w:type="spellStart"/>
-            <w:r>
-              <w:t>Git</w:t>
-            </w:r>
-            <w:proofErr w:type="spellEnd"/>
+            <w:r>
+              <w:t>RNF003</w:t>
+            </w:r>
           </w:p>
         </w:tc>
         <w:tc>
@@ -2870,7 +3007,7 @@
               <w:jc w:val="both"/>
             </w:pPr>
             <w:r>
-              <w:t>Controle das versões do projeto.</w:t>
+              <w:t>O código deve estar bem dividido, organizado e fácil de ler.</w:t>
             </w:r>
           </w:p>
         </w:tc>
@@ -2886,7 +3023,8 @@
               <w:jc w:val="both"/>
             </w:pPr>
             <w:r>
-              <w:t>GitHub</w:t>
+              <w:lastRenderedPageBreak/>
+              <w:t>RNF004</w:t>
             </w:r>
           </w:p>
         </w:tc>
@@ -2900,7 +3038,7 @@
               <w:jc w:val="both"/>
             </w:pPr>
             <w:r>
-              <w:t>Armazenamento remoto em repositórios.</w:t>
+              <w:t>As variáveis no código devem possuir nomes autoexplicativos. Exemplo, “tempoVerde”.</w:t>
             </w:r>
           </w:p>
         </w:tc>
@@ -2916,7 +3054,7 @@
               <w:jc w:val="both"/>
             </w:pPr>
             <w:r>
-              <w:t>Sistema operacional Windows ou Linux</w:t>
+              <w:t>RNF005</w:t>
             </w:r>
           </w:p>
         </w:tc>
@@ -2926,15 +3064,11 @@
           </w:tcPr>
           <w:p>
             <w:pPr>
-              <w:spacing w:line="240" w:lineRule="auto"/>
-              <w:ind w:firstLine="0"/>
-              <w:jc w:val="both"/>
-              <w:rPr>
-                <w:rFonts w:ascii="Times New Roman" w:hAnsi="Times New Roman"/>
-              </w:rPr>
-            </w:pPr>
-            <w:r>
-              <w:t>Parte essencial para o funcionamento do computador que permite abrir os programas.</w:t>
+              <w:ind w:firstLine="0"/>
+              <w:jc w:val="both"/>
+            </w:pPr>
+            <w:r>
+              <w:t>O programa não poderá “travar” ou fechar sozinho durante a execução.</w:t>
             </w:r>
           </w:p>
         </w:tc>
@@ -2950,7 +3084,7 @@
               <w:jc w:val="both"/>
             </w:pPr>
             <w:r>
-              <w:t>Tinkercad</w:t>
+              <w:t>RNF006</w:t>
             </w:r>
           </w:p>
         </w:tc>
@@ -2960,184 +3094,11 @@
           </w:tcPr>
           <w:p>
             <w:pPr>
-              <w:spacing w:line="240" w:lineRule="auto"/>
-              <w:ind w:firstLine="0"/>
-              <w:jc w:val="both"/>
-            </w:pPr>
-            <w:r>
-              <w:t>Opcional</w:t>
-            </w:r>
-            <w:r>
-              <w:t xml:space="preserve"> para s</w:t>
-            </w:r>
-            <w:r>
-              <w:t>imula</w:t>
-            </w:r>
-            <w:r>
-              <w:t>r</w:t>
-            </w:r>
-            <w:r>
-              <w:t>/testar</w:t>
-            </w:r>
-            <w:r>
-              <w:t xml:space="preserve"> os </w:t>
-            </w:r>
-            <w:r>
-              <w:t>circuitos com LEDs e resistores.</w:t>
-            </w:r>
-          </w:p>
-        </w:tc>
-      </w:tr>
-      <w:tr>
-        <w:tc>
-          <w:tcPr>
-            <w:tcW w:w="4530" w:type="dxa"/>
-          </w:tcPr>
-          <w:p>
-            <w:pPr>
-              <w:ind w:firstLine="0"/>
-              <w:jc w:val="both"/>
-            </w:pPr>
-            <w:r>
-              <w:t>Arduino ou ESP32</w:t>
-            </w:r>
-          </w:p>
-        </w:tc>
-        <w:tc>
-          <w:tcPr>
-            <w:tcW w:w="4531" w:type="dxa"/>
-          </w:tcPr>
-          <w:p>
-            <w:pPr>
-              <w:spacing w:line="240" w:lineRule="auto"/>
-              <w:ind w:firstLine="0"/>
-              <w:jc w:val="both"/>
-              <w:rPr>
-                <w:rFonts w:ascii="Times New Roman" w:hAnsi="Times New Roman"/>
-              </w:rPr>
-            </w:pPr>
-            <w:r>
-              <w:t>Opcional para protótipo físico</w:t>
-            </w:r>
-            <w:r>
-              <w:t>, será o controlador do circuito.</w:t>
-            </w:r>
-          </w:p>
-        </w:tc>
-      </w:tr>
-      <w:tr>
-        <w:tc>
-          <w:tcPr>
-            <w:tcW w:w="4530" w:type="dxa"/>
-          </w:tcPr>
-          <w:p>
-            <w:pPr>
-              <w:ind w:firstLine="0"/>
-              <w:jc w:val="both"/>
-            </w:pPr>
-            <w:r>
-              <w:t>LEDs</w:t>
-            </w:r>
-          </w:p>
-        </w:tc>
-        <w:tc>
-          <w:tcPr>
-            <w:tcW w:w="4531" w:type="dxa"/>
-          </w:tcPr>
-          <w:p>
-            <w:pPr>
-              <w:spacing w:line="240" w:lineRule="auto"/>
-              <w:ind w:firstLine="0"/>
-              <w:jc w:val="both"/>
-              <w:rPr>
-                <w:rFonts w:ascii="Times New Roman" w:hAnsi="Times New Roman"/>
-              </w:rPr>
-            </w:pPr>
-            <w:r>
-              <w:t>Opcional</w:t>
-            </w:r>
-            <w:r>
-              <w:t>, representa os estados do semáforo.</w:t>
-            </w:r>
-          </w:p>
-        </w:tc>
-      </w:tr>
-      <w:tr>
-        <w:tc>
-          <w:tcPr>
-            <w:tcW w:w="4530" w:type="dxa"/>
-          </w:tcPr>
-          <w:p>
-            <w:pPr>
-              <w:ind w:firstLine="0"/>
-              <w:jc w:val="both"/>
-            </w:pPr>
-            <w:r>
-              <w:t>Resistores</w:t>
-            </w:r>
-          </w:p>
-        </w:tc>
-        <w:tc>
-          <w:tcPr>
-            <w:tcW w:w="4531" w:type="dxa"/>
-          </w:tcPr>
-          <w:p>
-            <w:pPr>
-              <w:spacing w:line="240" w:lineRule="auto"/>
-              <w:ind w:firstLine="0"/>
-              <w:jc w:val="both"/>
-              <w:rPr>
-                <w:rFonts w:ascii="Times New Roman" w:hAnsi="Times New Roman"/>
-              </w:rPr>
-            </w:pPr>
-            <w:r>
-              <w:t>Opcional</w:t>
-            </w:r>
-            <w:r>
-              <w:t>,</w:t>
-            </w:r>
-            <w:r>
-              <w:t xml:space="preserve"> para proteger os LEDs</w:t>
-            </w:r>
-            <w:r>
-              <w:t xml:space="preserve"> e impedir que eles sejam queimados.</w:t>
-            </w:r>
-          </w:p>
-        </w:tc>
-      </w:tr>
-      <w:tr>
-        <w:tc>
-          <w:tcPr>
-            <w:tcW w:w="4530" w:type="dxa"/>
-          </w:tcPr>
-          <w:p>
-            <w:pPr>
-              <w:ind w:firstLine="0"/>
-              <w:jc w:val="both"/>
-            </w:pPr>
-            <w:r>
-              <w:t>Protoboard e jumpers</w:t>
-            </w:r>
-          </w:p>
-        </w:tc>
-        <w:tc>
-          <w:tcPr>
-            <w:tcW w:w="4531" w:type="dxa"/>
-          </w:tcPr>
-          <w:p>
-            <w:pPr>
-              <w:spacing w:line="240" w:lineRule="auto"/>
-              <w:ind w:firstLine="0"/>
-              <w:jc w:val="both"/>
-              <w:rPr>
-                <w:rFonts w:ascii="Times New Roman" w:hAnsi="Times New Roman"/>
-              </w:rPr>
-            </w:pPr>
-            <w:r>
-              <w:t>Opcional</w:t>
-            </w:r>
-            <w:r>
-              <w:t>, placa e fios usados para conectar os componentes uns nos outros.</w:t>
+              <w:ind w:firstLine="0"/>
+              <w:jc w:val="both"/>
+            </w:pPr>
+            <w:r>
+              <w:t>As cores que representam os estados do semáforo devem seguir o padrão universal sendo vermelho, amarelo e verde.</w:t>
             </w:r>
           </w:p>
         </w:tc>
@@ -3163,265 +3124,30 @@
           <w:b/>
           <w:bCs/>
         </w:rPr>
-        <w:t>4.LINGUAGEM DE PROGRAMAÇÃO</w:t>
-      </w:r>
-    </w:p>
-    <w:p>
-      <w:pPr>
-        <w:jc w:val="both"/>
-      </w:pPr>
-      <w:r>
-        <w:t xml:space="preserve">A linguagem de programação escolhida para o projeto SmartFlow foi a linguagem C, pois ela </w:t>
-      </w:r>
-      <w:r>
-        <w:t xml:space="preserve">é fundamental para quem </w:t>
-      </w:r>
-      <w:r>
-        <w:t>está aprendendo lógica de programação. Com ela</w:t>
-      </w:r>
-      <w:r>
-        <w:t>,</w:t>
-      </w:r>
-      <w:r>
-        <w:t xml:space="preserve"> é possível aplicar conceitos importantes como </w:t>
-      </w:r>
-      <w:r>
-        <w:t>variáveis, estruturas de repetição para o ciclo do sem</w:t>
-      </w:r>
-      <w:r>
-        <w:t xml:space="preserve">áforo ela se adapta corretamente. Além disso, por meio de pesquisas </w:t>
-      </w:r>
-      <w:r>
-        <w:t>sobre as tecnologias atuais, pude perceber que a linguagem C é a mais usada em sistemas de automaç</w:t>
-      </w:r>
-      <w:r>
-        <w:t xml:space="preserve">ão e dispositivos de IoT, porque ela </w:t>
-      </w:r>
-      <w:r>
-        <w:t>é muito “leve” e rápida</w:t>
-      </w:r>
-      <w:r>
-        <w:t xml:space="preserve"> já que consegue conversar diretamente com o hardware (</w:t>
-      </w:r>
-      <w:r>
-        <w:t xml:space="preserve">como o </w:t>
-      </w:r>
-      <w:r>
-        <w:t>Arduino)</w:t>
-      </w:r>
-      <w:r>
-        <w:t xml:space="preserve">. Por fim, o uso da linguagem C é uma excelente opção pois ela garante que o semáforo funcione </w:t>
-      </w:r>
-      <w:r>
-        <w:t>sem delay</w:t>
-      </w:r>
-      <w:r>
-        <w:t>s</w:t>
-      </w:r>
-      <w:r>
-        <w:t>, o que é fundamental para a segurança no tráfego.</w:t>
-      </w:r>
-    </w:p>
-    <w:p>
-      <w:pPr>
-        <w:jc w:val="both"/>
-      </w:pPr>
-    </w:p>
-    <w:p>
-      <w:pPr>
-        <w:ind w:firstLine="0"/>
-        <w:jc w:val="both"/>
-        <w:rPr>
-          <w:b/>
-          <w:bCs/>
-        </w:rPr>
-      </w:pPr>
-      <w:r>
-        <w:rPr>
-          <w:b/>
-          <w:bCs/>
-        </w:rPr>
-        <w:t>5.SISTEMA OPERACIONAL</w:t>
-      </w:r>
-    </w:p>
-    <w:p>
-      <w:pPr>
-        <w:jc w:val="both"/>
-      </w:pPr>
-      <w:r>
-        <w:t>O sistema opera</w:t>
-      </w:r>
-      <w:r>
-        <w:t xml:space="preserve">cional escolhido para o desenvolvimento do projeto SmartFlow </w:t>
-      </w:r>
-      <w:r>
-        <w:t>é o Windows 11. A escolha foi baseada em critérios técnicos de compatibilidade e estabilidade</w:t>
-      </w:r>
-      <w:r>
-        <w:t xml:space="preserve">. O Windows 11 funciona muito bem com todos os programas que eu vou usar para desenvolver o projeto, </w:t>
-      </w:r>
-      <w:r>
-        <w:t>como o VS Code e o compilador C, e não precisará de instalações muito complicadas.</w:t>
-      </w:r>
-      <w:r>
-        <w:t xml:space="preserve"> Além de ser um sistema operacional </w:t>
-      </w:r>
-      <w:r>
-        <w:t>com o qual</w:t>
-      </w:r>
-      <w:r>
-        <w:t xml:space="preserve"> já estou familiarizada e fácil de mexer</w:t>
-      </w:r>
-      <w:r>
-        <w:t xml:space="preserve">, o Windows 11 é estável </w:t>
-      </w:r>
-      <w:r>
-        <w:t xml:space="preserve">e </w:t>
-      </w:r>
-      <w:r>
-        <w:t>por isso, há</w:t>
-      </w:r>
-      <w:r>
-        <w:t xml:space="preserve"> pequenas chances de que devido a ele</w:t>
-      </w:r>
-      <w:r>
-        <w:t xml:space="preserve"> a programação seja afetada ou o computador trave.</w:t>
-      </w:r>
-      <w:r>
-        <w:t xml:space="preserve"> Ele também já está instalado nos computadores que usamos em aula</w:t>
-      </w:r>
-      <w:r>
-        <w:t xml:space="preserve"> no SENAI, </w:t>
-      </w:r>
-      <w:r>
-        <w:t xml:space="preserve">facilitando o uso pois não precisarei fazer outras instalações. Por fim, é importante considerar que ele é um sistema operacional moderno, e possibilita várias atualizações </w:t>
-      </w:r>
-      <w:r>
-        <w:t>que contribuem para a segurança e eficiência no trabalho.</w:t>
-      </w:r>
-    </w:p>
-    <w:p>
-      <w:pPr>
-        <w:ind w:firstLine="0"/>
-        <w:jc w:val="both"/>
-      </w:pPr>
-    </w:p>
-    <w:p>
-      <w:pPr>
-        <w:ind w:firstLine="0"/>
-        <w:jc w:val="both"/>
-        <w:rPr>
-          <w:b/>
-          <w:bCs/>
-        </w:rPr>
-      </w:pPr>
-      <w:r>
-        <w:rPr>
-          <w:b/>
-          <w:bCs/>
-        </w:rPr>
-        <w:t>6.CRONOGRAMA DO PROJETO</w:t>
-      </w:r>
-    </w:p>
-    <w:p>
-      <w:pPr>
-        <w:jc w:val="both"/>
-      </w:pPr>
-      <w:r>
-        <w:t xml:space="preserve">O cronograma a seguir foi inspirado na divisão por semanas </w:t>
-      </w:r>
-      <w:r>
-        <w:t xml:space="preserve">mencionadas no </w:t>
-      </w:r>
-      <w:proofErr w:type="spellStart"/>
-      <w:r>
-        <w:t>Notion</w:t>
-      </w:r>
-      <w:proofErr w:type="spellEnd"/>
-      <w:r>
-        <w:t>.</w:t>
-      </w:r>
-      <w:r>
-        <w:t xml:space="preserve"> </w:t>
-      </w:r>
-      <w:r>
-        <w:t>P</w:t>
-      </w:r>
-      <w:r>
-        <w:t>or meio de</w:t>
-      </w:r>
-      <w:r>
-        <w:t>ssa divisão</w:t>
-      </w:r>
-      <w:r>
-        <w:t>,</w:t>
-      </w:r>
-      <w:r>
-        <w:t xml:space="preserve"> </w:t>
-      </w:r>
-      <w:r>
-        <w:t xml:space="preserve">podemos organizar as etapas do projeto e garantir que tudo seja entregue no prazo. </w:t>
-      </w:r>
-      <w:r>
-        <w:t>O objetivo de utilizá-lo no projeto SmartFlow é divi</w:t>
-      </w:r>
-      <w:r>
-        <w:t>di</w:t>
-      </w:r>
-      <w:r>
-        <w:t xml:space="preserve">r o trabalho </w:t>
-      </w:r>
-      <w:r>
-        <w:t xml:space="preserve">desde o </w:t>
-      </w:r>
-      <w:r>
-        <w:t xml:space="preserve">estudo do problema até a entrega do </w:t>
-      </w:r>
-      <w:proofErr w:type="gramStart"/>
-      <w:r>
-        <w:t>produto final</w:t>
-      </w:r>
-      <w:proofErr w:type="gramEnd"/>
-      <w:r>
-        <w:t>, isso ajuda a evitar atrasos e permite que o processo de criação seja mais organizado e</w:t>
-      </w:r>
-      <w:r>
-        <w:t>,</w:t>
-      </w:r>
-      <w:r>
-        <w:t xml:space="preserve"> consequentemente</w:t>
-      </w:r>
-      <w:r>
-        <w:t>,</w:t>
-      </w:r>
-      <w:r>
-        <w:t xml:space="preserve"> </w:t>
-      </w:r>
-      <w:r>
-        <w:t xml:space="preserve">otimizado, pois assim dificilmente partes importantes </w:t>
-      </w:r>
-      <w:r>
-        <w:t xml:space="preserve">serão </w:t>
-      </w:r>
-      <w:r>
-        <w:lastRenderedPageBreak/>
-        <w:t>esquecidas.</w:t>
-      </w:r>
-      <w:r>
-        <w:t xml:space="preserve"> Além da divisão das etapas </w:t>
-      </w:r>
-      <w:r>
-        <w:t>para o desenvolvimento do software foram sugeridas etapas opcionais que p</w:t>
-      </w:r>
-      <w:r>
-        <w:t>ara a criação do protótipo físico.</w:t>
-      </w:r>
-    </w:p>
-    <w:p>
-      <w:pPr>
-        <w:ind w:firstLine="0"/>
-        <w:jc w:val="both"/>
-      </w:pPr>
+        <w:t>3.LISTA DE MAT</w:t>
+      </w:r>
+      <w:r>
+        <w:rPr>
+          <w:b/>
+          <w:bCs/>
+        </w:rPr>
+        <w:t>E</w:t>
+      </w:r>
+      <w:r>
+        <w:rPr>
+          <w:b/>
+          <w:bCs/>
+        </w:rPr>
+        <w:t>RIAIS E EQUIPAMENTOS</w:t>
+      </w:r>
+    </w:p>
+    <w:p>
+      <w:pPr>
+        <w:jc w:val="both"/>
+      </w:pPr>
+      <w:r>
+        <w:t>Para realizar este projeto, a seguir foram selecionados alguns materiais para o desenvolvimento do software, que são essenciais, e outros opcionais para o desenvolvimento do protótipo físico (hardware).</w:t>
+      </w:r>
     </w:p>
     <w:tbl>
       <w:tblPr>
@@ -3444,7 +3170,7 @@
               <w:jc w:val="both"/>
             </w:pPr>
             <w:r>
-              <w:t>Semana</w:t>
+              <w:t>Item</w:t>
             </w:r>
           </w:p>
         </w:tc>
@@ -3458,7 +3184,7 @@
               <w:jc w:val="both"/>
             </w:pPr>
             <w:r>
-              <w:t>Atividade Prevista</w:t>
+              <w:t>Finalidade</w:t>
             </w:r>
           </w:p>
         </w:tc>
@@ -3474,7 +3200,7 @@
               <w:jc w:val="both"/>
             </w:pPr>
             <w:r>
-              <w:t>Semana 1</w:t>
+              <w:t>Computador ou notebook</w:t>
             </w:r>
           </w:p>
         </w:tc>
@@ -3488,7 +3214,10 @@
               <w:jc w:val="both"/>
             </w:pPr>
             <w:r>
-              <w:t>Estudo do problema e planejamento inicial</w:t>
+              <w:t xml:space="preserve">Equipamento </w:t>
+            </w:r>
+            <w:r>
+              <w:t>usado para escrever o programa e testar se ele funciona</w:t>
             </w:r>
             <w:r>
               <w:t>.</w:t>
@@ -3507,7 +3236,13 @@
               <w:jc w:val="both"/>
             </w:pPr>
             <w:r>
-              <w:t>Semana 2</w:t>
+              <w:t>V</w:t>
+            </w:r>
+            <w:r>
+              <w:t>S</w:t>
+            </w:r>
+            <w:r>
+              <w:t xml:space="preserve"> Code</w:t>
             </w:r>
           </w:p>
         </w:tc>
@@ -3521,10 +3256,7 @@
               <w:jc w:val="both"/>
             </w:pPr>
             <w:r>
-              <w:t>Escrita da documentação e definição dos requisi</w:t>
-            </w:r>
-            <w:r>
-              <w:t>tos</w:t>
+              <w:t>Programa usado para digitar o código</w:t>
             </w:r>
             <w:r>
               <w:t>.</w:t>
@@ -3533,6 +3265,9 @@
         </w:tc>
       </w:tr>
       <w:tr>
+        <w:trPr>
+          <w:trHeight w:val="70"/>
+        </w:trPr>
         <w:tc>
           <w:tcPr>
             <w:tcW w:w="4530" w:type="dxa"/>
@@ -3543,7 +3278,7 @@
               <w:jc w:val="both"/>
             </w:pPr>
             <w:r>
-              <w:t>Semana 3</w:t>
+              <w:t>Git</w:t>
             </w:r>
           </w:p>
         </w:tc>
@@ -3557,16 +3292,7 @@
               <w:jc w:val="both"/>
             </w:pPr>
             <w:r>
-              <w:t>Escolha dos materiais</w:t>
-            </w:r>
-            <w:r>
-              <w:t xml:space="preserve">, </w:t>
-            </w:r>
-            <w:r>
-              <w:t>da linguagem de programação</w:t>
-            </w:r>
-            <w:r>
-              <w:t xml:space="preserve"> e definição do sistema operacional.</w:t>
+              <w:t>Controle das versões do projeto.</w:t>
             </w:r>
           </w:p>
         </w:tc>
@@ -3582,7 +3308,7 @@
               <w:jc w:val="both"/>
             </w:pPr>
             <w:r>
-              <w:t>Semana 4</w:t>
+              <w:t>GitHub</w:t>
             </w:r>
           </w:p>
         </w:tc>
@@ -3596,13 +3322,7 @@
               <w:jc w:val="both"/>
             </w:pPr>
             <w:r>
-              <w:t xml:space="preserve">Criação </w:t>
-            </w:r>
-            <w:r>
-              <w:t>do repositório no GitHub e organização da estrutura em p</w:t>
-            </w:r>
-            <w:r>
-              <w:t>astas.</w:t>
+              <w:t>Armazenamento remoto em repositórios.</w:t>
             </w:r>
           </w:p>
         </w:tc>
@@ -3618,7 +3338,7 @@
               <w:jc w:val="both"/>
             </w:pPr>
             <w:r>
-              <w:t>Semana 5</w:t>
+              <w:t>Sistema operacional Windows ou Linux</w:t>
             </w:r>
           </w:p>
         </w:tc>
@@ -3628,20 +3348,15 @@
           </w:tcPr>
           <w:p>
             <w:pPr>
-              <w:ind w:firstLine="0"/>
-              <w:jc w:val="both"/>
-            </w:pPr>
-            <w:r>
-              <w:t xml:space="preserve">Desenvolvimento da lógica </w:t>
-            </w:r>
-            <w:r>
-              <w:t>de como o sistema funcionará</w:t>
-            </w:r>
-            <w:r>
-              <w:t xml:space="preserve"> em fluxogramas.</w:t>
-            </w:r>
-            <w:r>
-              <w:t xml:space="preserve"> E simulação do circuito no Tinkercad (opcional).</w:t>
+              <w:spacing w:line="240" w:lineRule="auto"/>
+              <w:ind w:firstLine="0"/>
+              <w:jc w:val="both"/>
+              <w:rPr>
+                <w:rFonts w:ascii="Times New Roman" w:hAnsi="Times New Roman"/>
+              </w:rPr>
+            </w:pPr>
+            <w:r>
+              <w:t>Parte essencial para o funcionamento do computador que permite abrir os programas.</w:t>
             </w:r>
           </w:p>
         </w:tc>
@@ -3657,7 +3372,7 @@
               <w:jc w:val="both"/>
             </w:pPr>
             <w:r>
-              <w:t>Semana 6</w:t>
+              <w:t>Tinkercad</w:t>
             </w:r>
           </w:p>
         </w:tc>
@@ -3667,29 +3382,30 @@
           </w:tcPr>
           <w:p>
             <w:pPr>
-              <w:ind w:firstLine="0"/>
-              <w:jc w:val="both"/>
-            </w:pPr>
-            <w:r>
-              <w:t xml:space="preserve">Escrita do código-fonte </w:t>
-            </w:r>
-            <w:r>
-              <w:t>na</w:t>
-            </w:r>
-            <w:r>
-              <w:t xml:space="preserve"> linguagem </w:t>
-            </w:r>
-            <w:r>
-              <w:t>de programação escolhida</w:t>
-            </w:r>
-            <w:r>
-              <w:t xml:space="preserve"> no VS Code.</w:t>
-            </w:r>
-            <w:r>
-              <w:t xml:space="preserve"> E montagem do protótipo físico </w:t>
-            </w:r>
-            <w:r>
-              <w:t>com Arduino (opcional).</w:t>
+              <w:spacing w:line="240" w:lineRule="auto"/>
+              <w:ind w:firstLine="0"/>
+              <w:jc w:val="both"/>
+            </w:pPr>
+            <w:r>
+              <w:t>Opcional</w:t>
+            </w:r>
+            <w:r>
+              <w:t xml:space="preserve"> para s</w:t>
+            </w:r>
+            <w:r>
+              <w:t>imula</w:t>
+            </w:r>
+            <w:r>
+              <w:t>r</w:t>
+            </w:r>
+            <w:r>
+              <w:t>/testar</w:t>
+            </w:r>
+            <w:r>
+              <w:t xml:space="preserve"> os </w:t>
+            </w:r>
+            <w:r>
+              <w:t>circuitos com LEDs e resistores.</w:t>
             </w:r>
           </w:p>
         </w:tc>
@@ -3705,7 +3421,7 @@
               <w:jc w:val="both"/>
             </w:pPr>
             <w:r>
-              <w:t>Semana 7</w:t>
+              <w:t>Arduino ou ESP32</w:t>
             </w:r>
           </w:p>
         </w:tc>
@@ -3715,17 +3431,18 @@
           </w:tcPr>
           <w:p>
             <w:pPr>
-              <w:ind w:firstLine="0"/>
-              <w:jc w:val="both"/>
-            </w:pPr>
-            <w:r>
-              <w:t xml:space="preserve">Testes </w:t>
-            </w:r>
-            <w:r>
-              <w:t xml:space="preserve">no computador e protótipo físico (opcional) para verificar o </w:t>
-            </w:r>
-            <w:r>
-              <w:t>funcionamento.</w:t>
+              <w:spacing w:line="240" w:lineRule="auto"/>
+              <w:ind w:firstLine="0"/>
+              <w:jc w:val="both"/>
+              <w:rPr>
+                <w:rFonts w:ascii="Times New Roman" w:hAnsi="Times New Roman"/>
+              </w:rPr>
+            </w:pPr>
+            <w:r>
+              <w:t>Opcional para protótipo físico</w:t>
+            </w:r>
+            <w:r>
+              <w:t>, será o controlador do circuito.</w:t>
             </w:r>
           </w:p>
         </w:tc>
@@ -3741,7 +3458,7 @@
               <w:jc w:val="both"/>
             </w:pPr>
             <w:r>
-              <w:t>Semana 8</w:t>
+              <w:t>LEDs</w:t>
             </w:r>
           </w:p>
         </w:tc>
@@ -3751,11 +3468,98 @@
           </w:tcPr>
           <w:p>
             <w:pPr>
-              <w:ind w:firstLine="0"/>
-              <w:jc w:val="both"/>
-            </w:pPr>
-            <w:r>
-              <w:t>Correção de erros, revisão final e entrega do projeto.</w:t>
+              <w:spacing w:line="240" w:lineRule="auto"/>
+              <w:ind w:firstLine="0"/>
+              <w:jc w:val="both"/>
+              <w:rPr>
+                <w:rFonts w:ascii="Times New Roman" w:hAnsi="Times New Roman"/>
+              </w:rPr>
+            </w:pPr>
+            <w:r>
+              <w:t>Opcional</w:t>
+            </w:r>
+            <w:r>
+              <w:t>, representa os estados do semáforo.</w:t>
+            </w:r>
+          </w:p>
+        </w:tc>
+      </w:tr>
+      <w:tr>
+        <w:tc>
+          <w:tcPr>
+            <w:tcW w:w="4530" w:type="dxa"/>
+          </w:tcPr>
+          <w:p>
+            <w:pPr>
+              <w:ind w:firstLine="0"/>
+              <w:jc w:val="both"/>
+            </w:pPr>
+            <w:r>
+              <w:t>Resistores</w:t>
+            </w:r>
+          </w:p>
+        </w:tc>
+        <w:tc>
+          <w:tcPr>
+            <w:tcW w:w="4531" w:type="dxa"/>
+          </w:tcPr>
+          <w:p>
+            <w:pPr>
+              <w:spacing w:line="240" w:lineRule="auto"/>
+              <w:ind w:firstLine="0"/>
+              <w:jc w:val="both"/>
+              <w:rPr>
+                <w:rFonts w:ascii="Times New Roman" w:hAnsi="Times New Roman"/>
+              </w:rPr>
+            </w:pPr>
+            <w:r>
+              <w:t>Opcional</w:t>
+            </w:r>
+            <w:r>
+              <w:t>,</w:t>
+            </w:r>
+            <w:r>
+              <w:t xml:space="preserve"> para proteger os LEDs</w:t>
+            </w:r>
+            <w:r>
+              <w:t xml:space="preserve"> e impedir que eles sejam queimados.</w:t>
+            </w:r>
+          </w:p>
+        </w:tc>
+      </w:tr>
+      <w:tr>
+        <w:tc>
+          <w:tcPr>
+            <w:tcW w:w="4530" w:type="dxa"/>
+          </w:tcPr>
+          <w:p>
+            <w:pPr>
+              <w:ind w:firstLine="0"/>
+              <w:jc w:val="both"/>
+            </w:pPr>
+            <w:r>
+              <w:t>Protoboard e jumpers</w:t>
+            </w:r>
+          </w:p>
+        </w:tc>
+        <w:tc>
+          <w:tcPr>
+            <w:tcW w:w="4531" w:type="dxa"/>
+          </w:tcPr>
+          <w:p>
+            <w:pPr>
+              <w:spacing w:line="240" w:lineRule="auto"/>
+              <w:ind w:firstLine="0"/>
+              <w:jc w:val="both"/>
+              <w:rPr>
+                <w:rFonts w:ascii="Times New Roman" w:hAnsi="Times New Roman"/>
+              </w:rPr>
+            </w:pPr>
+            <w:r>
+              <w:t>Opcional</w:t>
+            </w:r>
+            <w:r>
+              <w:t>, placa e fios usados para conectar os componentes uns nos outros.</w:t>
             </w:r>
           </w:p>
         </w:tc>
@@ -3763,41 +3567,2296 @@
     </w:tbl>
     <w:p>
       <w:pPr>
-        <w:ind w:firstLine="0"/>
-        <w:jc w:val="both"/>
-      </w:pPr>
-    </w:p>
-    <w:p>
-      <w:pPr>
-        <w:ind w:firstLine="0"/>
-        <w:jc w:val="both"/>
-        <w:rPr>
-          <w:b/>
-          <w:bCs/>
-        </w:rPr>
-      </w:pPr>
-      <w:r>
-        <w:rPr>
-          <w:b/>
-          <w:bCs/>
-        </w:rPr>
-        <w:t>7.REPOSITÓRIO GITHUB</w:t>
-      </w:r>
-    </w:p>
-    <w:p>
-      <w:pPr>
-        <w:jc w:val="both"/>
-      </w:pPr>
-      <w:r>
-        <w:t xml:space="preserve">O </w:t>
-      </w:r>
-      <w:proofErr w:type="spellStart"/>
-      <w:r>
-        <w:t>Git</w:t>
-      </w:r>
-      <w:proofErr w:type="spellEnd"/>
-      <w:r>
-        <w:t xml:space="preserve"> é uma ferramenta utilizada para o controle de versão</w:t>
+        <w:pStyle w:val="Ttulo1"/>
+        <w:jc w:val="both"/>
+      </w:pPr>
+    </w:p>
+    <w:p>
+      <w:pPr>
+        <w:pStyle w:val="Ttulo1"/>
+        <w:jc w:val="both"/>
+      </w:pPr>
+      <w:r>
+        <w:t xml:space="preserve">4. </w:t>
+      </w:r>
+      <w:r>
+        <w:t>P</w:t>
+      </w:r>
+      <w:r>
+        <w:t>OLÍTICA DE SEGURANÇA DA INFORMAÇÃO</w:t>
+      </w:r>
+    </w:p>
+    <w:p>
+      <w:pPr>
+        <w:jc w:val="both"/>
+        <w:rPr>
+          <w:b/>
+          <w:bCs/>
+        </w:rPr>
+      </w:pPr>
+      <w:r>
+        <w:rPr>
+          <w:b/>
+          <w:bCs/>
+        </w:rPr>
+        <w:t>Introdução</w:t>
+      </w:r>
+    </w:p>
+    <w:p>
+      <w:pPr>
+        <w:jc w:val="both"/>
+      </w:pPr>
+      <w:r>
+        <w:lastRenderedPageBreak/>
+        <w:t xml:space="preserve">Todo sistema </w:t>
+      </w:r>
+      <w:r>
+        <w:t>deve</w:t>
+      </w:r>
+      <w:r>
+        <w:t xml:space="preserve"> ser protegido para </w:t>
+      </w:r>
+      <w:r>
+        <w:t>que ele funcione</w:t>
+      </w:r>
+      <w:r>
+        <w:t xml:space="preserve"> de forma correta e segura, evitando problemas que possam comprometer seu desempenho ou causar prejuízos aos usuários.</w:t>
+      </w:r>
+      <w:r>
+        <w:t xml:space="preserve"> </w:t>
+      </w:r>
+      <w:r>
+        <w:t>Quando um sistema é acessado por pessoas não autorizadas, podem ocorrer alterações em arquivos, exclusão de informações importantes, interrupção do funcionamento e até mesmo falhas que coloquem pessoas em risco. Por isso, é necessário estabelecer regras de proteção para reduzir a possibilidade de ataques.</w:t>
+      </w:r>
+    </w:p>
+    <w:p>
+      <w:pPr>
+        <w:jc w:val="both"/>
+      </w:pPr>
+      <w:r>
+        <w:t xml:space="preserve">No projeto Smart Flow, a segurança da informação está diretamente relacionada ao funcionamento correto do semáforo inteligente. Como o sistema controla </w:t>
+      </w:r>
+      <w:r>
+        <w:t xml:space="preserve">o fluxo no </w:t>
+      </w:r>
+      <w:r>
+        <w:t xml:space="preserve">trânsito, qualquer alteração indevida em sua programação pode causar falhas na sequência dos sinais e comprometer a segurança dos motoristas. Além disso, projetos baseados em tecnologias de automação e Internet das Coisas (IoT) exigem </w:t>
+      </w:r>
+      <w:r>
+        <w:t xml:space="preserve">uma </w:t>
+      </w:r>
+      <w:r>
+        <w:t>atenção especial à segurança, pois podem estar conectados a redes e dispositivos que precisam ser protegidos contra acessos indevidos.</w:t>
+      </w:r>
+    </w:p>
+    <w:p>
+      <w:pPr>
+        <w:jc w:val="both"/>
+      </w:pPr>
+    </w:p>
+    <w:p>
+      <w:pPr>
+        <w:jc w:val="both"/>
+        <w:rPr>
+          <w:b/>
+          <w:bCs/>
+        </w:rPr>
+      </w:pPr>
+      <w:r>
+        <w:rPr>
+          <w:b/>
+          <w:bCs/>
+        </w:rPr>
+        <w:t>Descrição do sistema analisado</w:t>
+      </w:r>
+    </w:p>
+    <w:p>
+      <w:pPr>
+        <w:jc w:val="both"/>
+      </w:pPr>
+      <w:r>
+        <w:t xml:space="preserve">O sistema analisado é o Smart Flow, um protótipo de semáforo inteligente desenvolvido na linguagem C. Seu objetivo é controlar o fluxo de veículos em um cruzamento formado por uma via principal e uma via secundária. O sistema </w:t>
+      </w:r>
+      <w:r>
+        <w:t xml:space="preserve">dele, </w:t>
+      </w:r>
+      <w:r>
+        <w:t xml:space="preserve">alterna </w:t>
+      </w:r>
+      <w:r>
+        <w:t>entre</w:t>
+      </w:r>
+      <w:r>
+        <w:t xml:space="preserve"> sinais verde, amarelo e vermelho de forma automática, garantindo que a via principal tenha um tempo maior </w:t>
+      </w:r>
+      <w:r>
+        <w:t>no sinal verde</w:t>
+      </w:r>
+      <w:r>
+        <w:t xml:space="preserve"> devido ao maior fluxo de veículos. Além disso, a lógica do programa impede que os dois semáforos apresentem sinal verde ao mesmo tempo, aumentando a segurança no trânsito e garantindo uma circulação mais organizada.</w:t>
+      </w:r>
+    </w:p>
+    <w:p>
+      <w:pPr>
+        <w:jc w:val="both"/>
+      </w:pPr>
+    </w:p>
+    <w:p>
+      <w:pPr>
+        <w:jc w:val="both"/>
+        <w:rPr>
+          <w:b/>
+          <w:bCs/>
+        </w:rPr>
+      </w:pPr>
+      <w:r>
+        <w:rPr>
+          <w:b/>
+          <w:bCs/>
+        </w:rPr>
+        <w:t xml:space="preserve">4.1 </w:t>
+      </w:r>
+      <w:r>
+        <w:rPr>
+          <w:b/>
+          <w:bCs/>
+        </w:rPr>
+        <w:t>Objetivo da política de segurança</w:t>
+      </w:r>
+    </w:p>
+    <w:p>
+      <w:pPr>
+        <w:jc w:val="both"/>
+      </w:pPr>
+      <w:r>
+        <w:t xml:space="preserve">A política de segurança do projeto Smart Flow tem como objetivo estabelecer regras e procedimentos que garantam a proteção do sistema, e do código-fonte. Ela busca prevenir acessos indevidos, evitar alterações não autorizadas, proteger as informações armazenadas e garantir que o desenvolvimento do projeto ocorra de forma organizada e segura. Dessa maneira, o sistema </w:t>
+      </w:r>
+      <w:r>
+        <w:t>contará</w:t>
+      </w:r>
+      <w:r>
+        <w:t xml:space="preserve"> com maior confiabilidade, reduzindo riscos de falhas e problemas durante sua utilização.</w:t>
+      </w:r>
+    </w:p>
+    <w:p>
+      <w:pPr>
+        <w:jc w:val="both"/>
+      </w:pPr>
+    </w:p>
+    <w:p>
+      <w:pPr>
+        <w:jc w:val="both"/>
+        <w:rPr>
+          <w:b/>
+          <w:bCs/>
+        </w:rPr>
+      </w:pPr>
+      <w:r>
+        <w:rPr>
+          <w:b/>
+          <w:bCs/>
+        </w:rPr>
+        <w:t xml:space="preserve">4.3 </w:t>
+      </w:r>
+      <w:r>
+        <w:rPr>
+          <w:b/>
+          <w:bCs/>
+        </w:rPr>
+        <w:t>Responsabilidades</w:t>
+      </w:r>
+    </w:p>
+    <w:tbl>
+      <w:tblPr>
+        <w:tblStyle w:val="Tabelacomgrade"/>
+        <w:tblW w:w="0" w:type="auto"/>
+        <w:tblLook w:val="04A0" w:firstRow="1" w:lastRow="0" w:firstColumn="1" w:lastColumn="0" w:noHBand="0" w:noVBand="1"/>
+      </w:tblPr>
+      <w:tblGrid>
+        <w:gridCol w:w="4530"/>
+        <w:gridCol w:w="4531"/>
+      </w:tblGrid>
+      <w:tr>
+        <w:tc>
+          <w:tcPr>
+            <w:tcW w:w="4530" w:type="dxa"/>
+          </w:tcPr>
+          <w:p>
+            <w:pPr>
+              <w:jc w:val="both"/>
+            </w:pPr>
+            <w:r>
+              <w:lastRenderedPageBreak/>
+              <w:t>Responsável</w:t>
+            </w:r>
+          </w:p>
+        </w:tc>
+        <w:tc>
+          <w:tcPr>
+            <w:tcW w:w="4531" w:type="dxa"/>
+          </w:tcPr>
+          <w:p>
+            <w:pPr>
+              <w:jc w:val="both"/>
+            </w:pPr>
+            <w:r>
+              <w:t>Responsabilidade</w:t>
+            </w:r>
+          </w:p>
+        </w:tc>
+      </w:tr>
+      <w:tr>
+        <w:tc>
+          <w:tcPr>
+            <w:tcW w:w="4530" w:type="dxa"/>
+          </w:tcPr>
+          <w:p>
+            <w:pPr>
+              <w:jc w:val="both"/>
+            </w:pPr>
+            <w:r>
+              <w:t>Aluno desenvolvedor</w:t>
+            </w:r>
+          </w:p>
+        </w:tc>
+        <w:tc>
+          <w:tcPr>
+            <w:tcW w:w="4531" w:type="dxa"/>
+          </w:tcPr>
+          <w:p>
+            <w:pPr>
+              <w:jc w:val="both"/>
+            </w:pPr>
+            <w:r>
+              <w:t>Desenvolver o código-fonte do sistema, organizar os arquivos do projeto, realizar testes, registrar alterações no GitHub, manter backups atualizados e seguir as regras de segurança estabelecidas.</w:t>
+            </w:r>
+          </w:p>
+        </w:tc>
+      </w:tr>
+      <w:tr>
+        <w:tc>
+          <w:tcPr>
+            <w:tcW w:w="4530" w:type="dxa"/>
+          </w:tcPr>
+          <w:p>
+            <w:pPr>
+              <w:jc w:val="both"/>
+            </w:pPr>
+            <w:r>
+              <w:t>Professor</w:t>
+            </w:r>
+          </w:p>
+        </w:tc>
+        <w:tc>
+          <w:tcPr>
+            <w:tcW w:w="4531" w:type="dxa"/>
+          </w:tcPr>
+          <w:p>
+            <w:pPr>
+              <w:jc w:val="both"/>
+            </w:pPr>
+            <w:r>
+              <w:t>Or</w:t>
+            </w:r>
+            <w:r>
+              <w:t>ientar o desenvolvimento do projeto, esclarecer dúvidas, acompanhar a evolução</w:t>
+            </w:r>
+            <w:r>
+              <w:t xml:space="preserve"> </w:t>
+            </w:r>
+            <w:r>
+              <w:t>das atividades e avaliar se os requisitos definidos estão sendo atendidos corretamente.</w:t>
+            </w:r>
+          </w:p>
+        </w:tc>
+      </w:tr>
+      <w:tr>
+        <w:tc>
+          <w:tcPr>
+            <w:tcW w:w="4530" w:type="dxa"/>
+          </w:tcPr>
+          <w:p>
+            <w:pPr>
+              <w:jc w:val="both"/>
+            </w:pPr>
+            <w:r>
+              <w:t>Usuário autorizado</w:t>
+            </w:r>
+          </w:p>
+        </w:tc>
+        <w:tc>
+          <w:tcPr>
+            <w:tcW w:w="4531" w:type="dxa"/>
+            <w:vAlign w:val="center"/>
+          </w:tcPr>
+          <w:p>
+            <w:pPr>
+              <w:jc w:val="both"/>
+            </w:pPr>
+            <w:r>
+              <w:t>Utilizar o sistema de acordo com as regras estabelecidas, evitar alterações não autorizadas e comunicar qualquer falha ou comportamento anormal identificado durante o uso.</w:t>
+            </w:r>
+          </w:p>
+        </w:tc>
+      </w:tr>
+      <w:tr>
+        <w:tc>
+          <w:tcPr>
+            <w:tcW w:w="4530" w:type="dxa"/>
+          </w:tcPr>
+          <w:p>
+            <w:pPr>
+              <w:jc w:val="both"/>
+            </w:pPr>
+            <w:r>
+              <w:t>Administrador do repositório</w:t>
+            </w:r>
+          </w:p>
+        </w:tc>
+        <w:tc>
+          <w:tcPr>
+            <w:tcW w:w="4531" w:type="dxa"/>
+          </w:tcPr>
+          <w:p>
+            <w:pPr>
+              <w:jc w:val="both"/>
+            </w:pPr>
+            <w:r>
+              <w:t>Controlar permissões de acesso ao GitHub, acompanhar o versionamento do projeto, gerenciar backups e garantir que apenas usuários autorizados possam modificar os arquivos.</w:t>
+            </w:r>
+          </w:p>
+        </w:tc>
+      </w:tr>
+    </w:tbl>
+    <w:p>
+      <w:pPr>
+        <w:jc w:val="both"/>
+        <w:rPr>
+          <w:vanish/>
+        </w:rPr>
+      </w:pPr>
+    </w:p>
+    <w:p>
+      <w:pPr>
+        <w:jc w:val="both"/>
+      </w:pPr>
+    </w:p>
+    <w:p>
+      <w:pPr>
+        <w:jc w:val="both"/>
+        <w:rPr>
+          <w:b/>
+          <w:bCs/>
+        </w:rPr>
+      </w:pPr>
+      <w:r>
+        <w:rPr>
+          <w:b/>
+          <w:bCs/>
+        </w:rPr>
+        <w:t>4.</w:t>
+      </w:r>
+      <w:r>
+        <w:rPr>
+          <w:b/>
+          <w:bCs/>
+        </w:rPr>
+        <w:t xml:space="preserve">4 </w:t>
+      </w:r>
+      <w:r>
+        <w:rPr>
+          <w:b/>
+          <w:bCs/>
+        </w:rPr>
+        <w:t>Regras de acesso</w:t>
+      </w:r>
+    </w:p>
+    <w:p>
+      <w:pPr>
+        <w:jc w:val="both"/>
+      </w:pPr>
+      <w:commentRangeStart w:id="0"/>
+      <w:r>
+        <w:t>O acesso aos arquivos e recursos do projeto deve ser permitido apenas para pessoas autorizadas. O computador utilizado para o desenvolvimento deve possuir usuário e senha para impedir acessos indevidos. O repositório do GitHub deve ser acessado somente pelo aluno responsável e pelo professor quando necessário. Todas as alterações realizadas no código devem ser registradas por meio de commits, permitindo o acompanhamento das modificações realizadas. Arquivos importantes não devem ser excluídos sem necessidade e toda a estrutura do projeto deve permanecer organizada em pastas e arquivos devidamente identificados.</w:t>
+      </w:r>
+      <w:commentRangeEnd w:id="0"/>
+      <w:r>
+        <w:rPr>
+          <w:rStyle w:val="Refdecomentrio"/>
+          <w:sz w:val="24"/>
+          <w:szCs w:val="22"/>
+        </w:rPr>
+        <w:commentReference w:id="0"/>
+      </w:r>
+      <w:r>
+        <w:t xml:space="preserve"> </w:t>
+      </w:r>
+      <w:r>
+        <w:t xml:space="preserve">Além disso, </w:t>
+      </w:r>
+      <w:r>
+        <w:t>é recomendado</w:t>
+      </w:r>
+      <w:r>
+        <w:t xml:space="preserve"> bloquear o computador ao se ausentar, não compartilhar contas de </w:t>
+      </w:r>
+      <w:r>
+        <w:lastRenderedPageBreak/>
+        <w:t>acesso, evitar utilizar computadores públicos para acessar o projeto e encerrar a sessão do GitHub após o uso em equipamentos compartilhados. Também é importante verificar regularmente quais usuários possuem permissão de acesso ao repositório.</w:t>
+      </w:r>
+    </w:p>
+    <w:p>
+      <w:pPr>
+        <w:jc w:val="both"/>
+      </w:pPr>
+    </w:p>
+    <w:p>
+      <w:pPr>
+        <w:jc w:val="both"/>
+        <w:rPr>
+          <w:b/>
+          <w:bCs/>
+        </w:rPr>
+      </w:pPr>
+      <w:r>
+        <w:rPr>
+          <w:b/>
+          <w:bCs/>
+        </w:rPr>
+        <w:t xml:space="preserve">4.5 </w:t>
+      </w:r>
+      <w:r>
+        <w:rPr>
+          <w:b/>
+          <w:bCs/>
+        </w:rPr>
+        <w:t>Regras para senhas</w:t>
+      </w:r>
+    </w:p>
+    <w:p>
+      <w:pPr>
+        <w:jc w:val="both"/>
+      </w:pPr>
+      <w:commentRangeStart w:id="1"/>
+      <w:r>
+        <w:t>As senhas utilizadas no computador, no GitHub e em outros serviços relacionados ao projeto devem possuir no mínimo oito caracteres e combinar letras maiúsculas, letras minúsculas, números e símbolos</w:t>
+      </w:r>
+      <w:r>
+        <w:t xml:space="preserve"> especiais</w:t>
+      </w:r>
+      <w:r>
+        <w:t xml:space="preserve">. Senhas simples ou previsíveis devem ser evitadas, pois facilitam acessos não autorizados. Também não é </w:t>
+      </w:r>
+      <w:r>
+        <w:t xml:space="preserve">permitido </w:t>
+      </w:r>
+      <w:r>
+        <w:t>compartilhar senhas com colegas ou outras pessoas. Caso exista qualquer suspeita de vazamento, a senha deve ser alterada imediatamente. Sempre que possível, deve ser utilizada a autenticação em duas etapas para aumentar a proteção das contas utilizadas no projeto.</w:t>
+      </w:r>
+      <w:commentRangeEnd w:id="1"/>
+      <w:r>
+        <w:rPr>
+          <w:rStyle w:val="Refdecomentrio"/>
+          <w:sz w:val="24"/>
+          <w:szCs w:val="22"/>
+        </w:rPr>
+        <w:commentReference w:id="1"/>
+      </w:r>
+      <w:r>
+        <w:t xml:space="preserve"> </w:t>
+      </w:r>
+      <w:r>
+        <w:t>Também é recomendado utilizar senhas diferentes para cada serviço, evitar armazenar senhas em arquivos de texto sem proteção e não utilizar informações pessoais, como nome, data de nascimento ou número de telefone, na criação das senhas.</w:t>
+      </w:r>
+    </w:p>
+    <w:p>
+      <w:pPr>
+        <w:jc w:val="both"/>
+        <w:rPr>
+          <w:b/>
+          <w:bCs/>
+        </w:rPr>
+      </w:pPr>
+    </w:p>
+    <w:p>
+      <w:pPr>
+        <w:jc w:val="both"/>
+        <w:rPr>
+          <w:b/>
+          <w:bCs/>
+        </w:rPr>
+      </w:pPr>
+      <w:r>
+        <w:rPr>
+          <w:b/>
+          <w:bCs/>
+        </w:rPr>
+        <w:t xml:space="preserve">4.6 </w:t>
+      </w:r>
+      <w:r>
+        <w:rPr>
+          <w:b/>
+          <w:bCs/>
+        </w:rPr>
+        <w:t>Regras para alteração do código-fonte</w:t>
+      </w:r>
+    </w:p>
+    <w:p>
+      <w:pPr>
+        <w:jc w:val="both"/>
+      </w:pPr>
+      <w:commentRangeStart w:id="2"/>
+      <w:r>
+        <w:t>As alterações no código-fonte devem ser realizadas de maneira planejada e cuidadosa. Sempre que uma modificação importante for feita, o sistema deve ser testado para verificar se continua funcionando corretamente. Todas as mudanças devem ser registradas por meio de commits claros e objetivos, facilitando o acompanhamento do histórico do projeto. Nenhuma parte do código deve ser removida sem que sua função seja compreendida. Além disso, é importante manter uma versão estável e funcional do programa e registrar mudanças relevantes no arquivo README.md para garantir uma documentação atualizada.</w:t>
+      </w:r>
+      <w:commentRangeEnd w:id="2"/>
+      <w:r>
+        <w:rPr>
+          <w:rStyle w:val="Refdecomentrio"/>
+          <w:sz w:val="24"/>
+          <w:szCs w:val="22"/>
+        </w:rPr>
+        <w:commentReference w:id="2"/>
+      </w:r>
+    </w:p>
+    <w:p>
+      <w:pPr>
+        <w:jc w:val="both"/>
+      </w:pPr>
+      <w:r>
+        <w:t>Por exemplo, ao adicionar uma nova funcionalidade ao semáforo pode ser utilizado o commit "feat: adiciona controle do sinal amarelo". Para corrigir um erro no funcionamento do sistema, pode ser utilizado "fix: corrige tempo da via secundária". Quando houver atualização da documentação, pode ser utilizado "docs: atualiza descrição do projeto". Já para reorganizar o código sem alterar seu funcionamento, pode ser utilizado "refactor: reorganiza funções do semáforo".</w:t>
+      </w:r>
+    </w:p>
+    <w:p>
+      <w:pPr>
+        <w:jc w:val="both"/>
+      </w:pPr>
+    </w:p>
+    <w:p>
+      <w:pPr>
+        <w:jc w:val="both"/>
+        <w:rPr>
+          <w:b/>
+          <w:bCs/>
+        </w:rPr>
+      </w:pPr>
+      <w:r>
+        <w:rPr>
+          <w:b/>
+          <w:bCs/>
+        </w:rPr>
+        <w:lastRenderedPageBreak/>
+        <w:t>4.7 VULNERABILIDADES DETECTADAS</w:t>
+      </w:r>
+    </w:p>
+    <w:p>
+      <w:pPr>
+        <w:jc w:val="both"/>
+      </w:pPr>
+      <w:r>
+        <w:t>Vulnerabilidades são falhas ou fragilidades que podem comprometer a segurança ou o funcionamento do sistema.</w:t>
+      </w:r>
+    </w:p>
+    <w:tbl>
+      <w:tblPr>
+        <w:tblStyle w:val="Tabelacomgrade"/>
+        <w:tblW w:w="0" w:type="auto"/>
+        <w:tblLook w:val="04A0" w:firstRow="1" w:lastRow="0" w:firstColumn="1" w:lastColumn="0" w:noHBand="0" w:noVBand="1"/>
+      </w:tblPr>
+      <w:tblGrid>
+        <w:gridCol w:w="1626"/>
+        <w:gridCol w:w="2777"/>
+        <w:gridCol w:w="2483"/>
+        <w:gridCol w:w="2175"/>
+      </w:tblGrid>
+      <w:tr>
+        <w:tc>
+          <w:tcPr>
+            <w:tcW w:w="2265" w:type="dxa"/>
+          </w:tcPr>
+          <w:p>
+            <w:pPr>
+              <w:jc w:val="both"/>
+            </w:pPr>
+            <w:r>
+              <w:t>Código</w:t>
+            </w:r>
+          </w:p>
+        </w:tc>
+        <w:tc>
+          <w:tcPr>
+            <w:tcW w:w="2265" w:type="dxa"/>
+          </w:tcPr>
+          <w:p>
+            <w:pPr>
+              <w:jc w:val="both"/>
+            </w:pPr>
+            <w:r>
+              <w:t>Vulnerabilidade</w:t>
+            </w:r>
+          </w:p>
+        </w:tc>
+        <w:tc>
+          <w:tcPr>
+            <w:tcW w:w="2265" w:type="dxa"/>
+          </w:tcPr>
+          <w:p>
+            <w:pPr>
+              <w:jc w:val="both"/>
+            </w:pPr>
+            <w:r>
+              <w:t>Risco</w:t>
+            </w:r>
+          </w:p>
+        </w:tc>
+        <w:tc>
+          <w:tcPr>
+            <w:tcW w:w="2266" w:type="dxa"/>
+          </w:tcPr>
+          <w:p>
+            <w:pPr>
+              <w:jc w:val="both"/>
+            </w:pPr>
+            <w:r>
+              <w:t>Medida de prevenção</w:t>
+            </w:r>
+          </w:p>
+        </w:tc>
+      </w:tr>
+      <w:tr>
+        <w:tc>
+          <w:tcPr>
+            <w:tcW w:w="2265" w:type="dxa"/>
+          </w:tcPr>
+          <w:p>
+            <w:pPr>
+              <w:jc w:val="both"/>
+            </w:pPr>
+            <w:r>
+              <w:t>V01</w:t>
+            </w:r>
+          </w:p>
+        </w:tc>
+        <w:tc>
+          <w:tcPr>
+            <w:tcW w:w="2265" w:type="dxa"/>
+          </w:tcPr>
+          <w:p>
+            <w:pPr>
+              <w:jc w:val="both"/>
+            </w:pPr>
+            <w:r>
+              <w:t>Senha fraca no computador ou GitHub</w:t>
+            </w:r>
+          </w:p>
+        </w:tc>
+        <w:tc>
+          <w:tcPr>
+            <w:tcW w:w="2265" w:type="dxa"/>
+            <w:vAlign w:val="center"/>
+          </w:tcPr>
+          <w:p>
+            <w:pPr>
+              <w:jc w:val="both"/>
+            </w:pPr>
+            <w:r>
+              <w:t>Acesso indevido ao projeto</w:t>
+            </w:r>
+          </w:p>
+        </w:tc>
+        <w:tc>
+          <w:tcPr>
+            <w:tcW w:w="2266" w:type="dxa"/>
+          </w:tcPr>
+          <w:p>
+            <w:pPr>
+              <w:jc w:val="both"/>
+            </w:pPr>
+            <w:r>
+              <w:t>Utilizar senha forte e autenticação em duas etapas</w:t>
+            </w:r>
+          </w:p>
+        </w:tc>
+      </w:tr>
+      <w:tr>
+        <w:tc>
+          <w:tcPr>
+            <w:tcW w:w="2265" w:type="dxa"/>
+          </w:tcPr>
+          <w:p>
+            <w:pPr>
+              <w:jc w:val="both"/>
+            </w:pPr>
+            <w:r>
+              <w:t>V02</w:t>
+            </w:r>
+          </w:p>
+        </w:tc>
+        <w:tc>
+          <w:tcPr>
+            <w:tcW w:w="2265" w:type="dxa"/>
+          </w:tcPr>
+          <w:p>
+            <w:pPr>
+              <w:jc w:val="both"/>
+            </w:pPr>
+            <w:r>
+              <w:t>Código-fonte sem backup</w:t>
+            </w:r>
+          </w:p>
+        </w:tc>
+        <w:tc>
+          <w:tcPr>
+            <w:tcW w:w="2265" w:type="dxa"/>
+            <w:vAlign w:val="center"/>
+          </w:tcPr>
+          <w:p>
+            <w:pPr>
+              <w:jc w:val="both"/>
+            </w:pPr>
+            <w:r>
+              <w:t>Perda do projeto</w:t>
+            </w:r>
+          </w:p>
+        </w:tc>
+        <w:tc>
+          <w:tcPr>
+            <w:tcW w:w="2266" w:type="dxa"/>
+          </w:tcPr>
+          <w:p>
+            <w:pPr>
+              <w:jc w:val="both"/>
+            </w:pPr>
+            <w:r>
+              <w:t>Utilizar Git e GitHub para versionamento e backup</w:t>
+            </w:r>
+          </w:p>
+        </w:tc>
+      </w:tr>
+      <w:tr>
+        <w:tc>
+          <w:tcPr>
+            <w:tcW w:w="2265" w:type="dxa"/>
+          </w:tcPr>
+          <w:p>
+            <w:pPr>
+              <w:jc w:val="both"/>
+            </w:pPr>
+            <w:r>
+              <w:t>V03</w:t>
+            </w:r>
+          </w:p>
+        </w:tc>
+        <w:tc>
+          <w:tcPr>
+            <w:tcW w:w="2265" w:type="dxa"/>
+          </w:tcPr>
+          <w:p>
+            <w:pPr>
+              <w:jc w:val="both"/>
+            </w:pPr>
+            <w:r>
+              <w:t>Alteração incorreta dos tempos dos sinais</w:t>
+            </w:r>
+          </w:p>
+        </w:tc>
+        <w:tc>
+          <w:tcPr>
+            <w:tcW w:w="2265" w:type="dxa"/>
+            <w:vAlign w:val="center"/>
+          </w:tcPr>
+          <w:p>
+            <w:pPr>
+              <w:jc w:val="both"/>
+            </w:pPr>
+            <w:r>
+              <w:t>Funcionamento inseguro do semáforo</w:t>
+            </w:r>
+          </w:p>
+        </w:tc>
+        <w:tc>
+          <w:tcPr>
+            <w:tcW w:w="2266" w:type="dxa"/>
+          </w:tcPr>
+          <w:p>
+            <w:pPr>
+              <w:jc w:val="both"/>
+            </w:pPr>
+            <w:r>
+              <w:t>Validar os valores antes da execução</w:t>
+            </w:r>
+          </w:p>
+        </w:tc>
+      </w:tr>
+      <w:tr>
+        <w:tc>
+          <w:tcPr>
+            <w:tcW w:w="2265" w:type="dxa"/>
+          </w:tcPr>
+          <w:p>
+            <w:pPr>
+              <w:jc w:val="both"/>
+            </w:pPr>
+            <w:r>
+              <w:t>V04</w:t>
+            </w:r>
+          </w:p>
+        </w:tc>
+        <w:tc>
+          <w:tcPr>
+            <w:tcW w:w="2265" w:type="dxa"/>
+          </w:tcPr>
+          <w:p>
+            <w:pPr>
+              <w:jc w:val="both"/>
+            </w:pPr>
+            <w:r>
+              <w:t>Dois semáforos verdes ao mesmo tempo</w:t>
+            </w:r>
+          </w:p>
+        </w:tc>
+        <w:tc>
+          <w:tcPr>
+            <w:tcW w:w="2265" w:type="dxa"/>
+            <w:vAlign w:val="center"/>
+          </w:tcPr>
+          <w:p>
+            <w:pPr>
+              <w:jc w:val="both"/>
+            </w:pPr>
+            <w:r>
+              <w:t>Possibilidade de acidentes</w:t>
+            </w:r>
+          </w:p>
+        </w:tc>
+        <w:tc>
+          <w:tcPr>
+            <w:tcW w:w="2266" w:type="dxa"/>
+          </w:tcPr>
+          <w:p>
+            <w:pPr>
+              <w:jc w:val="both"/>
+            </w:pPr>
+            <w:r>
+              <w:t>Implementar lógica que impeça essa situação</w:t>
+            </w:r>
+          </w:p>
+        </w:tc>
+      </w:tr>
+      <w:tr>
+        <w:tc>
+          <w:tcPr>
+            <w:tcW w:w="2265" w:type="dxa"/>
+          </w:tcPr>
+          <w:p>
+            <w:pPr>
+              <w:jc w:val="both"/>
+            </w:pPr>
+            <w:r>
+              <w:t>V05</w:t>
+            </w:r>
+          </w:p>
+        </w:tc>
+        <w:tc>
+          <w:tcPr>
+            <w:tcW w:w="2265" w:type="dxa"/>
+          </w:tcPr>
+          <w:p>
+            <w:pPr>
+              <w:jc w:val="both"/>
+            </w:pPr>
+            <w:r>
+              <w:t>Arquivos desorganizados</w:t>
+            </w:r>
+          </w:p>
+        </w:tc>
+        <w:tc>
+          <w:tcPr>
+            <w:tcW w:w="2265" w:type="dxa"/>
+            <w:vAlign w:val="center"/>
+          </w:tcPr>
+          <w:p>
+            <w:pPr>
+              <w:jc w:val="both"/>
+            </w:pPr>
+            <w:r>
+              <w:t>Dificuldade de manutenção</w:t>
+            </w:r>
+          </w:p>
+        </w:tc>
+        <w:tc>
+          <w:tcPr>
+            <w:tcW w:w="2266" w:type="dxa"/>
+          </w:tcPr>
+          <w:p>
+            <w:pPr>
+              <w:jc w:val="both"/>
+            </w:pPr>
+            <w:r>
+              <w:t>Organizar pastas e utilizar nomes padronizados</w:t>
+            </w:r>
+          </w:p>
+        </w:tc>
+      </w:tr>
+      <w:tr>
+        <w:tc>
+          <w:tcPr>
+            <w:tcW w:w="2265" w:type="dxa"/>
+          </w:tcPr>
+          <w:p>
+            <w:pPr>
+              <w:jc w:val="both"/>
+            </w:pPr>
+            <w:r>
+              <w:t>V06</w:t>
+            </w:r>
+          </w:p>
+        </w:tc>
+        <w:tc>
+          <w:tcPr>
+            <w:tcW w:w="2265" w:type="dxa"/>
+          </w:tcPr>
+          <w:p>
+            <w:pPr>
+              <w:jc w:val="both"/>
+            </w:pPr>
+            <w:r>
+              <w:t>Permissões inadequadas no sistema operacional</w:t>
+            </w:r>
+          </w:p>
+        </w:tc>
+        <w:tc>
+          <w:tcPr>
+            <w:tcW w:w="2265" w:type="dxa"/>
+            <w:vAlign w:val="center"/>
+          </w:tcPr>
+          <w:p>
+            <w:pPr>
+              <w:jc w:val="both"/>
+            </w:pPr>
+            <w:r>
+              <w:t>Alteração indevida dos arquivos</w:t>
+            </w:r>
+          </w:p>
+        </w:tc>
+        <w:tc>
+          <w:tcPr>
+            <w:tcW w:w="2266" w:type="dxa"/>
+          </w:tcPr>
+          <w:p>
+            <w:pPr>
+              <w:jc w:val="both"/>
+            </w:pPr>
+            <w:r>
+              <w:t>Configurar permissões de acesso corretamente</w:t>
+            </w:r>
+          </w:p>
+        </w:tc>
+      </w:tr>
+      <w:tr>
+        <w:tc>
+          <w:tcPr>
+            <w:tcW w:w="2265" w:type="dxa"/>
+          </w:tcPr>
+          <w:p>
+            <w:pPr>
+              <w:jc w:val="both"/>
+            </w:pPr>
+            <w:r>
+              <w:t>V07</w:t>
+            </w:r>
+          </w:p>
+        </w:tc>
+        <w:tc>
+          <w:tcPr>
+            <w:tcW w:w="2265" w:type="dxa"/>
+          </w:tcPr>
+          <w:p>
+            <w:pPr>
+              <w:jc w:val="both"/>
+            </w:pPr>
+            <w:r>
+              <w:t>Firewall desativado</w:t>
+            </w:r>
+          </w:p>
+        </w:tc>
+        <w:tc>
+          <w:tcPr>
+            <w:tcW w:w="2265" w:type="dxa"/>
+            <w:vAlign w:val="center"/>
+          </w:tcPr>
+          <w:p>
+            <w:pPr>
+              <w:jc w:val="both"/>
+            </w:pPr>
+            <w:r>
+              <w:t>Maior exposição a ataques externos</w:t>
+            </w:r>
+          </w:p>
+        </w:tc>
+        <w:tc>
+          <w:tcPr>
+            <w:tcW w:w="2266" w:type="dxa"/>
+            <w:vAlign w:val="center"/>
+          </w:tcPr>
+          <w:p>
+            <w:pPr>
+              <w:jc w:val="both"/>
+            </w:pPr>
+            <w:r>
+              <w:t>Manter firewall ativo e atualizado</w:t>
+            </w:r>
+          </w:p>
+        </w:tc>
+      </w:tr>
+      <w:tr>
+        <w:tc>
+          <w:tcPr>
+            <w:tcW w:w="2265" w:type="dxa"/>
+          </w:tcPr>
+          <w:p>
+            <w:pPr>
+              <w:jc w:val="both"/>
+            </w:pPr>
+            <w:r>
+              <w:lastRenderedPageBreak/>
+              <w:t>V08</w:t>
+            </w:r>
+          </w:p>
+        </w:tc>
+        <w:tc>
+          <w:tcPr>
+            <w:tcW w:w="2265" w:type="dxa"/>
+          </w:tcPr>
+          <w:p>
+            <w:pPr>
+              <w:jc w:val="both"/>
+            </w:pPr>
+            <w:r>
+              <w:t>Falta de documentação</w:t>
+            </w:r>
+          </w:p>
+        </w:tc>
+        <w:tc>
+          <w:tcPr>
+            <w:tcW w:w="2265" w:type="dxa"/>
+          </w:tcPr>
+          <w:p>
+            <w:pPr>
+              <w:jc w:val="both"/>
+            </w:pPr>
+            <w:r>
+              <w:t>Dificuldade para manutenção e correção de falhas</w:t>
+            </w:r>
+          </w:p>
+        </w:tc>
+        <w:tc>
+          <w:tcPr>
+            <w:tcW w:w="2266" w:type="dxa"/>
+            <w:vAlign w:val="center"/>
+          </w:tcPr>
+          <w:p>
+            <w:pPr>
+              <w:jc w:val="both"/>
+            </w:pPr>
+            <w:r>
+              <w:t>Atualizar README.md e relatórios regularmente</w:t>
+            </w:r>
+          </w:p>
+        </w:tc>
+      </w:tr>
+      <w:tr>
+        <w:tc>
+          <w:tcPr>
+            <w:tcW w:w="2265" w:type="dxa"/>
+          </w:tcPr>
+          <w:p>
+            <w:pPr>
+              <w:jc w:val="both"/>
+            </w:pPr>
+            <w:r>
+              <w:t>V09</w:t>
+            </w:r>
+          </w:p>
+        </w:tc>
+        <w:tc>
+          <w:tcPr>
+            <w:tcW w:w="2265" w:type="dxa"/>
+          </w:tcPr>
+          <w:p>
+            <w:pPr>
+              <w:jc w:val="both"/>
+            </w:pPr>
+            <w:r>
+              <w:t>Uso de pendrive desconhecido</w:t>
+            </w:r>
+          </w:p>
+        </w:tc>
+        <w:tc>
+          <w:tcPr>
+            <w:tcW w:w="2265" w:type="dxa"/>
+            <w:vAlign w:val="center"/>
+          </w:tcPr>
+          <w:p>
+            <w:pPr>
+              <w:jc w:val="both"/>
+            </w:pPr>
+            <w:r>
+              <w:t>Contaminação por malware</w:t>
+            </w:r>
+          </w:p>
+        </w:tc>
+        <w:tc>
+          <w:tcPr>
+            <w:tcW w:w="2266" w:type="dxa"/>
+          </w:tcPr>
+          <w:p>
+            <w:pPr>
+              <w:jc w:val="both"/>
+            </w:pPr>
+            <w:r>
+              <w:t>Evitar dispositivos não confiáveis</w:t>
+            </w:r>
+          </w:p>
+        </w:tc>
+      </w:tr>
+      <w:tr>
+        <w:tc>
+          <w:tcPr>
+            <w:tcW w:w="2265" w:type="dxa"/>
+          </w:tcPr>
+          <w:p>
+            <w:pPr>
+              <w:jc w:val="both"/>
+            </w:pPr>
+            <w:r>
+              <w:t>V10</w:t>
+            </w:r>
+          </w:p>
+        </w:tc>
+        <w:tc>
+          <w:tcPr>
+            <w:tcW w:w="2265" w:type="dxa"/>
+          </w:tcPr>
+          <w:p>
+            <w:pPr>
+              <w:jc w:val="both"/>
+            </w:pPr>
+            <w:r>
+              <w:t>Repositório público contendo informações sensíveis</w:t>
+            </w:r>
+          </w:p>
+        </w:tc>
+        <w:tc>
+          <w:tcPr>
+            <w:tcW w:w="2265" w:type="dxa"/>
+          </w:tcPr>
+          <w:p>
+            <w:pPr>
+              <w:jc w:val="both"/>
+            </w:pPr>
+            <w:r>
+              <w:t>Exposição de dados importantes</w:t>
+            </w:r>
+          </w:p>
+        </w:tc>
+        <w:tc>
+          <w:tcPr>
+            <w:tcW w:w="2266" w:type="dxa"/>
+            <w:vAlign w:val="center"/>
+          </w:tcPr>
+          <w:p>
+            <w:pPr>
+              <w:jc w:val="both"/>
+            </w:pPr>
+            <w:r>
+              <w:t>Não armazenar senhas ou dados privados no repositório</w:t>
+            </w:r>
+          </w:p>
+        </w:tc>
+      </w:tr>
+      <w:tr>
+        <w:tc>
+          <w:tcPr>
+            <w:tcW w:w="2265" w:type="dxa"/>
+          </w:tcPr>
+          <w:p>
+            <w:pPr>
+              <w:jc w:val="both"/>
+            </w:pPr>
+            <w:r>
+              <w:t>V11</w:t>
+            </w:r>
+          </w:p>
+        </w:tc>
+        <w:tc>
+          <w:tcPr>
+            <w:tcW w:w="2265" w:type="dxa"/>
+          </w:tcPr>
+          <w:p>
+            <w:pPr>
+              <w:jc w:val="both"/>
+            </w:pPr>
+            <w:r>
+              <w:t>Exclusão acidental de arquivos do projeto</w:t>
+            </w:r>
+          </w:p>
+        </w:tc>
+        <w:tc>
+          <w:tcPr>
+            <w:tcW w:w="2265" w:type="dxa"/>
+          </w:tcPr>
+          <w:p>
+            <w:pPr>
+              <w:jc w:val="both"/>
+            </w:pPr>
+            <w:r>
+              <w:t>Interrupção do desenvolvimento</w:t>
+            </w:r>
+          </w:p>
+        </w:tc>
+        <w:tc>
+          <w:tcPr>
+            <w:tcW w:w="2266" w:type="dxa"/>
+          </w:tcPr>
+          <w:p>
+            <w:pPr>
+              <w:jc w:val="both"/>
+            </w:pPr>
+            <w:r>
+              <w:t>Realizar backups frequentes e utilizar controle de versão</w:t>
+            </w:r>
+          </w:p>
+        </w:tc>
+      </w:tr>
+      <w:tr>
+        <w:tc>
+          <w:tcPr>
+            <w:tcW w:w="2265" w:type="dxa"/>
+          </w:tcPr>
+          <w:p>
+            <w:pPr>
+              <w:jc w:val="both"/>
+            </w:pPr>
+            <w:r>
+              <w:t>V12</w:t>
+            </w:r>
+          </w:p>
+        </w:tc>
+        <w:tc>
+          <w:tcPr>
+            <w:tcW w:w="2265" w:type="dxa"/>
+          </w:tcPr>
+          <w:p>
+            <w:pPr>
+              <w:jc w:val="both"/>
+            </w:pPr>
+            <w:r>
+              <w:t>Falta de atualização do sistema operacional</w:t>
+            </w:r>
+          </w:p>
+        </w:tc>
+        <w:tc>
+          <w:tcPr>
+            <w:tcW w:w="2265" w:type="dxa"/>
+          </w:tcPr>
+          <w:p>
+            <w:pPr>
+              <w:jc w:val="both"/>
+            </w:pPr>
+            <w:r>
+              <w:t>Exploração de vulnerabilidades conhecidas</w:t>
+            </w:r>
+          </w:p>
+        </w:tc>
+        <w:tc>
+          <w:tcPr>
+            <w:tcW w:w="2266" w:type="dxa"/>
+          </w:tcPr>
+          <w:p>
+            <w:pPr>
+              <w:jc w:val="both"/>
+            </w:pPr>
+            <w:r>
+              <w:t>Manter atualizações de segurança instaladas</w:t>
+            </w:r>
+          </w:p>
+        </w:tc>
+      </w:tr>
+      <w:tr>
+        <w:tc>
+          <w:tcPr>
+            <w:tcW w:w="2265" w:type="dxa"/>
+          </w:tcPr>
+          <w:p>
+            <w:pPr>
+              <w:jc w:val="both"/>
+            </w:pPr>
+            <w:r>
+              <w:t>V13</w:t>
+            </w:r>
+          </w:p>
+        </w:tc>
+        <w:tc>
+          <w:tcPr>
+            <w:tcW w:w="2265" w:type="dxa"/>
+          </w:tcPr>
+          <w:p>
+            <w:pPr>
+              <w:jc w:val="both"/>
+            </w:pPr>
+            <w:r>
+              <w:t>Compartilhamento indevido de contas</w:t>
+            </w:r>
+          </w:p>
+        </w:tc>
+        <w:tc>
+          <w:tcPr>
+            <w:tcW w:w="2265" w:type="dxa"/>
+          </w:tcPr>
+          <w:p>
+            <w:pPr>
+              <w:jc w:val="both"/>
+            </w:pPr>
+            <w:r>
+              <w:t>Perda de controle sobre alterações realizadas</w:t>
+            </w:r>
+          </w:p>
+        </w:tc>
+        <w:tc>
+          <w:tcPr>
+            <w:tcW w:w="2266" w:type="dxa"/>
+          </w:tcPr>
+          <w:p>
+            <w:pPr>
+              <w:jc w:val="both"/>
+            </w:pPr>
+            <w:r>
+              <w:t>Utilizar contas individuais para cada usuário</w:t>
+            </w:r>
+          </w:p>
+        </w:tc>
+      </w:tr>
+      <w:tr>
+        <w:tc>
+          <w:tcPr>
+            <w:tcW w:w="2265" w:type="dxa"/>
+          </w:tcPr>
+          <w:p>
+            <w:pPr>
+              <w:jc w:val="both"/>
+            </w:pPr>
+            <w:r>
+              <w:t>V14</w:t>
+            </w:r>
+          </w:p>
+        </w:tc>
+        <w:tc>
+          <w:tcPr>
+            <w:tcW w:w="2265" w:type="dxa"/>
+          </w:tcPr>
+          <w:p>
+            <w:pPr>
+              <w:jc w:val="both"/>
+            </w:pPr>
+            <w:r>
+              <w:t>Falhas nos testes após alterações do código</w:t>
+            </w:r>
+          </w:p>
+        </w:tc>
+        <w:tc>
+          <w:tcPr>
+            <w:tcW w:w="2265" w:type="dxa"/>
+          </w:tcPr>
+          <w:p>
+            <w:pPr>
+              <w:jc w:val="both"/>
+            </w:pPr>
+            <w:r>
+              <w:t>Funcionamento incorreto do sistema</w:t>
+            </w:r>
+          </w:p>
+        </w:tc>
+        <w:tc>
+          <w:tcPr>
+            <w:tcW w:w="2266" w:type="dxa"/>
+            <w:vAlign w:val="center"/>
+          </w:tcPr>
+          <w:p>
+            <w:pPr>
+              <w:jc w:val="both"/>
+            </w:pPr>
+            <w:r>
+              <w:t>Executar testes após cada modificação relevante</w:t>
+            </w:r>
+          </w:p>
+        </w:tc>
+      </w:tr>
+      <w:tr>
+        <w:tc>
+          <w:tcPr>
+            <w:tcW w:w="2265" w:type="dxa"/>
+          </w:tcPr>
+          <w:p>
+            <w:pPr>
+              <w:jc w:val="both"/>
+            </w:pPr>
+            <w:r>
+              <w:t>V15</w:t>
+            </w:r>
+          </w:p>
+        </w:tc>
+        <w:tc>
+          <w:tcPr>
+            <w:tcW w:w="2265" w:type="dxa"/>
+          </w:tcPr>
+          <w:p>
+            <w:pPr>
+              <w:jc w:val="both"/>
+            </w:pPr>
+            <w:r>
+              <w:t>Falta de controle sobre permissões do GitHub</w:t>
+            </w:r>
+          </w:p>
+        </w:tc>
+        <w:tc>
+          <w:tcPr>
+            <w:tcW w:w="2265" w:type="dxa"/>
+          </w:tcPr>
+          <w:p>
+            <w:pPr>
+              <w:jc w:val="both"/>
+            </w:pPr>
+            <w:r>
+              <w:t>Alterações não autorizadas no repositório</w:t>
+            </w:r>
+          </w:p>
+        </w:tc>
+        <w:tc>
+          <w:tcPr>
+            <w:tcW w:w="2266" w:type="dxa"/>
+          </w:tcPr>
+          <w:p>
+            <w:pPr>
+              <w:jc w:val="both"/>
+            </w:pPr>
+            <w:r>
+              <w:t>Revisar regularmente as permissões dos colaboradores</w:t>
+            </w:r>
+          </w:p>
+        </w:tc>
+      </w:tr>
+    </w:tbl>
+    <w:p>
+      <w:pPr>
+        <w:jc w:val="both"/>
+        <w:rPr>
+          <w:vanish/>
+        </w:rPr>
+      </w:pPr>
+    </w:p>
+    <w:p>
+      <w:pPr>
+        <w:jc w:val="both"/>
+        <w:rPr>
+          <w:vanish/>
+        </w:rPr>
+      </w:pPr>
+    </w:p>
+    <w:p>
+      <w:pPr>
+        <w:jc w:val="both"/>
+        <w:rPr>
+          <w:vanish/>
+        </w:rPr>
+      </w:pPr>
+    </w:p>
+    <w:p>
+      <w:pPr>
+        <w:jc w:val="both"/>
+        <w:rPr>
+          <w:vanish/>
+        </w:rPr>
+      </w:pPr>
+    </w:p>
+    <w:p>
+      <w:pPr>
+        <w:jc w:val="both"/>
+        <w:rPr>
+          <w:vanish/>
+        </w:rPr>
+      </w:pPr>
+    </w:p>
+    <w:p>
+      <w:pPr>
+        <w:jc w:val="both"/>
+        <w:rPr>
+          <w:vanish/>
+        </w:rPr>
+      </w:pPr>
+    </w:p>
+    <w:p>
+      <w:pPr>
+        <w:jc w:val="both"/>
+        <w:rPr>
+          <w:vanish/>
+        </w:rPr>
+      </w:pPr>
+    </w:p>
+    <w:p>
+      <w:pPr>
+        <w:jc w:val="both"/>
+        <w:rPr>
+          <w:vanish/>
+        </w:rPr>
+      </w:pPr>
+    </w:p>
+    <w:p>
+      <w:pPr>
+        <w:jc w:val="both"/>
+        <w:rPr>
+          <w:vanish/>
+        </w:rPr>
+      </w:pPr>
+    </w:p>
+    <w:p>
+      <w:pPr>
+        <w:jc w:val="both"/>
+        <w:rPr>
+          <w:vanish/>
+        </w:rPr>
+      </w:pPr>
+    </w:p>
+    <w:p>
+      <w:pPr>
+        <w:jc w:val="both"/>
+        <w:rPr>
+          <w:vanish/>
+        </w:rPr>
+      </w:pPr>
+    </w:p>
+    <w:p>
+      <w:pPr>
+        <w:jc w:val="both"/>
+        <w:rPr>
+          <w:vanish/>
+        </w:rPr>
+      </w:pPr>
+    </w:p>
+    <w:p>
+      <w:pPr>
+        <w:ind w:firstLine="0"/>
+        <w:jc w:val="both"/>
+      </w:pPr>
+    </w:p>
+    <w:p>
+      <w:pPr>
+        <w:ind w:firstLine="708"/>
+        <w:jc w:val="both"/>
+        <w:rPr>
+          <w:b/>
+          <w:bCs/>
+        </w:rPr>
+      </w:pPr>
+      <w:r>
+        <w:rPr>
+          <w:b/>
+          <w:bCs/>
+        </w:rPr>
+        <w:lastRenderedPageBreak/>
+        <w:t>4.8 MEDIDAS DE PROTEÇÃO</w:t>
+      </w:r>
+      <w:r>
+        <w:rPr>
+          <w:b/>
+          <w:bCs/>
+        </w:rPr>
+        <w:t xml:space="preserve"> E PREVENÇÃO</w:t>
+      </w:r>
+    </w:p>
+    <w:p>
+      <w:pPr>
+        <w:ind w:firstLine="708"/>
+        <w:jc w:val="both"/>
+      </w:pPr>
+      <w:r>
+        <w:t>Para garantir a segurança do projeto Smart Flow, é necessário adotar medidas de proteção em diferentes áreas do sistema. Essas medidas têm como objetivo reduzir riscos de falhas, acessos não autorizados, perda de informações e problemas que possam comprometer o funcionamento do semáforo inteligente. A aplicação dessas práticas contribui para a integridade do código-fonte, a proteção dos arquivos do projeto e a confiabilidade do ambiente de desenvolvimento.</w:t>
+      </w:r>
+    </w:p>
+    <w:p>
+      <w:pPr>
+        <w:ind w:firstLine="0"/>
+        <w:jc w:val="both"/>
+      </w:pPr>
+    </w:p>
+    <w:p>
+      <w:pPr>
+        <w:ind w:firstLine="708"/>
+        <w:jc w:val="both"/>
+        <w:rPr>
+          <w:b/>
+          <w:bCs/>
+        </w:rPr>
+      </w:pPr>
+      <w:r>
+        <w:rPr>
+          <w:b/>
+          <w:bCs/>
+        </w:rPr>
+        <w:t xml:space="preserve">4.8.1 </w:t>
+      </w:r>
+      <w:r>
+        <w:rPr>
+          <w:b/>
+          <w:bCs/>
+        </w:rPr>
+        <w:t>Proteção do computador</w:t>
+      </w:r>
+    </w:p>
+    <w:p>
+      <w:pPr>
+        <w:jc w:val="both"/>
+      </w:pPr>
+      <w:r>
+        <w:t>A proteção do computador é fundamental para evitar acessos indevidos aos arquivos do projeto. O equipamento utilizado no desenvolvimento deve possuir usuário e senha de acesso, além de manter o sistema operacional atualizado. Também é recomendado utilizar ferramentas de proteção, como antivírus,</w:t>
+      </w:r>
+      <w:r>
+        <w:t xml:space="preserve"> e </w:t>
+      </w:r>
+      <w:r>
+        <w:t xml:space="preserve">evitar a instalação de programas desconhecidos e verificar </w:t>
+      </w:r>
+      <w:r>
+        <w:t>pendrives</w:t>
+      </w:r>
+      <w:r>
+        <w:t xml:space="preserve"> antes de conectá-los ao computador. Sempre que o usuário </w:t>
+      </w:r>
+      <w:r>
+        <w:t>não estiver usando o computador</w:t>
+      </w:r>
+      <w:r>
+        <w:t>, a tela deve ser bloqueada para impedir o uso não autorizado do equipamento.</w:t>
+      </w:r>
+    </w:p>
+    <w:p>
+      <w:pPr>
+        <w:jc w:val="both"/>
+      </w:pPr>
+    </w:p>
+    <w:p>
+      <w:pPr>
+        <w:jc w:val="both"/>
+        <w:rPr>
+          <w:b/>
+          <w:bCs/>
+        </w:rPr>
+      </w:pPr>
+      <w:r>
+        <w:rPr>
+          <w:b/>
+          <w:bCs/>
+        </w:rPr>
+        <w:t xml:space="preserve">4.8.2 </w:t>
+      </w:r>
+      <w:r>
+        <w:rPr>
+          <w:b/>
+          <w:bCs/>
+        </w:rPr>
+        <w:t>Proteção do sistema operacional</w:t>
+      </w:r>
+    </w:p>
+    <w:p>
+      <w:pPr>
+        <w:jc w:val="both"/>
+      </w:pPr>
+      <w:r>
+        <w:t xml:space="preserve">O sistema operacional deve ser configurado de forma segura para proteger os </w:t>
+      </w:r>
+      <w:r>
+        <w:t xml:space="preserve">componentes </w:t>
+      </w:r>
+      <w:r>
+        <w:t xml:space="preserve">utilizados no desenvolvimento. </w:t>
+      </w:r>
+      <w:r>
+        <w:t>Nele, é</w:t>
+      </w:r>
+      <w:r>
+        <w:t xml:space="preserve"> importante definir permissões adequadas para cada usuário, evitando que pessoas não autorizadas realizem alterações nos arquivos do projeto</w:t>
+      </w:r>
+      <w:r>
+        <w:t xml:space="preserve"> e a execução de programas desconhecidos</w:t>
+      </w:r>
+      <w:r>
+        <w:t>. Além disso, as atualizações de segurança devem ser mantidas em dia e o firewall nativo do sistema deve permanecer ativo para aumentar a proteção contra ameaças externas.</w:t>
+      </w:r>
+    </w:p>
+    <w:p>
+      <w:pPr>
+        <w:jc w:val="both"/>
+        <w:rPr>
+          <w:b/>
+          <w:bCs/>
+        </w:rPr>
+      </w:pPr>
+    </w:p>
+    <w:p>
+      <w:pPr>
+        <w:jc w:val="both"/>
+        <w:rPr>
+          <w:b/>
+          <w:bCs/>
+        </w:rPr>
+      </w:pPr>
+      <w:r>
+        <w:rPr>
+          <w:b/>
+          <w:bCs/>
+        </w:rPr>
+        <w:t xml:space="preserve">4.8.3 </w:t>
+      </w:r>
+      <w:r>
+        <w:rPr>
+          <w:b/>
+          <w:bCs/>
+        </w:rPr>
+        <w:t>Proteção do código-fonte</w:t>
+      </w:r>
+    </w:p>
+    <w:p>
+      <w:pPr>
+        <w:jc w:val="both"/>
+      </w:pPr>
+      <w:commentRangeStart w:id="3"/>
+      <w:r>
+        <w:t xml:space="preserve">O código-fonte representa </w:t>
+      </w:r>
+      <w:r>
+        <w:t>o núcleo do projeto</w:t>
+      </w:r>
+      <w:r>
+        <w:t xml:space="preserve"> e, por isso, </w:t>
+      </w:r>
+      <w:r>
+        <w:t xml:space="preserve">ele </w:t>
+      </w:r>
+      <w:r>
+        <w:t xml:space="preserve">deve receber atenção especial. </w:t>
+      </w:r>
+      <w:r>
+        <w:t>Para que essa proteção aconteça, o</w:t>
+      </w:r>
+      <w:r>
+        <w:t xml:space="preserve"> uso do Git</w:t>
+      </w:r>
+      <w:r>
+        <w:t xml:space="preserve"> é importante pois</w:t>
+      </w:r>
+      <w:r>
+        <w:t xml:space="preserve"> permite registrar alterações e recuperar versões anteriores quando necessário. </w:t>
+      </w:r>
+      <w:r>
+        <w:t>Nele, o</w:t>
+      </w:r>
+      <w:r>
+        <w:t>s commits devem ser realizados com frequência e de forma organizada, facilitando o acompanhamento do desenvolvimento. Também é importante manter backups atualizados no GitHub, testar as alterações antes de sua implementação definitiva e evitar o armazenamento de informações sensíveis dentro do código.</w:t>
+      </w:r>
+      <w:commentRangeEnd w:id="3"/>
+      <w:r>
+        <w:rPr>
+          <w:rStyle w:val="Refdecomentrio"/>
+          <w:sz w:val="24"/>
+          <w:szCs w:val="22"/>
+        </w:rPr>
+        <w:commentReference w:id="3"/>
+      </w:r>
+      <w:r>
+        <w:t xml:space="preserve"> Além disso, </w:t>
+      </w:r>
+      <w:r>
+        <w:t>é essencial</w:t>
+      </w:r>
+      <w:r>
+        <w:t xml:space="preserve"> utilizar nomes claros e autoexplicativos para arquivos, funções e variáveis, </w:t>
+      </w:r>
+      <w:r>
+        <w:lastRenderedPageBreak/>
+        <w:t>para facilitar</w:t>
+      </w:r>
+      <w:r>
+        <w:t xml:space="preserve"> a compreensão,</w:t>
+      </w:r>
+      <w:r>
+        <w:t xml:space="preserve"> </w:t>
+      </w:r>
+      <w:r>
+        <w:t>e a identificação de possíveis falhas durante o desenvolvimento do sistema.</w:t>
+      </w:r>
+    </w:p>
+    <w:p>
+      <w:pPr>
+        <w:jc w:val="both"/>
+      </w:pPr>
+    </w:p>
+    <w:p>
+      <w:pPr>
+        <w:jc w:val="both"/>
+        <w:rPr>
+          <w:b/>
+          <w:bCs/>
+        </w:rPr>
+      </w:pPr>
+      <w:r>
+        <w:rPr>
+          <w:b/>
+          <w:bCs/>
+        </w:rPr>
+        <w:t xml:space="preserve">4.8.4 </w:t>
+      </w:r>
+      <w:r>
+        <w:rPr>
+          <w:b/>
+          <w:bCs/>
+        </w:rPr>
+        <w:t>Proteção da rede</w:t>
+      </w:r>
+    </w:p>
+    <w:p>
+      <w:pPr>
+        <w:jc w:val="both"/>
+      </w:pPr>
+      <w:commentRangeStart w:id="4"/>
+      <w:r>
+        <w:t xml:space="preserve">A segurança da rede é </w:t>
+      </w:r>
+      <w:r>
+        <w:t>necessária</w:t>
+      </w:r>
+      <w:r>
+        <w:t xml:space="preserve"> para reduzir riscos de invasões e acessos indevidos. O firewall deve permanecer ativo durante o desenvolvimento e o acesso ao projeto deve ocorrer preferencialmente em redes confiáveis. Redes públicas ou desconhecidas devem ser evitadas, especialmente durante o acesso ao GitHub ou a outros serviços relacionados ao projeto. Quando necessário, o uso de VPN pode oferecer uma camada adicional de proteção para conexões remotas.</w:t>
+      </w:r>
+      <w:commentRangeEnd w:id="4"/>
+      <w:r>
+        <w:rPr>
+          <w:rStyle w:val="Refdecomentrio"/>
+          <w:sz w:val="24"/>
+          <w:szCs w:val="22"/>
+        </w:rPr>
+        <w:commentReference w:id="4"/>
+      </w:r>
+      <w:r>
+        <w:t xml:space="preserve"> </w:t>
+      </w:r>
+      <w:r>
+        <w:t>Também é importante utilizar senhas seguras nas redes Wi-Fi utilizadas durante o desenvolvimento, evitar a exposição de portas desnecessárias que possam facilitar acessos externos e, sempre que possível, monitorar tentativas de acesso indevido para identificar possíveis ameaças à segurança do sistema.</w:t>
+      </w:r>
+    </w:p>
+    <w:p>
+      <w:pPr>
+        <w:jc w:val="both"/>
+      </w:pPr>
+    </w:p>
+    <w:p>
+      <w:pPr>
+        <w:jc w:val="both"/>
+        <w:rPr>
+          <w:b/>
+          <w:bCs/>
+        </w:rPr>
+      </w:pPr>
+      <w:r>
+        <w:rPr>
+          <w:b/>
+          <w:bCs/>
+        </w:rPr>
+        <w:t xml:space="preserve">4.8.5 </w:t>
+      </w:r>
+      <w:r>
+        <w:rPr>
+          <w:b/>
+          <w:bCs/>
+        </w:rPr>
+        <w:t>Proteção do GitHub</w:t>
+      </w:r>
+    </w:p>
+    <w:p>
+      <w:pPr>
+        <w:jc w:val="both"/>
+      </w:pPr>
+      <w:commentRangeStart w:id="5"/>
+      <w:r>
+        <w:t>O GitHub é utilizado para armazenar e versionar os arquivos do projeto, sendo essencial para a segurança e organização do desenvolvimento. Para proteger a conta</w:t>
+      </w:r>
+      <w:r>
+        <w:t xml:space="preserve"> no GitHub</w:t>
+      </w:r>
+      <w:r>
+        <w:t xml:space="preserve">, </w:t>
+      </w:r>
+      <w:r>
+        <w:t xml:space="preserve">é preciso usar </w:t>
+      </w:r>
+      <w:r>
+        <w:t xml:space="preserve">senhas fortes e autenticação em duas etapas. O compartilhamento </w:t>
+      </w:r>
+      <w:r>
+        <w:t>de informações da conta</w:t>
+      </w:r>
+      <w:r>
+        <w:t xml:space="preserve"> deve ser evitado e os arquivos enviados ao repositório devem ser revisados para garantir que informações sensíveis não sejam publicadas. Além disso, o README.md deve permanecer atualizado para facilitar a compreensão e manutenção do projeto.</w:t>
+      </w:r>
+      <w:commentRangeEnd w:id="5"/>
+      <w:r>
+        <w:rPr>
+          <w:rStyle w:val="Refdecomentrio"/>
+          <w:sz w:val="24"/>
+          <w:szCs w:val="22"/>
+        </w:rPr>
+        <w:commentReference w:id="5"/>
+      </w:r>
+      <w:r>
+        <w:t xml:space="preserve"> </w:t>
+      </w:r>
+      <w:r>
+        <w:t xml:space="preserve">Também é importante não armazenar senhas, chaves de acesso ou qualquer outra informação sensível dentro dos arquivos do repositório, </w:t>
+      </w:r>
+      <w:r>
+        <w:t>para evitar</w:t>
+      </w:r>
+      <w:r>
+        <w:t xml:space="preserve"> </w:t>
+      </w:r>
+      <w:r>
+        <w:t>que</w:t>
+      </w:r>
+      <w:r>
+        <w:t xml:space="preserve"> dados que possam comprometer a segurança do projeto</w:t>
+      </w:r>
+      <w:r>
+        <w:t xml:space="preserve"> sejam expostos</w:t>
+      </w:r>
+      <w:r>
+        <w:t>.</w:t>
+      </w:r>
+    </w:p>
+    <w:p>
+      <w:pPr>
+        <w:jc w:val="both"/>
+      </w:pPr>
+    </w:p>
+    <w:p>
+      <w:pPr>
+        <w:jc w:val="both"/>
+        <w:rPr>
+          <w:b/>
+          <w:bCs/>
+        </w:rPr>
+      </w:pPr>
+      <w:r>
+        <w:rPr>
+          <w:b/>
+          <w:bCs/>
+        </w:rPr>
+        <w:t xml:space="preserve">4.9 </w:t>
+      </w:r>
+      <w:r>
+        <w:rPr>
+          <w:rFonts w:eastAsiaTheme="majorEastAsia" w:cstheme="majorBidi"/>
+          <w:b/>
+          <w:bCs/>
+          <w:color w:val="000000" w:themeColor="text1"/>
+          <w:szCs w:val="32"/>
+        </w:rPr>
+        <w:t>FIREWALL E SEGURANÇA DE REDE</w:t>
+      </w:r>
+    </w:p>
+    <w:p>
+      <w:pPr>
+        <w:jc w:val="both"/>
+        <w:rPr>
+          <w:rFonts w:eastAsiaTheme="majorEastAsia" w:cstheme="majorBidi"/>
+          <w:bCs/>
+          <w:color w:val="000000" w:themeColor="text1"/>
+          <w:szCs w:val="32"/>
+        </w:rPr>
+      </w:pPr>
+      <w:r>
+        <w:rPr>
+          <w:rFonts w:eastAsiaTheme="majorEastAsia" w:cstheme="majorBidi"/>
+          <w:bCs/>
+          <w:color w:val="000000" w:themeColor="text1"/>
+          <w:szCs w:val="32"/>
+        </w:rPr>
+        <w:t>O firewall é uma</w:t>
+      </w:r>
+      <w:r>
+        <w:rPr>
+          <w:rFonts w:eastAsiaTheme="majorEastAsia" w:cstheme="majorBidi"/>
+          <w:bCs/>
+          <w:color w:val="000000" w:themeColor="text1"/>
+          <w:szCs w:val="32"/>
+        </w:rPr>
+        <w:t xml:space="preserve"> ferramenta </w:t>
+      </w:r>
+      <w:r>
+        <w:rPr>
+          <w:rFonts w:eastAsiaTheme="majorEastAsia" w:cstheme="majorBidi"/>
+          <w:bCs/>
+          <w:color w:val="000000" w:themeColor="text1"/>
+          <w:szCs w:val="32"/>
+        </w:rPr>
+        <w:t xml:space="preserve">que </w:t>
+      </w:r>
+      <w:r>
+        <w:rPr>
+          <w:rFonts w:eastAsiaTheme="majorEastAsia" w:cstheme="majorBidi"/>
+          <w:bCs/>
+          <w:color w:val="000000" w:themeColor="text1"/>
+          <w:szCs w:val="32"/>
+        </w:rPr>
+        <w:t>reduz os riscos de invasões e contribui para a proteção dos arquivos e informações utilizadas no desenvolvimento do sistema.</w:t>
+      </w:r>
+      <w:r>
+        <w:rPr>
+          <w:rFonts w:eastAsiaTheme="majorEastAsia" w:cstheme="majorBidi"/>
+          <w:bCs/>
+          <w:color w:val="000000" w:themeColor="text1"/>
+          <w:szCs w:val="32"/>
+        </w:rPr>
+        <w:t xml:space="preserve"> E </w:t>
+      </w:r>
+      <w:r>
+        <w:rPr>
+          <w:rFonts w:eastAsiaTheme="majorEastAsia" w:cstheme="majorBidi"/>
+          <w:bCs/>
+          <w:color w:val="000000" w:themeColor="text1"/>
+          <w:szCs w:val="32"/>
+        </w:rPr>
+        <w:t xml:space="preserve">deve permanecer ativado durante todo o desenvolvimento do projeto, pois ele ajuda a controlar o tráfego de dados e bloquear acessos não autorizados ao computador. </w:t>
+      </w:r>
+      <w:commentRangeStart w:id="6"/>
+      <w:r>
+        <w:rPr>
+          <w:rFonts w:eastAsiaTheme="majorEastAsia" w:cstheme="majorBidi"/>
+          <w:bCs/>
+          <w:color w:val="000000" w:themeColor="text1"/>
+          <w:szCs w:val="32"/>
+        </w:rPr>
+        <w:t xml:space="preserve">Caso o semáforo inteligente utilize comunicação em rede em versões futuras, o </w:t>
+      </w:r>
+      <w:r>
+        <w:rPr>
+          <w:rFonts w:eastAsiaTheme="majorEastAsia" w:cstheme="majorBidi"/>
+          <w:bCs/>
+          <w:color w:val="000000" w:themeColor="text1"/>
+          <w:szCs w:val="32"/>
+        </w:rPr>
+        <w:lastRenderedPageBreak/>
+        <w:t>firewall poderá ser configurado para permitir apenas conexões necessárias e bloquear acessos suspeitos.</w:t>
+      </w:r>
+      <w:commentRangeEnd w:id="6"/>
+      <w:r>
+        <w:rPr>
+          <w:rStyle w:val="Refdecomentrio"/>
+          <w:rFonts w:eastAsiaTheme="majorEastAsia" w:cstheme="majorBidi"/>
+          <w:bCs/>
+          <w:color w:val="000000" w:themeColor="text1"/>
+          <w:sz w:val="24"/>
+          <w:szCs w:val="32"/>
+        </w:rPr>
+        <w:commentReference w:id="6"/>
+      </w:r>
+    </w:p>
+    <w:p>
+      <w:pPr>
+        <w:ind w:firstLine="0"/>
+        <w:jc w:val="both"/>
+        <w:rPr>
+          <w:bCs/>
+        </w:rPr>
+      </w:pPr>
+    </w:p>
+    <w:p>
+      <w:pPr>
+        <w:jc w:val="both"/>
+        <w:rPr>
+          <w:b/>
+        </w:rPr>
+      </w:pPr>
+      <w:r>
+        <w:rPr>
+          <w:b/>
+        </w:rPr>
+        <w:t>4.10 VPN E ACESSP REMOTO SEGURO</w:t>
+      </w:r>
+    </w:p>
+    <w:p>
+      <w:pPr>
+        <w:jc w:val="both"/>
+        <w:rPr>
+          <w:bCs/>
+        </w:rPr>
+      </w:pPr>
+      <w:r>
+        <w:rPr>
+          <w:bCs/>
+        </w:rPr>
+        <w:t>Em um cenário real, uma VPN poderia ser utilizada para permitir o acesso remoto seguro ao sistema do semáforo inteligente. Dessa forma,</w:t>
+      </w:r>
+      <w:r>
+        <w:rPr>
+          <w:bCs/>
+        </w:rPr>
+        <w:t xml:space="preserve"> no contexto do semáforo, os</w:t>
+      </w:r>
+      <w:r>
+        <w:rPr>
+          <w:bCs/>
+        </w:rPr>
+        <w:t xml:space="preserve"> técnicos autorizados poderiam realizar manutenções e atualizações sem expor diretamente o sistema à internet</w:t>
+      </w:r>
+      <w:r>
+        <w:rPr>
+          <w:bCs/>
+        </w:rPr>
+        <w:t xml:space="preserve"> pública</w:t>
+      </w:r>
+      <w:r>
+        <w:rPr>
+          <w:bCs/>
+        </w:rPr>
+        <w:t xml:space="preserve">. O uso </w:t>
+      </w:r>
+      <w:r>
+        <w:rPr>
+          <w:bCs/>
+        </w:rPr>
+        <w:t>da</w:t>
+      </w:r>
+      <w:r>
+        <w:rPr>
+          <w:bCs/>
+        </w:rPr>
+        <w:t xml:space="preserve"> VPN aumenta</w:t>
+      </w:r>
+      <w:r>
+        <w:rPr>
+          <w:bCs/>
+        </w:rPr>
+        <w:t>rá</w:t>
+      </w:r>
+      <w:r>
+        <w:rPr>
+          <w:bCs/>
+        </w:rPr>
+        <w:t xml:space="preserve"> a segurança da comunicação, reduzindo os riscos de interceptação de dados e acessos indevidos</w:t>
+      </w:r>
+      <w:r>
+        <w:rPr>
+          <w:bCs/>
+        </w:rPr>
+        <w:t xml:space="preserve"> via internet</w:t>
+      </w:r>
+      <w:r>
+        <w:rPr>
+          <w:bCs/>
+        </w:rPr>
+        <w:t>.</w:t>
+      </w:r>
+    </w:p>
+    <w:p>
+      <w:pPr>
+        <w:jc w:val="both"/>
+        <w:rPr>
+          <w:b/>
+        </w:rPr>
+      </w:pPr>
+    </w:p>
+    <w:p>
+      <w:pPr>
+        <w:jc w:val="both"/>
+        <w:rPr>
+          <w:b/>
+        </w:rPr>
+      </w:pPr>
+      <w:r>
+        <w:rPr>
+          <w:b/>
+        </w:rPr>
+        <w:t>4.11 RELAÇÃO COM A LGPD E BOAS PRÁTICAS</w:t>
+      </w:r>
+    </w:p>
+    <w:p>
+      <w:pPr>
+        <w:jc w:val="both"/>
+        <w:rPr>
+          <w:bCs/>
+        </w:rPr>
+      </w:pPr>
+      <w:commentRangeStart w:id="7"/>
+      <w:r>
+        <w:rPr>
+          <w:bCs/>
+        </w:rPr>
+        <w:t>Embora o projeto Smart Flow não tenha como foco principal o armazenamento de dados pessoais, é importante seguir os princípios da Lei Geral de Proteção de Dados. Caso o sistema passe a registrar informações de usuários, operadores, acessos ou imagens capturadas por câmeras, esses dados deverão ser protegidos adequadamente.</w:t>
+      </w:r>
+      <w:commentRangeEnd w:id="7"/>
+      <w:r>
+        <w:rPr>
+          <w:rStyle w:val="Refdecomentrio"/>
+          <w:sz w:val="24"/>
+          <w:szCs w:val="22"/>
+        </w:rPr>
+        <w:commentReference w:id="7"/>
+      </w:r>
+      <w:r>
+        <w:t xml:space="preserve"> </w:t>
+      </w:r>
+      <w:r>
+        <w:rPr>
+          <w:bCs/>
+        </w:rPr>
+        <w:t>Por exemplo, se forem cadastrados técnicos responsáveis pela manutenção do sistema, apenas informações necessárias para identificação e controle de acesso devem ser armazenadas. Da mesma forma, caso sejam utilizadas câmeras de monitoramento, as imagens deverão ser acessadas apenas por pessoas autorizadas e utilizadas somente para fins relacionados ao funcionamento e à segurança do sistema. Essas medidas ajudam a garantir maior proteção das informações e conformidade com a LGPD.</w:t>
+      </w:r>
+    </w:p>
+    <w:p>
+      <w:pPr>
+        <w:ind w:firstLine="0"/>
+        <w:jc w:val="both"/>
+      </w:pPr>
+    </w:p>
+    <w:p>
+      <w:pPr>
+        <w:ind w:firstLine="708"/>
+        <w:jc w:val="both"/>
+        <w:rPr>
+          <w:b/>
+          <w:bCs/>
+        </w:rPr>
+      </w:pPr>
+      <w:r>
+        <w:rPr>
+          <w:b/>
+          <w:bCs/>
+        </w:rPr>
+        <w:t xml:space="preserve">4. 12 </w:t>
+      </w:r>
+      <w:r>
+        <w:rPr>
+          <w:b/>
+          <w:bCs/>
+        </w:rPr>
+        <w:t>REPOSITÓRIO GITHUB</w:t>
+      </w:r>
+    </w:p>
+    <w:p>
+      <w:pPr>
+        <w:jc w:val="both"/>
+      </w:pPr>
+      <w:r>
+        <w:t>O Git é uma ferramenta utilizada para o controle de versão</w:t>
       </w:r>
       <w:r>
         <w:t>, ele permite salvar cada alteração feita na programação do semáforo.</w:t>
@@ -3830,35 +5889,35 @@
         <w:t>no mesmo código d</w:t>
       </w:r>
       <w:r>
-        <w:t xml:space="preserve">e </w:t>
+        <w:t xml:space="preserve">e forma eficiente. </w:t>
+      </w:r>
+      <w:r>
+        <w:t>O</w:t>
+      </w:r>
+      <w:r>
+        <w:t xml:space="preserve"> </w:t>
+      </w:r>
+      <w:r>
+        <w:t xml:space="preserve">controle de versão evita que os integrantes da equipe façam a mesma parte do projeto de formas diferentes ou que um </w:t>
+      </w:r>
+      <w:r>
+        <w:t xml:space="preserve">arquivo seja apagado </w:t>
+      </w:r>
+      <w:r>
+        <w:t xml:space="preserve">acidentalmente </w:t>
+      </w:r>
+      <w:r>
+        <w:t xml:space="preserve">por outras pessoas. Assim, todos conseguirão </w:t>
+      </w:r>
+      <w:r>
+        <w:t>acompanhar</w:t>
+      </w:r>
+      <w:r>
+        <w:t xml:space="preserve"> o que está </w:t>
       </w:r>
       <w:r>
         <w:lastRenderedPageBreak/>
-        <w:t xml:space="preserve">forma eficiente. </w:t>
-      </w:r>
-      <w:r>
-        <w:t>O</w:t>
-      </w:r>
-      <w:r>
-        <w:t xml:space="preserve"> </w:t>
-      </w:r>
-      <w:r>
-        <w:t xml:space="preserve">controle de versão evita que os integrantes da equipe façam a mesma parte do projeto de formas diferentes ou que um </w:t>
-      </w:r>
-      <w:r>
-        <w:t xml:space="preserve">arquivo seja apagado </w:t>
-      </w:r>
-      <w:r>
-        <w:t xml:space="preserve">acidentalmente </w:t>
-      </w:r>
-      <w:r>
-        <w:t xml:space="preserve">por outras pessoas. Assim, todos conseguirão </w:t>
-      </w:r>
-      <w:r>
-        <w:t>acompanhar</w:t>
-      </w:r>
-      <w:r>
-        <w:t xml:space="preserve"> o que está sendo desenvolvido, por meio da atualização </w:t>
+        <w:t xml:space="preserve">sendo desenvolvido, por meio da atualização </w:t>
       </w:r>
       <w:r>
         <w:t xml:space="preserve">constante </w:t>
@@ -3968,7 +6027,7 @@
                     <pic:cNvPicPr/>
                   </pic:nvPicPr>
                   <pic:blipFill>
-                    <a:blip r:embed="rId5"/>
+                    <a:blip r:embed="rId9"/>
                     <a:stretch>
                       <a:fillRect/>
                     </a:stretch>
@@ -4028,6 +6087,16 @@
     <w:p>
       <w:pPr>
         <w:ind w:firstLine="0"/>
+      </w:pPr>
+    </w:p>
+    <w:p>
+      <w:pPr>
+        <w:ind w:firstLine="0"/>
+      </w:pPr>
+    </w:p>
+    <w:p>
+      <w:pPr>
+        <w:ind w:firstLine="0"/>
         <w:jc w:val="both"/>
         <w:rPr>
           <w:b/>
@@ -4070,7 +6139,7 @@
       <w:r>
         <w:t>: etapas e técnicas. Disponível em:</w:t>
       </w:r>
-      <w:hyperlink r:id="rId6" w:history="1">
+      <w:hyperlink r:id="rId10" w:history="1">
         <w:r>
           <w:rPr>
             <w:rStyle w:val="Hyperlink"/>
@@ -4109,7 +6178,7 @@
       <w:r>
         <w:t>:</w:t>
       </w:r>
-      <w:hyperlink r:id="rId7" w:history="1">
+      <w:hyperlink r:id="rId11" w:history="1">
         <w:r>
           <w:rPr>
             <w:rStyle w:val="Hyperlink"/>
@@ -4146,7 +6215,7 @@
       <w:r>
         <w:t>. Disponível em:</w:t>
       </w:r>
-      <w:hyperlink r:id="rId8" w:history="1">
+      <w:hyperlink r:id="rId12" w:history="1">
         <w:r>
           <w:rPr>
             <w:rStyle w:val="Hyperlink"/>
@@ -4185,7 +6254,7 @@
       <w:r>
         <w:t xml:space="preserve"> </w:t>
       </w:r>
-      <w:hyperlink r:id="rId9" w:history="1">
+      <w:hyperlink r:id="rId13" w:history="1">
         <w:r>
           <w:rPr>
             <w:rStyle w:val="Hyperlink"/>
@@ -4224,7 +6293,7 @@
       <w:r>
         <w:t xml:space="preserve"> </w:t>
       </w:r>
-      <w:hyperlink r:id="rId10" w:history="1">
+      <w:hyperlink r:id="rId14" w:history="1">
         <w:r>
           <w:rPr>
             <w:rStyle w:val="Hyperlink"/>
@@ -4260,7 +6329,7 @@
       <w:r>
         <w:t xml:space="preserve">: inteligência artificial conversacional. Disponível em: </w:t>
       </w:r>
-      <w:hyperlink r:id="rId11" w:tgtFrame="_blank" w:history="1">
+      <w:hyperlink r:id="rId15" w:tgtFrame="_blank" w:history="1">
         <w:r>
           <w:rPr>
             <w:rStyle w:val="Hyperlink"/>
@@ -4336,6 +6405,186 @@
     </w:sectPr>
   </w:body>
 </w:document>
+</file>
+
+<file path=word/comments.xml><?xml version="1.0" encoding="utf-8"?>
+<w:comments xmlns:wpc="http://schemas.microsoft.com/office/word/2010/wordprocessingCanvas" xmlns:cx="http://schemas.microsoft.com/office/drawing/2014/chartex" xmlns:cx1="http://schemas.microsoft.com/office/drawing/2015/9/8/chartex" xmlns:cx2="http://schemas.microsoft.com/office/drawing/2015/10/21/chartex" xmlns:cx3="http://schemas.microsoft.com/office/drawing/2016/5/9/chartex" xmlns:cx4="http://schemas.microsoft.com/office/drawing/2016/5/10/chartex" xmlns:cx5="http://schemas.microsoft.com/office/drawing/2016/5/11/chartex" xmlns:cx6="http://schemas.microsoft.com/office/drawing/2016/5/12/chartex" xmlns:cx7="http://schemas.microsoft.com/office/drawing/2016/5/13/chartex" xmlns:cx8="http://schemas.microsoft.com/office/drawing/2016/5/14/chartex" xmlns:mc="http://schemas.openxmlformats.org/markup-compatibility/2006" xmlns:aink="http://schemas.microsoft.com/office/drawing/2016/ink" xmlns:am3d="http://schemas.microsoft.com/office/drawing/2017/model3d" xmlns:o="urn:schemas-microsoft-com:office:office" xmlns:oel="http://schemas.microsoft.com/office/2019/extlst" xmlns:r="http://schemas.openxmlformats.org/officeDocument/2006/relationships" xmlns:m="http://schemas.openxmlformats.org/officeDocument/2006/math" xmlns:v="urn:schemas-microsoft-com:vml" xmlns:wp14="http://schemas.microsoft.com/office/word/2010/wordprocessingDrawing" xmlns:wp="http://schemas.openxmlformats.org/drawingml/2006/wordprocessingDrawing" xmlns:w10="urn:schemas-microsoft-com:office:word" xmlns:w="http://schemas.openxmlformats.org/wordprocessingml/2006/main" xmlns:w14="http://schemas.microsoft.com/office/word/2010/wordml" xmlns:w15="http://schemas.microsoft.com/office/word/2012/wordml" xmlns:w16cex="http://schemas.microsoft.com/office/word/2018/wordml/cex" xmlns:w16cid="http://schemas.microsoft.com/office/word/2016/wordml/cid" xmlns:w16="http://schemas.microsoft.com/office/word/2018/wordml" xmlns:w16du="http://schemas.microsoft.com/office/word/2023/wordml/word16du" xmlns:w16sdtdh="http://schemas.microsoft.com/office/word/2020/wordml/sdtdatahash" xmlns:w16sdtfl="http://schemas.microsoft.com/office/word/2024/wordml/sdtformatlock" xmlns:w16se="http://schemas.microsoft.com/office/word/2015/wordml/symex" xmlns:wpg="http://schemas.microsoft.com/office/word/2010/wordprocessingGroup" xmlns:wpi="http://schemas.microsoft.com/office/word/2010/wordprocessingInk" xmlns:wne="http://schemas.microsoft.com/office/word/2006/wordml" xmlns:wps="http://schemas.microsoft.com/office/word/2010/wordprocessingShape" mc:Ignorable="w14 w15 w16se w16cid w16 w16cex w16sdtdh w16sdtfl w16du wp14">
+  <w:comment w:id="0" w:author="ISABELLA SOUSA BATISTA" w:date="2026-06-09T11:25:00Z" w:initials="IB">
+    <w:p>
+      <w:pPr>
+        <w:pStyle w:val="Textodecomentrio"/>
+        <w:ind w:firstLine="0"/>
+      </w:pPr>
+      <w:r>
+        <w:rPr>
+          <w:rStyle w:val="Refdecomentrio"/>
+        </w:rPr>
+        <w:annotationRef/>
+      </w:r>
+      <w:r>
+        <w:t>Adicionar mais regras</w:t>
+      </w:r>
+    </w:p>
+  </w:comment>
+  <w:comment w:id="1" w:author="ISABELLA SOUSA BATISTA" w:date="2026-06-09T11:27:00Z" w:initials="IB">
+    <w:p>
+      <w:pPr>
+        <w:pStyle w:val="Textodecomentrio"/>
+        <w:ind w:firstLine="0"/>
+      </w:pPr>
+      <w:r>
+        <w:rPr>
+          <w:rStyle w:val="Refdecomentrio"/>
+        </w:rPr>
+        <w:annotationRef/>
+      </w:r>
+      <w:r>
+        <w:t>Adicionar mais regras para as senhas</w:t>
+      </w:r>
+    </w:p>
+  </w:comment>
+  <w:comment w:id="2" w:author="ISABELLA SOUSA BATISTA" w:date="2026-06-09T13:07:00Z" w:initials="IB">
+    <w:p>
+      <w:pPr>
+        <w:pStyle w:val="Textodecomentrio"/>
+        <w:ind w:firstLine="0"/>
+      </w:pPr>
+      <w:r>
+        <w:rPr>
+          <w:rStyle w:val="Refdecomentrio"/>
+        </w:rPr>
+        <w:annotationRef/>
+      </w:r>
+      <w:r>
+        <w:t>Adicionar mais exemplos de precauções e exemplos de commit, feat etc.</w:t>
+      </w:r>
+    </w:p>
+  </w:comment>
+  <w:comment w:id="3" w:author="ISABELLA SOUSA BATISTA" w:date="2026-06-09T14:56:00Z" w:initials="IB">
+    <w:p>
+      <w:pPr>
+        <w:pStyle w:val="Textodecomentrio"/>
+        <w:ind w:firstLine="0"/>
+      </w:pPr>
+      <w:r>
+        <w:rPr>
+          <w:rStyle w:val="Refdecomentrio"/>
+        </w:rPr>
+        <w:annotationRef/>
+      </w:r>
+      <w:r>
+        <w:t>Faltou utilizar nomes claros para arquivos e funções</w:t>
+      </w:r>
+    </w:p>
+  </w:comment>
+  <w:comment w:id="4" w:author="ISABELLA SOUSA BATISTA" w:date="2026-06-09T14:59:00Z" w:initials="IB">
+    <w:p>
+      <w:pPr>
+        <w:pStyle w:val="Textodecomentrio"/>
+        <w:ind w:firstLine="0"/>
+      </w:pPr>
+      <w:r>
+        <w:rPr>
+          <w:rStyle w:val="Refdecomentrio"/>
+        </w:rPr>
+        <w:annotationRef/>
+      </w:r>
+      <w:r>
+        <w:t>Faltou monitorar acessos indevidos, expor portas desnecessárias, e utilizar senhas seguras em rede wi-fi</w:t>
+      </w:r>
+    </w:p>
+  </w:comment>
+  <w:comment w:id="5" w:author="ISABELLA SOUSA BATISTA" w:date="2026-06-09T15:02:00Z" w:initials="IB">
+    <w:p>
+      <w:pPr>
+        <w:pStyle w:val="Textodecomentrio"/>
+        <w:ind w:firstLine="0"/>
+      </w:pPr>
+      <w:r>
+        <w:rPr>
+          <w:rStyle w:val="Refdecomentrio"/>
+        </w:rPr>
+        <w:annotationRef/>
+      </w:r>
+      <w:r>
+        <w:t>Faltou falar para não salvar senhas dentro do repositório</w:t>
+      </w:r>
+    </w:p>
+  </w:comment>
+  <w:comment w:id="6" w:author="ISABELLA SOUSA BATISTA" w:date="2026-06-09T13:28:00Z" w:initials="IB">
+    <w:p>
+      <w:pPr>
+        <w:pStyle w:val="Textodecomentrio"/>
+        <w:ind w:firstLine="0"/>
+      </w:pPr>
+      <w:r>
+        <w:rPr>
+          <w:rStyle w:val="Refdecomentrio"/>
+        </w:rPr>
+        <w:annotationRef/>
+      </w:r>
+      <w:r>
+        <w:t>Entender e explorar mais o uso do firewall</w:t>
+      </w:r>
+    </w:p>
+  </w:comment>
+  <w:comment w:id="7" w:author="ISABELLA SOUSA BATISTA" w:date="2026-06-09T13:39:00Z" w:initials="IB">
+    <w:p>
+      <w:pPr>
+        <w:pStyle w:val="Textodecomentrio"/>
+        <w:ind w:firstLine="0"/>
+      </w:pPr>
+      <w:r>
+        <w:rPr>
+          <w:rStyle w:val="Refdecomentrio"/>
+        </w:rPr>
+        <w:annotationRef/>
+      </w:r>
+      <w:r>
+        <w:t>Detalhar com exemplos</w:t>
+      </w:r>
+    </w:p>
+  </w:comment>
+</w:comments>
+</file>
+
+<file path=word/commentsExtended.xml><?xml version="1.0" encoding="utf-8"?>
+<w15:commentsEx xmlns:wpc="http://schemas.microsoft.com/office/word/2010/wordprocessingCanvas" xmlns:cx="http://schemas.microsoft.com/office/drawing/2014/chartex" xmlns:cx1="http://schemas.microsoft.com/office/drawing/2015/9/8/chartex" xmlns:cx2="http://schemas.microsoft.com/office/drawing/2015/10/21/chartex" xmlns:cx3="http://schemas.microsoft.com/office/drawing/2016/5/9/chartex" xmlns:cx4="http://schemas.microsoft.com/office/drawing/2016/5/10/chartex" xmlns:cx5="http://schemas.microsoft.com/office/drawing/2016/5/11/chartex" xmlns:cx6="http://schemas.microsoft.com/office/drawing/2016/5/12/chartex" xmlns:cx7="http://schemas.microsoft.com/office/drawing/2016/5/13/chartex" xmlns:cx8="http://schemas.microsoft.com/office/drawing/2016/5/14/chartex" xmlns:mc="http://schemas.openxmlformats.org/markup-compatibility/2006" xmlns:aink="http://schemas.microsoft.com/office/drawing/2016/ink" xmlns:am3d="http://schemas.microsoft.com/office/drawing/2017/model3d" xmlns:o="urn:schemas-microsoft-com:office:office" xmlns:oel="http://schemas.microsoft.com/office/2019/extlst" xmlns:r="http://schemas.openxmlformats.org/officeDocument/2006/relationships" xmlns:m="http://schemas.openxmlformats.org/officeDocument/2006/math" xmlns:v="urn:schemas-microsoft-com:vml" xmlns:wp14="http://schemas.microsoft.com/office/word/2010/wordprocessingDrawing" xmlns:wp="http://schemas.openxmlformats.org/drawingml/2006/wordprocessingDrawing" xmlns:w10="urn:schemas-microsoft-com:office:word" xmlns:w="http://schemas.openxmlformats.org/wordprocessingml/2006/main" xmlns:w14="http://schemas.microsoft.com/office/word/2010/wordml" xmlns:w15="http://schemas.microsoft.com/office/word/2012/wordml" xmlns:w16cex="http://schemas.microsoft.com/office/word/2018/wordml/cex" xmlns:w16cid="http://schemas.microsoft.com/office/word/2016/wordml/cid" xmlns:w16="http://schemas.microsoft.com/office/word/2018/wordml" xmlns:w16du="http://schemas.microsoft.com/office/word/2023/wordml/word16du" xmlns:w16sdtdh="http://schemas.microsoft.com/office/word/2020/wordml/sdtdatahash" xmlns:w16sdtfl="http://schemas.microsoft.com/office/word/2024/wordml/sdtformatlock" xmlns:w16se="http://schemas.microsoft.com/office/word/2015/wordml/symex" xmlns:wpg="http://schemas.microsoft.com/office/word/2010/wordprocessingGroup" xmlns:wpi="http://schemas.microsoft.com/office/word/2010/wordprocessingInk" xmlns:wne="http://schemas.microsoft.com/office/word/2006/wordml" xmlns:wps="http://schemas.microsoft.com/office/word/2010/wordprocessingShape" mc:Ignorable="w14 w15 w16se w16cid w16 w16cex w16sdtdh w16sdtfl w16du wp14">
+  <w15:commentEx w15:paraId="34158266" w15:done="1"/>
+  <w15:commentEx w15:paraId="38384152" w15:done="1"/>
+  <w15:commentEx w15:paraId="612EBE74" w15:done="1"/>
+  <w15:commentEx w15:paraId="594D55E9" w15:done="1"/>
+  <w15:commentEx w15:paraId="06E5A975" w15:done="1"/>
+  <w15:commentEx w15:paraId="33A2B0DE" w15:done="1"/>
+  <w15:commentEx w15:paraId="0367F371" w15:done="1"/>
+  <w15:commentEx w15:paraId="45F2F1C5" w15:done="1"/>
+</w15:commentsEx>
+</file>
+
+<file path=word/commentsExtensible.xml><?xml version="1.0" encoding="utf-8"?>
+<w16cex:commentsExtensible xmlns:wpc="http://schemas.microsoft.com/office/word/2010/wordprocessingCanvas" xmlns:cx="http://schemas.microsoft.com/office/drawing/2014/chartex" xmlns:cx1="http://schemas.microsoft.com/office/drawing/2015/9/8/chartex" xmlns:cx2="http://schemas.microsoft.com/office/drawing/2015/10/21/chartex" xmlns:cx3="http://schemas.microsoft.com/office/drawing/2016/5/9/chartex" xmlns:cx4="http://schemas.microsoft.com/office/drawing/2016/5/10/chartex" xmlns:cx5="http://schemas.microsoft.com/office/drawing/2016/5/11/chartex" xmlns:cx6="http://schemas.microsoft.com/office/drawing/2016/5/12/chartex" xmlns:cx7="http://schemas.microsoft.com/office/drawing/2016/5/13/chartex" xmlns:cx8="http://schemas.microsoft.com/office/drawing/2016/5/14/chartex" xmlns:cr="http://schemas.microsoft.com/office/comments/2020/reactions" xmlns:mc="http://schemas.openxmlformats.org/markup-compatibility/2006" xmlns:aink="http://schemas.microsoft.com/office/drawing/2016/ink" xmlns:am3d="http://schemas.microsoft.com/office/drawing/2017/model3d" xmlns:o="urn:schemas-microsoft-com:office:office" xmlns:oel="http://schemas.microsoft.com/office/2019/extlst" xmlns:r="http://schemas.openxmlformats.org/officeDocument/2006/relationships" xmlns:m="http://schemas.openxmlformats.org/officeDocument/2006/math" xmlns:v="urn:schemas-microsoft-com:vml" xmlns:wp14="http://schemas.microsoft.com/office/word/2010/wordprocessingDrawing" xmlns:wp="http://schemas.openxmlformats.org/drawingml/2006/wordprocessingDrawing" xmlns:w10="urn:schemas-microsoft-com:office:word" xmlns:w="http://schemas.openxmlformats.org/wordprocessingml/2006/main" xmlns:w14="http://schemas.microsoft.com/office/word/2010/wordml" xmlns:w15="http://schemas.microsoft.com/office/word/2012/wordml" xmlns:w16cex="http://schemas.microsoft.com/office/word/2018/wordml/cex" xmlns:w16cid="http://schemas.microsoft.com/office/word/2016/wordml/cid" xmlns:w16="http://schemas.microsoft.com/office/word/2018/wordml" xmlns:w16du="http://schemas.microsoft.com/office/word/2023/wordml/word16du" xmlns:w16sdtdh="http://schemas.microsoft.com/office/word/2020/wordml/sdtdatahash" xmlns:w16sdtfl="http://schemas.microsoft.com/office/word/2024/wordml/sdtformatlock" xmlns:w16se="http://schemas.microsoft.com/office/word/2015/wordml/symex" xmlns:wpg="http://schemas.microsoft.com/office/word/2010/wordprocessingGroup" xmlns:wpi="http://schemas.microsoft.com/office/word/2010/wordprocessingInk" xmlns:wne="http://schemas.microsoft.com/office/word/2006/wordml" xmlns:wps="http://schemas.microsoft.com/office/word/2010/wordprocessingShape" mc:Ignorable="w14 w15 w16se w16cid w16 w16cex w16sdtdh w16sdtfl cr w16du wp14">
+  <w16cex:commentExtensible w16cex:durableId="66611094" w16cex:dateUtc="2026-06-09T14:25:00Z"/>
+  <w16cex:commentExtensible w16cex:durableId="609F76F1" w16cex:dateUtc="2026-06-09T14:27:00Z"/>
+  <w16cex:commentExtensible w16cex:durableId="715F6145" w16cex:dateUtc="2026-06-09T16:07:00Z"/>
+  <w16cex:commentExtensible w16cex:durableId="1B047A73" w16cex:dateUtc="2026-06-09T17:56:00Z"/>
+  <w16cex:commentExtensible w16cex:durableId="00F00611" w16cex:dateUtc="2026-06-09T17:59:00Z"/>
+  <w16cex:commentExtensible w16cex:durableId="4FBFE2CF" w16cex:dateUtc="2026-06-09T18:02:00Z"/>
+  <w16cex:commentExtensible w16cex:durableId="38CC4E6D" w16cex:dateUtc="2026-06-09T16:28:00Z"/>
+  <w16cex:commentExtensible w16cex:durableId="012A9DFF" w16cex:dateUtc="2026-06-09T16:39:00Z"/>
+</w16cex:commentsExtensible>
+</file>
+
+<file path=word/commentsIds.xml><?xml version="1.0" encoding="utf-8"?>
+<w16cid:commentsIds xmlns:wpc="http://schemas.microsoft.com/office/word/2010/wordprocessingCanvas" xmlns:cx="http://schemas.microsoft.com/office/drawing/2014/chartex" xmlns:cx1="http://schemas.microsoft.com/office/drawing/2015/9/8/chartex" xmlns:cx2="http://schemas.microsoft.com/office/drawing/2015/10/21/chartex" xmlns:cx3="http://schemas.microsoft.com/office/drawing/2016/5/9/chartex" xmlns:cx4="http://schemas.microsoft.com/office/drawing/2016/5/10/chartex" xmlns:cx5="http://schemas.microsoft.com/office/drawing/2016/5/11/chartex" xmlns:cx6="http://schemas.microsoft.com/office/drawing/2016/5/12/chartex" xmlns:cx7="http://schemas.microsoft.com/office/drawing/2016/5/13/chartex" xmlns:cx8="http://schemas.microsoft.com/office/drawing/2016/5/14/chartex" xmlns:mc="http://schemas.openxmlformats.org/markup-compatibility/2006" xmlns:aink="http://schemas.microsoft.com/office/drawing/2016/ink" xmlns:am3d="http://schemas.microsoft.com/office/drawing/2017/model3d" xmlns:o="urn:schemas-microsoft-com:office:office" xmlns:oel="http://schemas.microsoft.com/office/2019/extlst" xmlns:r="http://schemas.openxmlformats.org/officeDocument/2006/relationships" xmlns:m="http://schemas.openxmlformats.org/officeDocument/2006/math" xmlns:v="urn:schemas-microsoft-com:vml" xmlns:wp14="http://schemas.microsoft.com/office/word/2010/wordprocessingDrawing" xmlns:wp="http://schemas.openxmlformats.org/drawingml/2006/wordprocessingDrawing" xmlns:w10="urn:schemas-microsoft-com:office:word" xmlns:w="http://schemas.openxmlformats.org/wordprocessingml/2006/main" xmlns:w14="http://schemas.microsoft.com/office/word/2010/wordml" xmlns:w15="http://schemas.microsoft.com/office/word/2012/wordml" xmlns:w16cex="http://schemas.microsoft.com/office/word/2018/wordml/cex" xmlns:w16cid="http://schemas.microsoft.com/office/word/2016/wordml/cid" xmlns:w16="http://schemas.microsoft.com/office/word/2018/wordml" xmlns:w16du="http://schemas.microsoft.com/office/word/2023/wordml/word16du" xmlns:w16sdtdh="http://schemas.microsoft.com/office/word/2020/wordml/sdtdatahash" xmlns:w16sdtfl="http://schemas.microsoft.com/office/word/2024/wordml/sdtformatlock" xmlns:w16se="http://schemas.microsoft.com/office/word/2015/wordml/symex" xmlns:wpg="http://schemas.microsoft.com/office/word/2010/wordprocessingGroup" xmlns:wpi="http://schemas.microsoft.com/office/word/2010/wordprocessingInk" xmlns:wne="http://schemas.microsoft.com/office/word/2006/wordml" xmlns:wps="http://schemas.microsoft.com/office/word/2010/wordprocessingShape" mc:Ignorable="w14 w15 w16se w16cid w16 w16cex w16sdtdh w16sdtfl w16du wp14">
+  <w16cid:commentId w16cid:paraId="34158266" w16cid:durableId="66611094"/>
+  <w16cid:commentId w16cid:paraId="38384152" w16cid:durableId="609F76F1"/>
+  <w16cid:commentId w16cid:paraId="612EBE74" w16cid:durableId="715F6145"/>
+  <w16cid:commentId w16cid:paraId="594D55E9" w16cid:durableId="1B047A73"/>
+  <w16cid:commentId w16cid:paraId="06E5A975" w16cid:durableId="00F00611"/>
+  <w16cid:commentId w16cid:paraId="33A2B0DE" w16cid:durableId="4FBFE2CF"/>
+  <w16cid:commentId w16cid:paraId="0367F371" w16cid:durableId="38CC4E6D"/>
+  <w16cid:commentId w16cid:paraId="45F2F1C5" w16cid:durableId="012A9DFF"/>
+</w16cid:commentsIds>
 </file>
 
 <file path=word/numbering.xml><?xml version="1.0" encoding="utf-8"?>
@@ -5289,6 +7538,14 @@
     <w:abstractNumId w:val="8"/>
   </w:num>
 </w:numbering>
+</file>
+
+<file path=word/people.xml><?xml version="1.0" encoding="utf-8"?>
+<w15:people xmlns:wpc="http://schemas.microsoft.com/office/word/2010/wordprocessingCanvas" xmlns:cx="http://schemas.microsoft.com/office/drawing/2014/chartex" xmlns:cx1="http://schemas.microsoft.com/office/drawing/2015/9/8/chartex" xmlns:cx2="http://schemas.microsoft.com/office/drawing/2015/10/21/chartex" xmlns:cx3="http://schemas.microsoft.com/office/drawing/2016/5/9/chartex" xmlns:cx4="http://schemas.microsoft.com/office/drawing/2016/5/10/chartex" xmlns:cx5="http://schemas.microsoft.com/office/drawing/2016/5/11/chartex" xmlns:cx6="http://schemas.microsoft.com/office/drawing/2016/5/12/chartex" xmlns:cx7="http://schemas.microsoft.com/office/drawing/2016/5/13/chartex" xmlns:cx8="http://schemas.microsoft.com/office/drawing/2016/5/14/chartex" xmlns:mc="http://schemas.openxmlformats.org/markup-compatibility/2006" xmlns:aink="http://schemas.microsoft.com/office/drawing/2016/ink" xmlns:am3d="http://schemas.microsoft.com/office/drawing/2017/model3d" xmlns:o="urn:schemas-microsoft-com:office:office" xmlns:oel="http://schemas.microsoft.com/office/2019/extlst" xmlns:r="http://schemas.openxmlformats.org/officeDocument/2006/relationships" xmlns:m="http://schemas.openxmlformats.org/officeDocument/2006/math" xmlns:v="urn:schemas-microsoft-com:vml" xmlns:wp14="http://schemas.microsoft.com/office/word/2010/wordprocessingDrawing" xmlns:wp="http://schemas.openxmlformats.org/drawingml/2006/wordprocessingDrawing" xmlns:w10="urn:schemas-microsoft-com:office:word" xmlns:w="http://schemas.openxmlformats.org/wordprocessingml/2006/main" xmlns:w14="http://schemas.microsoft.com/office/word/2010/wordml" xmlns:w15="http://schemas.microsoft.com/office/word/2012/wordml" xmlns:w16cex="http://schemas.microsoft.com/office/word/2018/wordml/cex" xmlns:w16cid="http://schemas.microsoft.com/office/word/2016/wordml/cid" xmlns:w16="http://schemas.microsoft.com/office/word/2018/wordml" xmlns:w16du="http://schemas.microsoft.com/office/word/2023/wordml/word16du" xmlns:w16sdtdh="http://schemas.microsoft.com/office/word/2020/wordml/sdtdatahash" xmlns:w16sdtfl="http://schemas.microsoft.com/office/word/2024/wordml/sdtformatlock" xmlns:w16se="http://schemas.microsoft.com/office/word/2015/wordml/symex" xmlns:wpg="http://schemas.microsoft.com/office/word/2010/wordprocessingGroup" xmlns:wpi="http://schemas.microsoft.com/office/word/2010/wordprocessingInk" xmlns:wne="http://schemas.microsoft.com/office/word/2006/wordml" xmlns:wps="http://schemas.microsoft.com/office/word/2010/wordprocessingShape" mc:Ignorable="w14 w15 w16se w16cid w16 w16cex w16sdtdh w16sdtfl w16du wp14">
+  <w15:person w15:author="ISABELLA SOUSA BATISTA">
+    <w15:presenceInfo w15:providerId="AD" w15:userId="S::isabella.batista3@portalsesisp.org.br::dca36d55-cb7e-456c-9af0-def94ed8dfa3"/>
+  </w15:person>
+</w15:people>
 </file>
 
 <file path=word/styles.xml><?xml version="1.0" encoding="utf-8"?>
@@ -5721,10 +7978,31 @@
       <w:szCs w:val="32"/>
     </w:rPr>
   </w:style>
+  <w:style w:type="paragraph" w:styleId="Ttulo2">
+    <w:name w:val="heading 2"/>
+    <w:basedOn w:val="Normal"/>
+    <w:next w:val="Normal"/>
+    <w:link w:val="Ttulo2Char"/>
+    <w:uiPriority w:val="9"/>
+    <w:unhideWhenUsed/>
+    <w:qFormat/>
+    <w:rsid w:val="00C321E7"/>
+    <w:pPr>
+      <w:keepNext/>
+      <w:keepLines/>
+      <w:spacing w:before="40"/>
+      <w:outlineLvl w:val="1"/>
+    </w:pPr>
+    <w:rPr>
+      <w:rFonts w:asciiTheme="majorHAnsi" w:eastAsiaTheme="majorEastAsia" w:hAnsiTheme="majorHAnsi" w:cstheme="majorBidi"/>
+      <w:color w:val="2F5496" w:themeColor="accent1" w:themeShade="BF"/>
+      <w:sz w:val="26"/>
+      <w:szCs w:val="26"/>
+    </w:rPr>
+  </w:style>
   <w:style w:type="character" w:default="1" w:styleId="Fontepargpadro">
     <w:name w:val="Default Paragraph Font"/>
     <w:uiPriority w:val="1"/>
-    <w:semiHidden/>
     <w:unhideWhenUsed/>
   </w:style>
   <w:style w:type="table" w:default="1" w:styleId="Tabelanormal">
@@ -5843,6 +8121,58 @@
     <w:rPr>
       <w:color w:val="605E5C"/>
       <w:shd w:val="clear" w:color="auto" w:fill="E1DFDD"/>
+    </w:rPr>
+  </w:style>
+  <w:style w:type="character" w:customStyle="1" w:styleId="Ttulo2Char">
+    <w:name w:val="Título 2 Char"/>
+    <w:basedOn w:val="Fontepargpadro"/>
+    <w:link w:val="Ttulo2"/>
+    <w:uiPriority w:val="9"/>
+    <w:rsid w:val="00C321E7"/>
+    <w:rPr>
+      <w:rFonts w:asciiTheme="majorHAnsi" w:eastAsiaTheme="majorEastAsia" w:hAnsiTheme="majorHAnsi" w:cstheme="majorBidi"/>
+      <w:color w:val="2F5496" w:themeColor="accent1" w:themeShade="BF"/>
+      <w:sz w:val="26"/>
+      <w:szCs w:val="26"/>
+    </w:rPr>
+  </w:style>
+  <w:style w:type="character" w:styleId="Refdecomentrio">
+    <w:name w:val="annotation reference"/>
+    <w:basedOn w:val="Fontepargpadro"/>
+    <w:uiPriority w:val="99"/>
+    <w:semiHidden/>
+    <w:unhideWhenUsed/>
+    <w:rsid w:val="00C321E7"/>
+    <w:rPr>
+      <w:sz w:val="16"/>
+      <w:szCs w:val="16"/>
+    </w:rPr>
+  </w:style>
+  <w:style w:type="paragraph" w:styleId="Textodecomentrio">
+    <w:name w:val="annotation text"/>
+    <w:basedOn w:val="Normal"/>
+    <w:link w:val="TextodecomentrioChar"/>
+    <w:uiPriority w:val="99"/>
+    <w:unhideWhenUsed/>
+    <w:rsid w:val="00C321E7"/>
+    <w:pPr>
+      <w:spacing w:line="240" w:lineRule="auto"/>
+    </w:pPr>
+    <w:rPr>
+      <w:sz w:val="20"/>
+      <w:szCs w:val="20"/>
+    </w:rPr>
+  </w:style>
+  <w:style w:type="character" w:customStyle="1" w:styleId="TextodecomentrioChar">
+    <w:name w:val="Texto de comentário Char"/>
+    <w:basedOn w:val="Fontepargpadro"/>
+    <w:link w:val="Textodecomentrio"/>
+    <w:uiPriority w:val="99"/>
+    <w:rsid w:val="00C321E7"/>
+    <w:rPr>
+      <w:rFonts w:ascii="Arial" w:hAnsi="Arial"/>
+      <w:sz w:val="20"/>
+      <w:szCs w:val="20"/>
     </w:rPr>
   </w:style>
 </w:styles>

</xml_diff>